<commit_message>
make the intro more digest
</commit_message>
<xml_diff>
--- a/Manuscript/Main_text.docx
+++ b/Manuscript/Main_text.docx
@@ -376,7 +376,7 @@
         <w:t xml:space="preserve"> </w:t>
       </w:r>
       <w:r>
-        <w:t xml:space="preserve">rather places the emphasis on abiotic factors as a primary driver of evolutionary changes</w:t>
+        <w:t xml:space="preserve">rather place the emphasis on abiotic factors as a primary driver of evolutionary changes</w:t>
       </w:r>
       <w:r>
         <w:t xml:space="preserve"> </w:t>
@@ -496,7 +496,7 @@
         <w:t xml:space="preserve">(Upham et al. 2026)</w:t>
       </w:r>
       <w:r>
-        <w:t xml:space="preserve">. The astonishing disparity within Caviomorpha is greatly exemplified by their body size range, going far beyond what is usually found in the Rodentia, from 50–80 g (</w:t>
+        <w:t xml:space="preserve">. The astonishing disparity within Caviomorpha is greatly exemplified by their body size range, going far beyond what is usually found in the Rodentia, from 50 g (</w:t>
       </w:r>
       <w:r>
         <w:rPr>
@@ -684,7 +684,7 @@
         <w:t xml:space="preserve"> </w:t>
       </w:r>
       <w:r>
-        <w:t xml:space="preserve">and comprises more than 100 described species with variable degrees of crown height [</w:t>
+        <w:t xml:space="preserve">and comprises more than 100 described species with variable degrees of crown height (</w:t>
       </w:r>
       <w:r>
         <w:rPr>
@@ -736,7 +736,7 @@
         <w:t xml:space="preserve">Candela (2005)</w:t>
       </w:r>
       <w:r>
-        <w:t xml:space="preserve">], including many of the largest rodents ever recorded. On the South American landmass, fossils of giant chinchilloids were assigned to</w:t>
+        <w:t xml:space="preserve">), including many of the largest rodents ever recorded. On the South American landmass, fossils of giant chinchilloids were assigned to</w:t>
       </w:r>
       <w:r>
         <w:t xml:space="preserve"> </w:t>
@@ -999,87 +999,46 @@
         <w:pStyle w:val="BodyText"/>
       </w:pPr>
       <w:r>
-        <w:t xml:space="preserve">Several hypotheses have been advocated to explain chinchilloid’s diversity dynamics and exceptional phenotypical evolution.</w:t>
-      </w:r>
-      <w:r>
-        <w:t xml:space="preserve"> </w:t>
-      </w:r>
-      <w:r>
-        <w:t xml:space="preserve">Vucetich et al. (2015)</w:t>
-      </w:r>
-      <w:r>
-        <w:t xml:space="preserve"> </w:t>
-      </w:r>
-      <w:r>
-        <w:t xml:space="preserve">proposed gigantism among caviomorphs to have been promoted by the late Neogene climate cooling and aridification</w:t>
-      </w:r>
-      <w:r>
-        <w:t xml:space="preserve"> </w:t>
-      </w:r>
-      <w:r>
-        <w:t xml:space="preserve">(Westerhold et al. 2020)</w:t>
-      </w:r>
-      <w:r>
-        <w:t xml:space="preserve">, thought to have expanded open habitats in continental South America</w:t>
-      </w:r>
-      <w:r>
-        <w:t xml:space="preserve"> </w:t>
-      </w:r>
-      <w:r>
-        <w:t xml:space="preserve">(Palazzesi and Barreda 2012)</w:t>
-      </w:r>
-      <w:r>
-        <w:t xml:space="preserve">. Such climate-induced landscape opening has also traditionally been invoked to explain caviomorphs’ – together with native ungulates’ – increase in hypsodonty</w:t>
-      </w:r>
-      <w:r>
-        <w:t xml:space="preserve"> </w:t>
-      </w:r>
-      <w:r>
-        <w:t xml:space="preserve">(MacFadden 2000)</w:t>
-      </w:r>
-      <w:r>
-        <w:t xml:space="preserve">. Nevertheless, it should be mentioned that several evidence challenged the relationship between grass consumption and hypsodonty</w:t>
-      </w:r>
-      <w:r>
-        <w:t xml:space="preserve"> </w:t>
-      </w:r>
-      <w:r>
-        <w:t xml:space="preserve">(</w:t>
-      </w:r>
-      <w:r>
-        <w:rPr>
-          <w:i/>
-          <w:iCs/>
-        </w:rPr>
-        <w:t xml:space="preserve">e</w:t>
-      </w:r>
-      <w:r>
-        <w:t xml:space="preserve">.</w:t>
-      </w:r>
-      <w:r>
-        <w:rPr>
-          <w:i/>
-          <w:iCs/>
-        </w:rPr>
-        <w:t xml:space="preserve">g</w:t>
-      </w:r>
-      <w:r>
-        <w:t xml:space="preserve">., Billet et al. 2009; Damuth and Janis 2011; Strömberg et al. 2013; Armella and Croft 2026)</w:t>
-      </w:r>
-      <w:r>
-        <w:t xml:space="preserve">. Other authors proposed that the river network remodelling that followed the demise of the north Argentinian Miocene marine transgression</w:t>
-      </w:r>
-      <w:r>
-        <w:t xml:space="preserve"> </w:t>
-      </w:r>
-      <w:r>
-        <w:t xml:space="preserve">(</w:t>
+        <w:t xml:space="preserve">Several hypotheses have been advocated to explain chinchilloid’s diversity dynamics and exceptional phenotypical evolution, though mostly emphasising high latitudes. Some authors argued that the environmentally-driven emergence of new niches, either promoted by the late Neogene climatic cooling and aridification</w:t>
+      </w:r>
+      <w:r>
+        <w:t xml:space="preserve"> </w:t>
+      </w:r>
+      <w:r>
+        <w:t xml:space="preserve">(Vucetich et al. 2015)</w:t>
+      </w:r>
+      <w:r>
+        <w:t xml:space="preserve"> </w:t>
+      </w:r>
+      <w:r>
+        <w:t xml:space="preserve">or the Late Miocene hydrographic changes</w:t>
+      </w:r>
+      <w:r>
+        <w:t xml:space="preserve"> </w:t>
+      </w:r>
+      <w:r>
+        <w:t xml:space="preserve">(Candela et al. 2013)</w:t>
+      </w:r>
+      <w:r>
+        <w:t xml:space="preserve">, favoured the remarkable size-increase pattern found in this rodent clade</w:t>
+      </w:r>
+      <w:r>
+        <w:t xml:space="preserve"> </w:t>
+      </w:r>
+      <w:r>
+        <w:t xml:space="preserve">(Álvarez et al. 2017)</w:t>
+      </w:r>
+      <w:r>
+        <w:t xml:space="preserve">. Also, the spectacular sizes achieved by the</w:t>
+      </w:r>
+      <w:r>
+        <w:t xml:space="preserve"> </w:t>
       </w:r>
       <w:r>
         <w:t xml:space="preserve">‘</w:t>
       </w:r>
       <w:r>
-        <w:t xml:space="preserve">Paranense Sea,</w:t>
+        <w:t xml:space="preserve">Giant Hutias</w:t>
       </w:r>
       <w:r>
         <w:t xml:space="preserve">’</w:t>
@@ -1088,196 +1047,7 @@
         <w:t xml:space="preserve"> </w:t>
       </w:r>
       <w:r>
-        <w:rPr>
-          <w:i/>
-          <w:iCs/>
-        </w:rPr>
-        <w:t xml:space="preserve">see</w:t>
-      </w:r>
-      <w:r>
-        <w:t xml:space="preserve"> </w:t>
-      </w:r>
-      <w:r>
-        <w:t xml:space="preserve">Pascual et al. 1996)</w:t>
-      </w:r>
-      <w:r>
-        <w:t xml:space="preserve">, locally generating environmental heterogeneity, favoured the ecological diversification of dinomyid rodents</w:t>
-      </w:r>
-      <w:r>
-        <w:t xml:space="preserve"> </w:t>
-      </w:r>
-      <w:r>
-        <w:t xml:space="preserve">(Candela et al. 2013)</w:t>
-      </w:r>
-      <w:r>
-        <w:t xml:space="preserve">. In the same time frame, a marine incursion analogous to the</w:t>
-      </w:r>
-      <w:r>
-        <w:t xml:space="preserve"> </w:t>
-      </w:r>
-      <w:r>
-        <w:t xml:space="preserve">‘</w:t>
-      </w:r>
-      <w:r>
-        <w:t xml:space="preserve">Paranense Sea</w:t>
-      </w:r>
-      <w:r>
-        <w:t xml:space="preserve">’</w:t>
-      </w:r>
-      <w:r>
-        <w:t xml:space="preserve">, the</w:t>
-      </w:r>
-      <w:r>
-        <w:t xml:space="preserve"> </w:t>
-      </w:r>
-      <w:r>
-        <w:t xml:space="preserve">‘</w:t>
-      </w:r>
-      <w:r>
-        <w:t xml:space="preserve">Pebas megawetland system</w:t>
-      </w:r>
-      <w:r>
-        <w:t xml:space="preserve">’</w:t>
-      </w:r>
-      <w:r>
-        <w:t xml:space="preserve"> </w:t>
-      </w:r>
-      <w:r>
-        <w:t xml:space="preserve">(PMWS), covered Western Amazonia. Its Late Miocene vanishing triggered massive hydrographic changes, among which the establishment of the Amazon drainage system, in turn massively impacting low-latitude ecosystems in South America</w:t>
-      </w:r>
-      <w:r>
-        <w:t xml:space="preserve"> </w:t>
-      </w:r>
-      <w:r>
-        <w:t xml:space="preserve">(</w:t>
-      </w:r>
-      <w:r>
-        <w:rPr>
-          <w:i/>
-          <w:iCs/>
-        </w:rPr>
-        <w:t xml:space="preserve">e</w:t>
-      </w:r>
-      <w:r>
-        <w:t xml:space="preserve">.</w:t>
-      </w:r>
-      <w:r>
-        <w:rPr>
-          <w:i/>
-          <w:iCs/>
-        </w:rPr>
-        <w:t xml:space="preserve">g</w:t>
-      </w:r>
-      <w:r>
-        <w:t xml:space="preserve">., Jaramillo et al. 2017; Hoorn et al. 2022)</w:t>
-      </w:r>
-      <w:r>
-        <w:t xml:space="preserve">. Thus, one can expect the legacy of the PMWS to have also impacted the radiation of Chinchilloidea, the latter peaking as these hydrographic changes occurred. These two marine transgressions were shown to be tectonically- and eustatically-controlled</w:t>
-      </w:r>
-      <w:r>
-        <w:t xml:space="preserve"> </w:t>
-      </w:r>
-      <w:r>
-        <w:t xml:space="preserve">(Hernández et al. 2005)</w:t>
-      </w:r>
-      <w:r>
-        <w:t xml:space="preserve">. Thus, one can also expect to retrieve a signal of the Andean uplift, as well as from sea-level changes, in the dynamics of chinchilloid diversification. In addition, on the basis of results established on modern species showing similar phenotypic pathways, patterns of size increase among caviomorphs were also proposed to be related to biotic factors, such as intra- or interspecific competition, predator avoidance or physiological constraints (</w:t>
-      </w:r>
-      <w:r>
-        <w:rPr>
-          <w:i/>
-          <w:iCs/>
-        </w:rPr>
-        <w:t xml:space="preserve">e</w:t>
-      </w:r>
-      <w:r>
-        <w:t xml:space="preserve">.</w:t>
-      </w:r>
-      <w:r>
-        <w:rPr>
-          <w:i/>
-          <w:iCs/>
-        </w:rPr>
-        <w:t xml:space="preserve">g</w:t>
-      </w:r>
-      <w:r>
-        <w:t xml:space="preserve">., metabolic rate)</w:t>
-      </w:r>
-      <w:r>
-        <w:t xml:space="preserve"> </w:t>
-      </w:r>
-      <w:r>
-        <w:t xml:space="preserve">(Vucetich et al. 2015)</w:t>
-      </w:r>
-      <w:r>
-        <w:t xml:space="preserve">.</w:t>
-      </w:r>
-      <w:r>
-        <w:t xml:space="preserve"> </w:t>
-      </w:r>
-      <w:r>
-        <w:t xml:space="preserve">Álvarez et al. (2017)</w:t>
-      </w:r>
-      <w:r>
-        <w:t xml:space="preserve"> </w:t>
-      </w:r>
-      <w:r>
-        <w:t xml:space="preserve">added that the environmentally-driven emergence of new niches and their further colonisation by caviomorphs must have promoted size increase in this rodent clade. Regarding the West Indian</w:t>
-      </w:r>
-      <w:r>
-        <w:t xml:space="preserve"> </w:t>
-      </w:r>
-      <w:r>
-        <w:t xml:space="preserve">‘</w:t>
-      </w:r>
-      <w:r>
-        <w:t xml:space="preserve">giant hutias</w:t>
-      </w:r>
-      <w:r>
-        <w:t xml:space="preserve">’</w:t>
-      </w:r>
-      <w:r>
-        <w:t xml:space="preserve">, instead of environmental drivers, the</w:t>
-      </w:r>
-      <w:r>
-        <w:t xml:space="preserve"> </w:t>
-      </w:r>
-      <w:r>
-        <w:t xml:space="preserve">‘</w:t>
-      </w:r>
-      <w:r>
-        <w:t xml:space="preserve">island rule</w:t>
-      </w:r>
-      <w:r>
-        <w:t xml:space="preserve">’</w:t>
-      </w:r>
-      <w:r>
-        <w:t xml:space="preserve"> </w:t>
-      </w:r>
-      <w:r>
-        <w:t xml:space="preserve">(Van Valen 1973b; Damuth 1993; Lomolino 2005; Faurby and Svenning 2016;</w:t>
-      </w:r>
-      <w:r>
-        <w:t xml:space="preserve"> </w:t>
-      </w:r>
-      <w:r>
-        <w:rPr>
-          <w:i/>
-          <w:iCs/>
-        </w:rPr>
-        <w:t xml:space="preserve">but see</w:t>
-      </w:r>
-      <w:r>
-        <w:t xml:space="preserve"> </w:t>
-      </w:r>
-      <w:r>
-        <w:t xml:space="preserve">Meiri et al. 2007)</w:t>
-      </w:r>
-      <w:r>
-        <w:t xml:space="preserve"> </w:t>
-      </w:r>
-      <w:r>
-        <w:t xml:space="preserve">has been proposed to explain their spectacular increase in size – particularly in the case of</w:t>
+        <w:t xml:space="preserve">– particularly</w:t>
       </w:r>
       <w:r>
         <w:t xml:space="preserve"> </w:t>
@@ -1301,6 +1071,24 @@
         <w:t xml:space="preserve"> </w:t>
       </w:r>
       <w:r>
+        <w:t xml:space="preserve">– have often been proposed to result from the</w:t>
+      </w:r>
+      <w:r>
+        <w:t xml:space="preserve"> </w:t>
+      </w:r>
+      <w:r>
+        <w:t xml:space="preserve">‘</w:t>
+      </w:r>
+      <w:r>
+        <w:t xml:space="preserve">island rule</w:t>
+      </w:r>
+      <w:r>
+        <w:t xml:space="preserve">’</w:t>
+      </w:r>
+      <w:r>
+        <w:t xml:space="preserve"> </w:t>
+      </w:r>
+      <w:r>
         <w:t xml:space="preserve">(</w:t>
       </w:r>
       <w:r>
@@ -1324,150 +1112,82 @@
         <w:t xml:space="preserve">., Biknevicius et al. 1993; McFarlane et al. 1998)</w:t>
       </w:r>
       <w:r>
+        <w:t xml:space="preserve">, though the validity of this macroecological pattern has been under debate</w:t>
+      </w:r>
+      <w:r>
+        <w:t xml:space="preserve"> </w:t>
+      </w:r>
+      <w:r>
+        <w:t xml:space="preserve">(</w:t>
+      </w:r>
+      <w:r>
+        <w:rPr>
+          <w:i/>
+          <w:iCs/>
+        </w:rPr>
+        <w:t xml:space="preserve">e</w:t>
+      </w:r>
+      <w:r>
         <w:t xml:space="preserve">.</w:t>
       </w:r>
+      <w:r>
+        <w:rPr>
+          <w:i/>
+          <w:iCs/>
+        </w:rPr>
+        <w:t xml:space="preserve">g</w:t>
+      </w:r>
+      <w:r>
+        <w:t xml:space="preserve">., Meiri et al. 2007)</w:t>
+      </w:r>
+      <w:r>
+        <w:t xml:space="preserve">. Despite all this, our understanding of the evolutionary dynamics of Chinchilloidea, and particularly of their evolutionary collapse, remains parcellar. Previous studies relying on a phylogenetic framework illustrated that the dynamics of chinchilloid diversity and body mass evolution were decoupled</w:t>
+      </w:r>
+      <w:r>
+        <w:t xml:space="preserve"> </w:t>
+      </w:r>
+      <w:r>
+        <w:t xml:space="preserve">(Álvarez et al. 2017; Carrillo et al. n.d.)</w:t>
+      </w:r>
+      <w:r>
+        <w:t xml:space="preserve">. However, many extinct taxa lack DNA or sufficient morphological material to be accurately replaced in a phylogenetic framework, leading to their exclusion from subsequent macroevolutionary analyses relying on phylogenies. Thus, there is much to gain by relaxing phylogenetic assumptions and fully taking advantage of the rich fossil record of the group to reconstruct its macroevolutionary history. In addition, despite the major palaeoenvironmental upheavals that took place in South America since the late Eocene (e.g., Andean orogeny, marine introgressions, river network changes, onset of the dry diagonal) as well as the vast array methods that flourished over the last decade</w:t>
+      </w:r>
+      <w:r>
+        <w:t xml:space="preserve"> </w:t>
+      </w:r>
+      <w:r>
+        <w:t xml:space="preserve">(</w:t>
+      </w:r>
+      <w:r>
+        <w:rPr>
+          <w:i/>
+          <w:iCs/>
+        </w:rPr>
+        <w:t xml:space="preserve">e</w:t>
+      </w:r>
+      <w:r>
+        <w:t xml:space="preserve">.</w:t>
+      </w:r>
+      <w:r>
+        <w:rPr>
+          <w:i/>
+          <w:iCs/>
+        </w:rPr>
+        <w:t xml:space="preserve">g</w:t>
+      </w:r>
+      <w:r>
+        <w:t xml:space="preserve">., Morlon et al. 2024 and literature therein)</w:t>
+      </w:r>
+      <w:r>
+        <w:t xml:space="preserve">, the macroevolutionary dynamics of Chinchilloidea have never been analysed in an environment-dependent diversification framework.</w:t>
+      </w:r>
     </w:p>
     <w:p>
       <w:pPr>
         <w:pStyle w:val="BodyText"/>
       </w:pPr>
       <w:r>
-        <w:t xml:space="preserve">Besides, questions are also raised by chinchilloid taxonomic and morphological diversity decline. Indeed, the group was diverse in the Late Miocene (Chasicoan–Huayquerian South American Land Mammal Ages [SALMAs]), with at least 20 co-occurring species on the continent</w:t>
-      </w:r>
-      <w:r>
-        <w:t xml:space="preserve"> </w:t>
-      </w:r>
-      <w:r>
-        <w:t xml:space="preserve">(Candela 2005)</w:t>
-      </w:r>
-      <w:r>
-        <w:t xml:space="preserve">, including most of its largest representatives</w:t>
-      </w:r>
-      <w:r>
-        <w:t xml:space="preserve"> </w:t>
-      </w:r>
-      <w:r>
-        <w:t xml:space="preserve">(</w:t>
-      </w:r>
-      <w:r>
-        <w:rPr>
-          <w:i/>
-          <w:iCs/>
-        </w:rPr>
-        <w:t xml:space="preserve">e</w:t>
-      </w:r>
-      <w:r>
-        <w:t xml:space="preserve">.</w:t>
-      </w:r>
-      <w:r>
-        <w:rPr>
-          <w:i/>
-          <w:iCs/>
-        </w:rPr>
-        <w:t xml:space="preserve">g</w:t>
-      </w:r>
-      <w:r>
-        <w:t xml:space="preserve">., Carrillo and Sánchez-Villagra 2015; Rasia and Candela 2018; Rasia et al. 2024)</w:t>
-      </w:r>
-      <w:r>
-        <w:t xml:space="preserve">. Then, the group experienced a massive decline, wiping out the entire</w:t>
-      </w:r>
-      <w:r>
-        <w:t xml:space="preserve"> </w:t>
-      </w:r>
-      <m:oMath>
-        <m:r>
-          <m:rPr>
-            <m:sty m:val="p"/>
-          </m:rPr>
-          <m:t>†</m:t>
-        </m:r>
-      </m:oMath>
-      <w:r>
-        <w:t xml:space="preserve">Neoepiblemidae and virtually all representatives of the Dinomyidae. Notably, all large-to-giant forms were concomitantly erased. Nevertheless, despite the apparent size selectivity of the aforementioned decline, the latter does not apply to other traits like hypsodonty. Pliocene cooling and desertification was proposed as a driver underlying the demise of the clade in Southern South America</w:t>
-      </w:r>
-      <w:r>
-        <w:t xml:space="preserve"> </w:t>
-      </w:r>
-      <w:r>
-        <w:t xml:space="preserve">(Vucetich et al. 2015)</w:t>
-      </w:r>
-      <w:r>
-        <w:t xml:space="preserve">. Moreover, given that the time frame of the demise of the Chinchilloidea matches the Great American Biotic Interchange</w:t>
-      </w:r>
-      <w:r>
-        <w:t xml:space="preserve"> </w:t>
-      </w:r>
-      <w:r>
-        <w:t xml:space="preserve">(Marshall et al. 1982; Webb 1985)</w:t>
-      </w:r>
-      <w:r>
-        <w:t xml:space="preserve">, one can also wonder whether such a demise can be related to the arrival of North American migrants, either competing for similar food resources (</w:t>
-      </w:r>
-      <w:r>
-        <w:rPr>
-          <w:i/>
-          <w:iCs/>
-        </w:rPr>
-        <w:t xml:space="preserve">e</w:t>
-      </w:r>
-      <w:r>
-        <w:t xml:space="preserve">.</w:t>
-      </w:r>
-      <w:r>
-        <w:rPr>
-          <w:i/>
-          <w:iCs/>
-        </w:rPr>
-        <w:t xml:space="preserve">g</w:t>
-      </w:r>
-      <w:r>
-        <w:t xml:space="preserve">., horses, elephants) or preying on native species (</w:t>
-      </w:r>
-      <w:r>
-        <w:rPr>
-          <w:i/>
-          <w:iCs/>
-        </w:rPr>
-        <w:t xml:space="preserve">e</w:t>
-      </w:r>
-      <w:r>
-        <w:t xml:space="preserve">.</w:t>
-      </w:r>
-      <w:r>
-        <w:rPr>
-          <w:i/>
-          <w:iCs/>
-        </w:rPr>
-        <w:t xml:space="preserve">g</w:t>
-      </w:r>
-      <w:r>
-        <w:t xml:space="preserve">., carnivorans).</w:t>
-      </w:r>
-    </w:p>
-    <w:p>
-      <w:pPr>
-        <w:pStyle w:val="BodyText"/>
-      </w:pPr>
-      <w:r>
-        <w:t xml:space="preserve">Despite all this, major gaps remain in our understanding of the evolutionary dynamics of Chinchilloidea. In particular, many of the hypotheses raised above have poorly considered the interplay between phenotypic and biological diversification. Previous works relying on a phylogenetic framework illustrated that the dynamics of chinchilloid diversity and body mass evolution were decoupled</w:t>
-      </w:r>
-      <w:r>
-        <w:t xml:space="preserve"> </w:t>
-      </w:r>
-      <w:r>
-        <w:t xml:space="preserve">(Álvarez et al. 2017; Carrillo et al. n.d.)</w:t>
-      </w:r>
-      <w:r>
-        <w:t xml:space="preserve">. However, many extinct taxa lack DNA or sufficient morphological material to be accurately replaced in a phylogenetic framework, leading to their exclusion from subsequent macroevolutionary analyses relying on phylogenies. Thus, there is much to gain by relaxing phylogenetic assumptions and fully taking advantage of the rich fossil record of the group to reconstruct its macroevolutionary history. In addition, the factors that underpinned the clade diversification remain elusive despite the major palaeoenvironmental upheavals that took place in South America since the late Eocene (e.g., Andean orogeny, marine introgressions, river network changes, onset of the dry diagonal).</w:t>
-      </w:r>
-    </w:p>
-    <w:p>
-      <w:pPr>
-        <w:pStyle w:val="BodyText"/>
-      </w:pPr>
-      <w:r>
-        <w:t xml:space="preserve">Here, we investigate the evolutionary history of Chinchilloidea and highlight its environmental correlates, with an emphasis on phenotypic evolution. To do so, we compiled and revised 708 chinchilloid fossil occurrences from the literature and used divergence times leading to extant species absent from the fossil record extracted from a dated phylogeny to build the most exhaustive temporal occurrence database ever produced for this group, encompassing 62 genera and 129 species. In parallel, we collected dental traits and measurements in order to carry out body mass reconstructions based on recently-published sets of predictive equations, and reconstructed hyposodonty indices based on crown heights of cheek teeth. We further analysed chinchilloid diversity and diversification dynamics throughout their entire evolutionary history using state-of-the-art preservation-aware methodological frameworks, and sought for their likely environmental drivers, allowing rate variations across time, body size and crown height categories. We hypothesise that (i) climate – in particular temperature – evolution since the middle Miocene impacted the diversification history of Chinchilloidea; (ii) continent-scale changes in habitat connectivity, either mediated by hydrographic (</w:t>
+        <w:t xml:space="preserve">Here, we investigate the evolutionary history of Chinchilloidea and highlight its environmental correlates, with an emphasis on phenotypic evolution. To do so, we compiled and revised 708 chinchilloid fossil occurrences from the literature and used divergence times leading to extant species absent from the fossil record extracted from a dated phylogeny to build the most exhaustive temporal occurrence database ever produced for this group, encompassing 62 genera and 129 species. In parallel, we collected dental traits and measurements in order to carry out body mass reconstructions based on recently-published sets of predictive equations, and reconstructed hypsodonty indices based on crown heights of cheek teeth. We further analysed chinchilloid diversity and diversification dynamics throughout their entire evolutionary history using state-of-the-art preservation-aware methodological frameworks, and sought for their likely environmental drivers, allowing rate variations across time, body size and crown height categories. We hypothesise that (i) climate – in particular temperature – evolution since the middle Miocene impacted the diversification history of Chinchilloidea; (ii) continent-scale changes in habitat connectivity, either mediated by hydrographic (</w:t>
       </w:r>
       <w:r>
         <w:rPr>
@@ -2805,7 +2525,7 @@
         </m:sSub>
       </m:oMath>
       <w:r>
-        <w:t xml:space="preserve">) is too ancient to be reasonably considered as an approximation of the time when the species originated (HPD 95% =</w:t>
+        <w:t xml:space="preserve">) is too ancient to be reasonably considered as an approximation of the time when the species originated (95% HPD =</w:t>
       </w:r>
       <w:r>
         <w:t xml:space="preserve"> </w:t>
@@ -4003,7 +3723,16 @@
         </m:sSub>
       </m:oMath>
       <w:r>
-        <w:t xml:space="preserve">), plus a baseline rate. Each</w:t>
+        <w:t xml:space="preserve">), plus a baseline rate. As recommended by</w:t>
+      </w:r>
+      <w:r>
+        <w:t xml:space="preserve"> </w:t>
+      </w:r>
+      <w:r>
+        <w:t xml:space="preserve">Lehtonen et al. (2017)</w:t>
+      </w:r>
+      <w:r>
+        <w:t xml:space="preserve">, given our low number of predictors, each</w:t>
       </w:r>
       <w:r>
         <w:t xml:space="preserve"> </w:t>
@@ -4035,7 +3764,7 @@
         <w:t xml:space="preserve"> </w:t>
       </w:r>
       <w:r>
-        <w:t xml:space="preserve">or</w:t>
+        <w:t xml:space="preserve">and</w:t>
       </w:r>
       <w:r>
         <w:t xml:space="preserve"> </w:t>
@@ -4067,125 +3796,72 @@
         <w:t xml:space="preserve"> </w:t>
       </w:r>
       <w:r>
-        <w:t xml:space="preserve">is assigned a shrinkage weight (resp.</w:t>
-      </w:r>
-      <w:r>
-        <w:t xml:space="preserve"> </w:t>
-      </w:r>
-      <m:oMath>
-        <m:sSub>
-          <m:e>
-            <m:r>
-              <m:t>w</m:t>
-            </m:r>
-          </m:e>
-          <m:sub>
-            <m:r>
-              <m:t>λ</m:t>
-            </m:r>
-            <m:r>
-              <m:rPr>
-                <m:sty m:val="p"/>
-              </m:rPr>
-              <m:t>,</m:t>
-            </m:r>
-            <m:r>
-              <m:t>i</m:t>
-            </m:r>
-          </m:sub>
-        </m:sSub>
-      </m:oMath>
-      <w:r>
-        <w:t xml:space="preserve"> </w:t>
-      </w:r>
-      <w:r>
-        <w:t xml:space="preserve">and</w:t>
-      </w:r>
-      <w:r>
-        <w:t xml:space="preserve"> </w:t>
-      </w:r>
-      <m:oMath>
-        <m:sSub>
-          <m:e>
-            <m:r>
-              <m:t>w</m:t>
-            </m:r>
-          </m:e>
-          <m:sub>
-            <m:r>
-              <m:t>μ</m:t>
-            </m:r>
-            <m:r>
-              <m:rPr>
-                <m:sty m:val="p"/>
-              </m:rPr>
-              <m:t>,</m:t>
-            </m:r>
-            <m:r>
-              <m:t>i</m:t>
-            </m:r>
-          </m:sub>
-        </m:sSub>
-      </m:oMath>
-      <w:r>
-        <w:t xml:space="preserve">), ranging from 0 to 1, testing for the strength of the relationship between the newly-estimated rate and each environmental variable individually. A correlation coefficient</w:t>
-      </w:r>
-      <w:r>
-        <w:t xml:space="preserve"> </w:t>
-      </w:r>
-      <m:oMath>
-        <m:sSub>
-          <m:e>
-            <m:r>
-              <m:t>G</m:t>
-            </m:r>
-          </m:e>
-          <m:sub>
-            <m:r>
-              <m:rPr>
-                <m:sty m:val="p"/>
-              </m:rPr>
-              <m:t>.</m:t>
-            </m:r>
-            <m:r>
-              <m:rPr>
-                <m:sty m:val="p"/>
-              </m:rPr>
-              <m:t>,</m:t>
-            </m:r>
-            <m:r>
-              <m:t>i</m:t>
-            </m:r>
-          </m:sub>
-        </m:sSub>
-      </m:oMath>
-      <w:r>
-        <w:t xml:space="preserve"> </w:t>
-      </w:r>
-      <w:r>
-        <w:t xml:space="preserve">is considered significant if</w:t>
-      </w:r>
-      <w:r>
-        <w:t xml:space="preserve"> </w:t>
+        <w:t xml:space="preserve">was assigned a gamma prior. An MCMC algorithm approximating the posterior distribution of each model parameter was run across 10 million generations with a sampling frequency of 10,000, and parameter convergence was monitored using,the pymc 5.9.2 python library.</w:t>
+      </w:r>
+    </w:p>
+    <w:p>
+      <w:pPr>
+        <w:pStyle w:val="BodyText"/>
+      </w:pPr>
+      <w:r>
+        <w:t xml:space="preserve">Prior to their incorporation as correlates in the MBD model, environmental variables were manually scaled. In addition, we ensured to match them all to the same time scale (last 36 Ma with a 0.5 My time step). Not doing the latter step significantly increased computing time, and the resulting model had lower support than the model incorporating predictors matched to the same time scale. Model support was assessed by approximating 2*log Bayes Factor (BF) as two times the difference in harmonic means of the sampled log likelihood across MCMC iterations (after removing burn-in) of the two models (</w:t>
+      </w:r>
+      <w:r>
+        <w:rPr>
+          <w:i/>
+          <w:iCs/>
+        </w:rPr>
+        <w:t xml:space="preserve">i</w:t>
+      </w:r>
+      <w:r>
+        <w:t xml:space="preserve">.</w:t>
+      </w:r>
+      <w:r>
+        <w:rPr>
+          <w:i/>
+          <w:iCs/>
+        </w:rPr>
+        <w:t xml:space="preserve">e</w:t>
+      </w:r>
+      <w:r>
+        <w:t xml:space="preserve">., with and without matching predictors’ time scale), as done by</w:t>
+      </w:r>
+      <w:r>
+        <w:t xml:space="preserve"> </w:t>
+      </w:r>
+      <w:r>
+        <w:t xml:space="preserve">Lehtonen et al. (2017)</w:t>
+      </w:r>
+      <w:r>
+        <w:t xml:space="preserve">. The resulting metric was compared to the thresholds set by</w:t>
+      </w:r>
+      <w:r>
+        <w:t xml:space="preserve"> </w:t>
+      </w:r>
+      <w:r>
+        <w:t xml:space="preserve">Kass and Raftery (1995)</w:t>
+      </w:r>
+      <w:r>
+        <w:t xml:space="preserve">, and turned out to provide strong support in favour of the model incorporating predictors matched to the same time scales (</w:t>
       </w:r>
       <m:oMath>
         <m:r>
-          <m:t>m</m:t>
+          <m:t>2</m:t>
         </m:r>
         <m:r>
-          <m:t>e</m:t>
+          <m:rPr>
+            <m:sty m:val="p"/>
+          </m:rPr>
+          <m:t>*</m:t>
         </m:r>
         <m:r>
-          <m:t>d</m:t>
+          <m:t>l</m:t>
         </m:r>
         <m:r>
-          <m:t>i</m:t>
+          <m:t>o</m:t>
         </m:r>
         <m:r>
-          <m:t>a</m:t>
-        </m:r>
-        <m:r>
-          <m:t>n</m:t>
+          <m:t>g</m:t>
         </m:r>
         <m:d>
           <m:dPr>
@@ -4195,32 +3871,23 @@
             <m:grow/>
           </m:dPr>
           <m:e>
-            <m:sSub>
-              <m:e>
-                <m:r>
-                  <m:t>w</m:t>
-                </m:r>
-              </m:e>
-              <m:sub>
-                <m:r>
-                  <m:rPr>
-                    <m:sty m:val="p"/>
-                  </m:rPr>
-                  <m:t>.</m:t>
-                </m:r>
-                <m:r>
-                  <m:rPr>
-                    <m:sty m:val="p"/>
-                  </m:rPr>
-                  <m:t>,</m:t>
-                </m:r>
-                <m:r>
-                  <m:t>i</m:t>
-                </m:r>
-              </m:sub>
-            </m:sSub>
+            <m:r>
+              <m:t>B</m:t>
+            </m:r>
+            <m:r>
+              <m:t>F</m:t>
+            </m:r>
           </m:e>
         </m:d>
+        <m:r>
+          <m:rPr>
+            <m:sty m:val="p"/>
+          </m:rPr>
+          <m:t>=</m:t>
+        </m:r>
+        <m:r>
+          <m:t>7.24</m:t>
+        </m:r>
         <m:r>
           <m:rPr>
             <m:sty m:val="p"/>
@@ -4228,84 +3895,11 @@
           <m:t>&gt;</m:t>
         </m:r>
         <m:r>
-          <m:t>0.5</m:t>
+          <m:t>6</m:t>
         </m:r>
       </m:oMath>
       <w:r>
-        <w:t xml:space="preserve"> </w:t>
-      </w:r>
-      <w:r>
-        <w:t xml:space="preserve">and if its 95% Highest Posterior Density interval (HPD) does not overlap with 0. An MCMC algorithm jointly approximates the posterior distribution of each</w:t>
-      </w:r>
-      <w:r>
-        <w:t xml:space="preserve"> </w:t>
-      </w:r>
-      <m:oMath>
-        <m:sSub>
-          <m:e>
-            <m:r>
-              <m:t>G</m:t>
-            </m:r>
-          </m:e>
-          <m:sub>
-            <m:r>
-              <m:rPr>
-                <m:sty m:val="p"/>
-              </m:rPr>
-              <m:t>.</m:t>
-            </m:r>
-            <m:r>
-              <m:rPr>
-                <m:sty m:val="p"/>
-              </m:rPr>
-              <m:t>,</m:t>
-            </m:r>
-            <m:r>
-              <m:t>i</m:t>
-            </m:r>
-          </m:sub>
-        </m:sSub>
-      </m:oMath>
-      <w:r>
-        <w:t xml:space="preserve"> </w:t>
-      </w:r>
-      <w:r>
-        <w:t xml:space="preserve">and their associated</w:t>
-      </w:r>
-      <w:r>
-        <w:t xml:space="preserve"> </w:t>
-      </w:r>
-      <m:oMath>
-        <m:sSub>
-          <m:e>
-            <m:r>
-              <m:t>w</m:t>
-            </m:r>
-          </m:e>
-          <m:sub>
-            <m:r>
-              <m:rPr>
-                <m:sty m:val="p"/>
-              </m:rPr>
-              <m:t>.</m:t>
-            </m:r>
-            <m:r>
-              <m:rPr>
-                <m:sty m:val="p"/>
-              </m:rPr>
-              <m:t>,</m:t>
-            </m:r>
-            <m:r>
-              <m:t>i</m:t>
-            </m:r>
-          </m:sub>
-        </m:sSub>
-      </m:oMath>
-      <w:r>
-        <w:t xml:space="preserve"> </w:t>
-      </w:r>
-      <w:r>
-        <w:t xml:space="preserve">while controlling for over-parameterisation. We scaled environmental predictors prior their incorporation to the model, and ran each set of MBD analyses across 10 million iterations, with a sampling frequency of 10,000.</w:t>
+        <w:t xml:space="preserve">).</w:t>
       </w:r>
     </w:p>
     <w:bookmarkEnd w:id="29"/>
@@ -4568,18 +4162,103 @@
         <w:t xml:space="preserve">Results</w:t>
       </w:r>
     </w:p>
-    <w:bookmarkStart w:id="35" w:name="Xd55459d85854e517f8c864a962cf735d90667b1"/>
+    <w:bookmarkStart w:id="35" w:name="Xa1af8f99655f7af24f039c0e546ac07b26e5eba"/>
     <w:p>
       <w:pPr>
         <w:pStyle w:val="Heading2"/>
       </w:pPr>
       <w:r>
-        <w:t xml:space="preserve">The waxing-and-waning diversity of chinchilloid rodents</w:t>
+        <w:t xml:space="preserve">The waxing-and-waning diversity and body size evolution of chinchilloid rodents</w:t>
       </w:r>
     </w:p>
     <w:p>
       <w:pPr>
         <w:pStyle w:val="FirstParagraph"/>
+      </w:pPr>
+      <w:r>
+        <w:t xml:space="preserve">Either relying on a Bayesian preservation-aware framework (PyRate) or supervised neural networks (DeepDive), our macroevolutionary modelling of the fossil record evidenced a Late Miocene increase in chinchilloid diversity followed by a sharp decline from</w:t>
+      </w:r>
+      <w:r>
+        <w:t xml:space="preserve"> </w:t>
+      </w:r>
+      <w:r>
+        <w:rPr>
+          <w:i/>
+          <w:iCs/>
+        </w:rPr>
+        <w:t xml:space="preserve">ca</w:t>
+      </w:r>
+      <w:r>
+        <w:t xml:space="preserve">. 6.5 Ma</w:t>
+      </w:r>
+      <w:r>
+        <w:t xml:space="preserve"> </w:t>
+      </w:r>
+      <w:hyperlink w:anchor="fig-diversityBM">
+        <w:r>
+          <w:rPr>
+            <w:rStyle w:val="Hyperlink"/>
+          </w:rPr>
+          <w:t xml:space="preserve">Figure 3</w:t>
+        </w:r>
+      </w:hyperlink>
+      <w:r>
+        <w:t xml:space="preserve">. At their maximum, median sampled and corrected diversity exhibit a 3-fold difference, respectively peaking at 22 and 62. Four additional – though more attenuated – peaks may be reported from the sampled diversity curve : one in the late Oligocene (Deseadan SALMA), two in the Early Miocene (Colhuehuapian and Santacrucian SALMAs) and one in the late Middle Miocene (Laventan SALMA)</w:t>
+      </w:r>
+      <w:r>
+        <w:t xml:space="preserve"> </w:t>
+      </w:r>
+      <w:hyperlink w:anchor="fig-diversityBM">
+        <w:r>
+          <w:rPr>
+            <w:rStyle w:val="Hyperlink"/>
+          </w:rPr>
+          <w:t xml:space="preserve">Figure 3</w:t>
+        </w:r>
+      </w:hyperlink>
+      <w:r>
+        <w:t xml:space="preserve">. These peaks are barely recovered from the corrected diversity curve, potentially excepted for the Colhuehuapian and Santacrucian ones</w:t>
+      </w:r>
+      <w:r>
+        <w:t xml:space="preserve"> </w:t>
+      </w:r>
+      <w:hyperlink w:anchor="fig-diversityBM">
+        <w:r>
+          <w:rPr>
+            <w:rStyle w:val="Hyperlink"/>
+          </w:rPr>
+          <w:t xml:space="preserve">Figure 3</w:t>
+        </w:r>
+      </w:hyperlink>
+      <w:r>
+        <w:t xml:space="preserve">.</w:t>
+      </w:r>
+    </w:p>
+    <w:p>
+      <w:pPr>
+        <w:pStyle w:val="BodyText"/>
+      </w:pPr>
+      <w:r>
+        <w:t xml:space="preserve">The reconstructed broad diversity pattern elegantly matches with the dynamics of body size evolution across the history of the clade</w:t>
+      </w:r>
+      <w:r>
+        <w:t xml:space="preserve"> </w:t>
+      </w:r>
+      <w:hyperlink w:anchor="fig-diversityBM">
+        <w:r>
+          <w:rPr>
+            <w:rStyle w:val="Hyperlink"/>
+          </w:rPr>
+          <w:t xml:space="preserve">Figure 3</w:t>
+        </w:r>
+      </w:hyperlink>
+      <w:r>
+        <w:t xml:space="preserve">. According to our estimates,</w:t>
+      </w:r>
+    </w:p>
+    <w:p>
+      <w:pPr>
+        <w:pStyle w:val="BodyText"/>
       </w:pPr>
       <w:r>
         <w:t xml:space="preserve">Positive net diversification rate until</w:t>
@@ -4778,6 +4457,445 @@
         <w:pStyle w:val="FirstParagraph"/>
       </w:pPr>
       <w:r>
+        <w:t xml:space="preserve">ucetich2015 proposed gigantism among caviomorphs to have been promoted by the late Neogene climate cooling and aridification</w:t>
+      </w:r>
+      <w:r>
+        <w:t xml:space="preserve"> </w:t>
+      </w:r>
+      <w:r>
+        <w:t xml:space="preserve">(Westerhold et al. 2020)</w:t>
+      </w:r>
+      <w:r>
+        <w:t xml:space="preserve">, thought to have expanded open habitats in continental South America</w:t>
+      </w:r>
+      <w:r>
+        <w:t xml:space="preserve"> </w:t>
+      </w:r>
+      <w:r>
+        <w:t xml:space="preserve">(Palazzesi and Barreda 2012)</w:t>
+      </w:r>
+      <w:r>
+        <w:t xml:space="preserve">. Such climate-induced landscape opening has also traditionally been invoked to explain caviomorphs’ – together with native ungulates’ – increase in hypsodonty</w:t>
+      </w:r>
+      <w:r>
+        <w:t xml:space="preserve"> </w:t>
+      </w:r>
+      <w:r>
+        <w:t xml:space="preserve">(MacFadden 2000)</w:t>
+      </w:r>
+      <w:r>
+        <w:t xml:space="preserve">. Nevertheless, it should be mentioned that several evidence challenged the relationship between grass consumption and hypsodonty</w:t>
+      </w:r>
+      <w:r>
+        <w:t xml:space="preserve"> </w:t>
+      </w:r>
+      <w:r>
+        <w:t xml:space="preserve">(</w:t>
+      </w:r>
+      <w:r>
+        <w:rPr>
+          <w:i/>
+          <w:iCs/>
+        </w:rPr>
+        <w:t xml:space="preserve">e</w:t>
+      </w:r>
+      <w:r>
+        <w:t xml:space="preserve">.</w:t>
+      </w:r>
+      <w:r>
+        <w:rPr>
+          <w:i/>
+          <w:iCs/>
+        </w:rPr>
+        <w:t xml:space="preserve">g</w:t>
+      </w:r>
+      <w:r>
+        <w:t xml:space="preserve">., Billet et al. 2009; Damuth and Janis 2011; Strömberg et al. 2013; Armella and Croft 2026)</w:t>
+      </w:r>
+      <w:r>
+        <w:t xml:space="preserve">. Other authors proposed that the river network remodelling that followed the demise of the north Argentinian Miocene marine transgression</w:t>
+      </w:r>
+      <w:r>
+        <w:t xml:space="preserve"> </w:t>
+      </w:r>
+      <w:r>
+        <w:t xml:space="preserve">(</w:t>
+      </w:r>
+      <w:r>
+        <w:t xml:space="preserve">‘</w:t>
+      </w:r>
+      <w:r>
+        <w:t xml:space="preserve">Paranense Sea,</w:t>
+      </w:r>
+      <w:r>
+        <w:t xml:space="preserve">’</w:t>
+      </w:r>
+      <w:r>
+        <w:t xml:space="preserve"> </w:t>
+      </w:r>
+      <w:r>
+        <w:rPr>
+          <w:i/>
+          <w:iCs/>
+        </w:rPr>
+        <w:t xml:space="preserve">see</w:t>
+      </w:r>
+      <w:r>
+        <w:t xml:space="preserve"> </w:t>
+      </w:r>
+      <w:r>
+        <w:t xml:space="preserve">Pascual et al. 1996)</w:t>
+      </w:r>
+      <w:r>
+        <w:t xml:space="preserve">, locally generating environmental heterogeneity, favoured the ecological diversification of dinomyid rodents</w:t>
+      </w:r>
+      <w:r>
+        <w:t xml:space="preserve"> </w:t>
+      </w:r>
+      <w:r>
+        <w:t xml:space="preserve">(Candela et al. 2013)</w:t>
+      </w:r>
+      <w:r>
+        <w:t xml:space="preserve">. In the same time frame, a marine incursion analogous to the</w:t>
+      </w:r>
+      <w:r>
+        <w:t xml:space="preserve"> </w:t>
+      </w:r>
+      <w:r>
+        <w:t xml:space="preserve">‘</w:t>
+      </w:r>
+      <w:r>
+        <w:t xml:space="preserve">Paranense Sea</w:t>
+      </w:r>
+      <w:r>
+        <w:t xml:space="preserve">’</w:t>
+      </w:r>
+      <w:r>
+        <w:t xml:space="preserve">, the</w:t>
+      </w:r>
+      <w:r>
+        <w:t xml:space="preserve"> </w:t>
+      </w:r>
+      <w:r>
+        <w:t xml:space="preserve">‘</w:t>
+      </w:r>
+      <w:r>
+        <w:t xml:space="preserve">Pebas megawetland system</w:t>
+      </w:r>
+      <w:r>
+        <w:t xml:space="preserve">’</w:t>
+      </w:r>
+      <w:r>
+        <w:t xml:space="preserve"> </w:t>
+      </w:r>
+      <w:r>
+        <w:t xml:space="preserve">(PMWS), covered Western Amazonia. Its Late Miocene vanishing triggered massive hydrographic changes, among which the establishment of the Amazon drainage system, in turn massively impacting low-latitude ecosystems in South America</w:t>
+      </w:r>
+      <w:r>
+        <w:t xml:space="preserve"> </w:t>
+      </w:r>
+      <w:r>
+        <w:t xml:space="preserve">(</w:t>
+      </w:r>
+      <w:r>
+        <w:rPr>
+          <w:i/>
+          <w:iCs/>
+        </w:rPr>
+        <w:t xml:space="preserve">e</w:t>
+      </w:r>
+      <w:r>
+        <w:t xml:space="preserve">.</w:t>
+      </w:r>
+      <w:r>
+        <w:rPr>
+          <w:i/>
+          <w:iCs/>
+        </w:rPr>
+        <w:t xml:space="preserve">g</w:t>
+      </w:r>
+      <w:r>
+        <w:t xml:space="preserve">., Jaramillo et al. 2017; Hoorn et al. 2022)</w:t>
+      </w:r>
+      <w:r>
+        <w:t xml:space="preserve">. Thus, one can expect the legacy of the PMWS to have also impacted the radiation of Chinchilloidea, the latter peaking as these hydrographic changes occurred. These two marine transgressions were shown to be tectonically- and eustatically-controlled</w:t>
+      </w:r>
+      <w:r>
+        <w:t xml:space="preserve"> </w:t>
+      </w:r>
+      <w:r>
+        <w:t xml:space="preserve">(Hernández et al. 2005)</w:t>
+      </w:r>
+      <w:r>
+        <w:t xml:space="preserve">. Thus, one can also expect to retrieve a signal of the Andean uplift, as well as from sea-level changes, in the dynamics of chinchilloid diversification. In addition, on the basis of results established on modern species showing similar phenotypic pathways, patterns of size increase among caviomorphs were also proposed to be related to biotic factors, such as intra- or interspecific competition, predator avoidance or physiological constraints (</w:t>
+      </w:r>
+      <w:r>
+        <w:rPr>
+          <w:i/>
+          <w:iCs/>
+        </w:rPr>
+        <w:t xml:space="preserve">e</w:t>
+      </w:r>
+      <w:r>
+        <w:t xml:space="preserve">.</w:t>
+      </w:r>
+      <w:r>
+        <w:rPr>
+          <w:i/>
+          <w:iCs/>
+        </w:rPr>
+        <w:t xml:space="preserve">g</w:t>
+      </w:r>
+      <w:r>
+        <w:t xml:space="preserve">., metabolic rate)</w:t>
+      </w:r>
+      <w:r>
+        <w:t xml:space="preserve"> </w:t>
+      </w:r>
+      <w:r>
+        <w:t xml:space="preserve">(Vucetich et al. 2015)</w:t>
+      </w:r>
+      <w:r>
+        <w:t xml:space="preserve">.</w:t>
+      </w:r>
+      <w:r>
+        <w:t xml:space="preserve"> </w:t>
+      </w:r>
+      <w:r>
+        <w:t xml:space="preserve">Álvarez et al. (2017)</w:t>
+      </w:r>
+      <w:r>
+        <w:t xml:space="preserve"> </w:t>
+      </w:r>
+      <w:r>
+        <w:t xml:space="preserve">added that the environmentally-driven emergence of new niches and their further colonisation by caviomorphs must have promoted size increase in this rodent clade. Regarding the West Indian</w:t>
+      </w:r>
+      <w:r>
+        <w:t xml:space="preserve"> </w:t>
+      </w:r>
+      <w:r>
+        <w:t xml:space="preserve">‘</w:t>
+      </w:r>
+      <w:r>
+        <w:t xml:space="preserve">giant hutias</w:t>
+      </w:r>
+      <w:r>
+        <w:t xml:space="preserve">’</w:t>
+      </w:r>
+      <w:r>
+        <w:t xml:space="preserve">, instead of environmental drivers, the</w:t>
+      </w:r>
+      <w:r>
+        <w:t xml:space="preserve"> </w:t>
+      </w:r>
+      <w:r>
+        <w:t xml:space="preserve">‘</w:t>
+      </w:r>
+      <w:r>
+        <w:t xml:space="preserve">island rule</w:t>
+      </w:r>
+      <w:r>
+        <w:t xml:space="preserve">’</w:t>
+      </w:r>
+      <w:r>
+        <w:t xml:space="preserve"> </w:t>
+      </w:r>
+      <w:r>
+        <w:t xml:space="preserve">(Van Valen 1973b; Damuth 1993; Lomolino 2005; Faurby and Svenning 2016;</w:t>
+      </w:r>
+      <w:r>
+        <w:t xml:space="preserve"> </w:t>
+      </w:r>
+      <w:r>
+        <w:rPr>
+          <w:i/>
+          <w:iCs/>
+        </w:rPr>
+        <w:t xml:space="preserve">but see</w:t>
+      </w:r>
+      <w:r>
+        <w:t xml:space="preserve"> </w:t>
+      </w:r>
+      <w:r>
+        <w:t xml:space="preserve">Meiri et al. 2007)</w:t>
+      </w:r>
+      <w:r>
+        <w:t xml:space="preserve"> </w:t>
+      </w:r>
+      <w:r>
+        <w:t xml:space="preserve">has been proposed to explain their spectacular increase in size – particularly in the case of</w:t>
+      </w:r>
+      <w:r>
+        <w:t xml:space="preserve"> </w:t>
+      </w:r>
+      <m:oMath>
+        <m:r>
+          <m:rPr>
+            <m:sty m:val="p"/>
+          </m:rPr>
+          <m:t>†</m:t>
+        </m:r>
+      </m:oMath>
+      <w:r>
+        <w:rPr>
+          <w:i/>
+          <w:iCs/>
+        </w:rPr>
+        <w:t xml:space="preserve">Amblyrhiza</w:t>
+      </w:r>
+      <w:r>
+        <w:t xml:space="preserve"> </w:t>
+      </w:r>
+      <w:r>
+        <w:t xml:space="preserve">(</w:t>
+      </w:r>
+      <w:r>
+        <w:rPr>
+          <w:i/>
+          <w:iCs/>
+        </w:rPr>
+        <w:t xml:space="preserve">e</w:t>
+      </w:r>
+      <w:r>
+        <w:t xml:space="preserve">.</w:t>
+      </w:r>
+      <w:r>
+        <w:rPr>
+          <w:i/>
+          <w:iCs/>
+        </w:rPr>
+        <w:t xml:space="preserve">g</w:t>
+      </w:r>
+      <w:r>
+        <w:t xml:space="preserve">., Biknevicius et al. 1993; McFarlane et al. 1998)</w:t>
+      </w:r>
+      <w:r>
+        <w:t xml:space="preserve">.</w:t>
+      </w:r>
+    </w:p>
+    <w:p>
+      <w:pPr>
+        <w:pStyle w:val="BodyText"/>
+      </w:pPr>
+      <w:r>
+        <w:t xml:space="preserve">Besides, questions are also raised by chinchilloid taxonomic and morphological diversity decline. Indeed, the group was diverse in the Late Miocene (Chasicoan–Huayquerian South American Land Mammal Ages [SALMAs]), with at least 20 co-occurring species on the continent</w:t>
+      </w:r>
+      <w:r>
+        <w:t xml:space="preserve"> </w:t>
+      </w:r>
+      <w:r>
+        <w:t xml:space="preserve">(Candela 2005)</w:t>
+      </w:r>
+      <w:r>
+        <w:t xml:space="preserve">, including most of its largest representatives</w:t>
+      </w:r>
+      <w:r>
+        <w:t xml:space="preserve"> </w:t>
+      </w:r>
+      <w:r>
+        <w:t xml:space="preserve">(</w:t>
+      </w:r>
+      <w:r>
+        <w:rPr>
+          <w:i/>
+          <w:iCs/>
+        </w:rPr>
+        <w:t xml:space="preserve">e</w:t>
+      </w:r>
+      <w:r>
+        <w:t xml:space="preserve">.</w:t>
+      </w:r>
+      <w:r>
+        <w:rPr>
+          <w:i/>
+          <w:iCs/>
+        </w:rPr>
+        <w:t xml:space="preserve">g</w:t>
+      </w:r>
+      <w:r>
+        <w:t xml:space="preserve">., Carrillo and Sánchez-Villagra 2015; Rasia and Candela 2018; Rasia et al. 2024)</w:t>
+      </w:r>
+      <w:r>
+        <w:t xml:space="preserve">. Then, the group experienced a massive decline, wiping out the entire</w:t>
+      </w:r>
+      <w:r>
+        <w:t xml:space="preserve"> </w:t>
+      </w:r>
+      <m:oMath>
+        <m:r>
+          <m:rPr>
+            <m:sty m:val="p"/>
+          </m:rPr>
+          <m:t>†</m:t>
+        </m:r>
+      </m:oMath>
+      <w:r>
+        <w:t xml:space="preserve">Neoepiblemidae and virtually all representatives of the Dinomyidae. Notably, all large-to-giant forms were concomitantly erased. Nevertheless, despite the apparent size selectivity of the aforementioned decline, the latter does not apply to other traits like hypsodonty. Pliocene cooling and desertification was proposed as a driver underlying the demise of the clade in Southern South America</w:t>
+      </w:r>
+      <w:r>
+        <w:t xml:space="preserve"> </w:t>
+      </w:r>
+      <w:r>
+        <w:t xml:space="preserve">(Vucetich et al. 2015)</w:t>
+      </w:r>
+      <w:r>
+        <w:t xml:space="preserve">. Moreover, given that the time frame of the demise of the Chinchilloidea matches the Great American Biotic Interchange</w:t>
+      </w:r>
+      <w:r>
+        <w:t xml:space="preserve"> </w:t>
+      </w:r>
+      <w:r>
+        <w:t xml:space="preserve">(Marshall et al. 1982; Webb 1985)</w:t>
+      </w:r>
+      <w:r>
+        <w:t xml:space="preserve">, one can also wonder whether such a demise can be related to the arrival of North American migrants, either competing for similar food resources (</w:t>
+      </w:r>
+      <w:r>
+        <w:rPr>
+          <w:i/>
+          <w:iCs/>
+        </w:rPr>
+        <w:t xml:space="preserve">e</w:t>
+      </w:r>
+      <w:r>
+        <w:t xml:space="preserve">.</w:t>
+      </w:r>
+      <w:r>
+        <w:rPr>
+          <w:i/>
+          <w:iCs/>
+        </w:rPr>
+        <w:t xml:space="preserve">g</w:t>
+      </w:r>
+      <w:r>
+        <w:t xml:space="preserve">., horses, elephants) or preying on native species (</w:t>
+      </w:r>
+      <w:r>
+        <w:rPr>
+          <w:i/>
+          <w:iCs/>
+        </w:rPr>
+        <w:t xml:space="preserve">e</w:t>
+      </w:r>
+      <w:r>
+        <w:t xml:space="preserve">.</w:t>
+      </w:r>
+      <w:r>
+        <w:rPr>
+          <w:i/>
+          <w:iCs/>
+        </w:rPr>
+        <w:t xml:space="preserve">g</w:t>
+      </w:r>
+      <w:r>
+        <w:t xml:space="preserve">., carnivorans).</w:t>
+      </w:r>
+    </w:p>
+    <w:p>
+      <w:pPr>
+        <w:pStyle w:val="BodyText"/>
+      </w:pPr>
+      <w:r>
         <w:t xml:space="preserve">Unlike the evidenced decoupled diversity and disparity patterns evidenced between caviomorph superfamilies</w:t>
       </w:r>
       <w:r>
@@ -4977,6 +5095,124 @@
         <w:pStyle w:val="FirstParagraph"/>
       </w:pPr>
       <w:r>
+        <w:t xml:space="preserve">The question of what governs clade-wise diversity dynamics remains hotly debated</w:t>
+      </w:r>
+      <w:r>
+        <w:t xml:space="preserve"> </w:t>
+      </w:r>
+      <w:r>
+        <w:t xml:space="preserve">(see Quintero et al. 2025 and literature therein)</w:t>
+      </w:r>
+      <w:r>
+        <w:t xml:space="preserve">, and gains an additional layer of complexity when incorporating the dynamics of morphological disparity. Seminal works highlighted that clades could experience coordinated or decoupled diversity and disparity trajectories linked to biological diversification</w:t>
+      </w:r>
+      <w:r>
+        <w:t xml:space="preserve"> </w:t>
+      </w:r>
+      <w:r>
+        <w:t xml:space="preserve">(Foote 1993, 1997)</w:t>
+      </w:r>
+      <w:r>
+        <w:t xml:space="preserve">. Far from a one-fits-them-all rule, the diversity-disparity interplay was rather shown to be complex and case-dependent, with speciation and extinction either acting as opposing forces or reinforcing one another in the contraction/expansion of the morphospace through evolutionary times</w:t>
+      </w:r>
+      <w:r>
+        <w:t xml:space="preserve"> </w:t>
+      </w:r>
+      <w:r>
+        <w:t xml:space="preserve">(Foote 1993, 1997; Balseiro et al. 2025; Esteve 2025)</w:t>
+      </w:r>
+      <w:r>
+        <w:t xml:space="preserve">. Here, our clade offers an example of coupled dynamics of disparity and diversity</w:t>
+      </w:r>
+      <w:r>
+        <w:t xml:space="preserve"> </w:t>
+      </w:r>
+      <w:hyperlink w:anchor="fig-diversityBM">
+        <w:r>
+          <w:rPr>
+            <w:rStyle w:val="Hyperlink"/>
+          </w:rPr>
+          <w:t xml:space="preserve">Figure 3</w:t>
+        </w:r>
+      </w:hyperlink>
+      <w:r>
+        <w:t xml:space="preserve">.</w:t>
+      </w:r>
+    </w:p>
+    <w:p>
+      <w:pPr>
+        <w:pStyle w:val="BodyText"/>
+      </w:pPr>
+      <w:r>
+        <w:t xml:space="preserve">Conspicuousness of the waxing-and-waning diversity pattern</w:t>
+      </w:r>
+      <w:r>
+        <w:t xml:space="preserve"> </w:t>
+      </w:r>
+      <w:r>
+        <w:t xml:space="preserve">(</w:t>
+      </w:r>
+      <w:r>
+        <w:rPr>
+          <w:i/>
+          <w:iCs/>
+        </w:rPr>
+        <w:t xml:space="preserve">e</w:t>
+      </w:r>
+      <w:r>
+        <w:t xml:space="preserve">.</w:t>
+      </w:r>
+      <w:r>
+        <w:rPr>
+          <w:i/>
+          <w:iCs/>
+        </w:rPr>
+        <w:t xml:space="preserve">g</w:t>
+      </w:r>
+      <w:r>
+        <w:t xml:space="preserve">., Foote 2007; Hohmann and Jarochowska 2019; Billaud et al. 2020; Quintero et al. 2025)</w:t>
+      </w:r>
+      <w:r>
+        <w:t xml:space="preserve"> </w:t>
+      </w:r>
+      <m:oMath>
+        <m:r>
+          <m:rPr>
+            <m:sty m:val="p"/>
+          </m:rPr>
+          <m:t>→</m:t>
+        </m:r>
+      </m:oMath>
+      <w:r>
+        <w:t xml:space="preserve"> </w:t>
+      </w:r>
+      <w:r>
+        <w:rPr>
+          <w:b/>
+          <w:bCs/>
+        </w:rPr>
+        <w:t xml:space="preserve">read</w:t>
+      </w:r>
+      <w:r>
+        <w:rPr>
+          <w:b/>
+          <w:bCs/>
+        </w:rPr>
+        <w:t xml:space="preserve"> </w:t>
+      </w:r>
+      <w:r>
+        <w:rPr>
+          <w:b/>
+          <w:bCs/>
+        </w:rPr>
+        <w:t xml:space="preserve">(Foote 2007; Hohmann and Jarochowska 2019)</w:t>
+      </w:r>
+    </w:p>
+    <w:p>
+      <w:pPr>
+        <w:pStyle w:val="BodyText"/>
+      </w:pPr>
+      <w:r>
         <w:t xml:space="preserve">Whether this unique trajectory stems from intrinsic developmental capability, ecological opportunity or a combination of both remains an open question</w:t>
       </w:r>
       <w:r>
@@ -4991,62 +5227,13 @@
         <w:pStyle w:val="BodyText"/>
       </w:pPr>
       <w:r>
-        <w:t xml:space="preserve">Seminal works highlighted that clades could experience coordinated or decoupled diversity and disparity trajectories linked to biological diversification –</w:t>
-      </w:r>
-      <w:r>
-        <w:t xml:space="preserve"> </w:t>
-      </w:r>
-      <w:r>
-        <w:rPr>
-          <w:i/>
-          <w:iCs/>
-        </w:rPr>
-        <w:t xml:space="preserve">i</w:t>
-      </w:r>
-      <w:r>
-        <w:t xml:space="preserve">.</w:t>
-      </w:r>
-      <w:r>
-        <w:rPr>
-          <w:i/>
-          <w:iCs/>
-        </w:rPr>
-        <w:t xml:space="preserve">e</w:t>
-      </w:r>
-      <w:r>
-        <w:t xml:space="preserve">., speciation and extinction, the processes generating diversity</w:t>
-      </w:r>
-      <w:r>
-        <w:t xml:space="preserve"> </w:t>
-      </w:r>
-      <w:r>
-        <w:t xml:space="preserve">(Foote 1993, 1997)</w:t>
-      </w:r>
-      <w:r>
-        <w:t xml:space="preserve">. Far from a one-fits-them-all rule, the diversity-disparity interplay was rather shown to be complex and case-dependent, with speciation and extinction either acting as opposing forces or reinforcing one another in the contraction/expansion of the morphospace through evolutionary times</w:t>
-      </w:r>
-      <w:r>
-        <w:t xml:space="preserve"> </w:t>
-      </w:r>
-      <w:r>
-        <w:t xml:space="preserve">(Foote 1993, 1997; Balseiro et al. 2025; Esteve 2025)</w:t>
-      </w:r>
-      <w:r>
-        <w:t xml:space="preserve">. Here, our clade offers an example of coupled dynamics of disparity and diversity</w:t>
-      </w:r>
-      <w:r>
-        <w:t xml:space="preserve"> </w:t>
-      </w:r>
-      <w:hyperlink w:anchor="fig-diversityBM">
-        <w:r>
-          <w:rPr>
-            <w:rStyle w:val="Hyperlink"/>
-          </w:rPr>
-          <w:t xml:space="preserve">Figure 3</w:t>
-        </w:r>
-      </w:hyperlink>
-      <w:r>
-        <w:t xml:space="preserve">.</w:t>
+        <w:t xml:space="preserve">Are we detecting mid-late Miocene pulses of diversification that lead to the differenciation of extant lineages postulated from the fossil record ?</w:t>
+      </w:r>
+      <w:r>
+        <w:t xml:space="preserve"> </w:t>
+      </w:r>
+      <w:r>
+        <w:t xml:space="preserve">Vucetich et al. (2015)</w:t>
       </w:r>
     </w:p>
     <w:p>
@@ -5054,20 +5241,6 @@
         <w:pStyle w:val="BodyText"/>
       </w:pPr>
       <w:r>
-        <w:t xml:space="preserve">Are we detecting mid-late Miocene pulses of diversification that lead to the differenciation of extant lineages postulated from the fossil record ?</w:t>
-      </w:r>
-      <w:r>
-        <w:t xml:space="preserve"> </w:t>
-      </w:r>
-      <w:r>
-        <w:t xml:space="preserve">Vucetich et al. (2015)</w:t>
-      </w:r>
-    </w:p>
-    <w:p>
-      <w:pPr>
-        <w:pStyle w:val="BodyText"/>
-      </w:pPr>
-      <w:r>
         <w:t xml:space="preserve">Clade with a rich fossil record that underwent a taxonomic and possibly ecological decline: parallel with proboscids</w:t>
       </w:r>
       <w:r>
@@ -5083,7 +5256,7 @@
         <w:t xml:space="preserve"> </w:t>
       </w:r>
       <w:r>
-        <w:t xml:space="preserve">(Boisserie et al. 2005; Boisserie 2005-)</w:t>
+        <w:t xml:space="preserve">(Boisserie et al. 2005; Boisserie 2005)</w:t>
       </w:r>
       <w:r>
         <w:t xml:space="preserve">, rhinocerotids</w:t>
@@ -5123,6 +5296,20 @@
     <w:p>
       <w:pPr>
         <w:pStyle w:val="FirstParagraph"/>
+      </w:pPr>
+      <w:r>
+        <w:t xml:space="preserve">Absence of diversity-dependent effect raised by</w:t>
+      </w:r>
+      <w:r>
+        <w:t xml:space="preserve"> </w:t>
+      </w:r>
+      <w:r>
+        <w:t xml:space="preserve">Quintero et al. (2025)</w:t>
+      </w:r>
+    </w:p>
+    <w:p>
+      <w:pPr>
+        <w:pStyle w:val="BodyText"/>
       </w:pPr>
       <w:r>
         <w:t xml:space="preserve">Diet !! Evolution towards large to very large body sizes must have implied adaptations in terms of nutrient supply. Did they achieve this by consuming new forms of food? Could landscape opening play a role?</w:t>
@@ -5691,7 +5878,7 @@
       </w:r>
     </w:p>
     <w:bookmarkEnd w:id="49"/>
-    <w:bookmarkStart w:id="266" w:name="references"/>
+    <w:bookmarkStart w:id="278" w:name="references"/>
     <w:p>
       <w:pPr>
         <w:pStyle w:val="Heading1"/>
@@ -5700,7 +5887,7 @@
         <w:t xml:space="preserve">References</w:t>
       </w:r>
     </w:p>
-    <w:bookmarkStart w:id="265" w:name="refs"/>
+    <w:bookmarkStart w:id="277" w:name="refs"/>
     <w:bookmarkStart w:id="51" w:name="ref-álvarez2017"/>
     <w:p>
       <w:pPr>
@@ -5985,18 +6172,42 @@
       </w:r>
     </w:p>
     <w:bookmarkEnd w:id="68"/>
-    <w:bookmarkStart w:id="70" w:name="ref-billet2009"/>
+    <w:bookmarkStart w:id="70" w:name="ref-billaud2020"/>
     <w:p>
       <w:pPr>
         <w:pStyle w:val="Bibliography"/>
       </w:pPr>
       <w:r>
+        <w:t xml:space="preserve">Billaud, O., D. S. Moen, T. L. Parsons, and H. Morlon. 2020.</w:t>
+      </w:r>
+      <w:r>
+        <w:t xml:space="preserve"> </w:t>
+      </w:r>
+      <w:hyperlink r:id="rId69">
+        <w:r>
+          <w:rPr>
+            <w:rStyle w:val="Hyperlink"/>
+          </w:rPr>
+          <w:t xml:space="preserve">Estimating diversity through time using molecular phylogenies: Old and species-poor frog families are the remnants of a diverse past</w:t>
+        </w:r>
+      </w:hyperlink>
+      <w:r>
+        <w:t xml:space="preserve">. Systematic Biology 69:363–383.</w:t>
+      </w:r>
+    </w:p>
+    <w:bookmarkEnd w:id="70"/>
+    <w:bookmarkStart w:id="72" w:name="ref-billet2009"/>
+    <w:p>
+      <w:pPr>
+        <w:pStyle w:val="Bibliography"/>
+      </w:pPr>
+      <w:r>
         <w:t xml:space="preserve">Billet, G., C. Blondel, and C. de Muizon. 2009.</w:t>
       </w:r>
       <w:r>
         <w:t xml:space="preserve"> </w:t>
       </w:r>
-      <w:hyperlink r:id="rId69">
+      <w:hyperlink r:id="rId71">
         <w:r>
           <w:rPr>
             <w:rStyle w:val="Hyperlink"/>
@@ -6008,8 +6219,8 @@
         <w:t xml:space="preserve">. Palaeogeography, Palaeoclimatology, Palaeoecology 274:114–124.</w:t>
       </w:r>
     </w:p>
-    <w:bookmarkEnd w:id="70"/>
-    <w:bookmarkStart w:id="72" w:name="ref-boessenecker2019"/>
+    <w:bookmarkEnd w:id="72"/>
+    <w:bookmarkStart w:id="74" w:name="ref-boessenecker2019"/>
     <w:p>
       <w:pPr>
         <w:pStyle w:val="Bibliography"/>
@@ -6020,7 +6231,7 @@
       <w:r>
         <w:t xml:space="preserve"> </w:t>
       </w:r>
-      <w:hyperlink r:id="rId71">
+      <w:hyperlink r:id="rId73">
         <w:r>
           <w:rPr>
             <w:rStyle w:val="Hyperlink"/>
@@ -6032,8 +6243,8 @@
         <w:t xml:space="preserve">. PeerJ 7:e6088.</w:t>
       </w:r>
     </w:p>
-    <w:bookmarkEnd w:id="72"/>
-    <w:bookmarkStart w:id="74" w:name="ref-boisserie_phylogeny_2005"/>
+    <w:bookmarkEnd w:id="74"/>
+    <w:bookmarkStart w:id="76" w:name="ref-boisserie_phylogeny_2005"/>
     <w:p>
       <w:pPr>
         <w:pStyle w:val="Bibliography"/>
@@ -6044,7 +6255,7 @@
       <w:r>
         <w:t xml:space="preserve"> </w:t>
       </w:r>
-      <w:hyperlink r:id="rId73">
+      <w:hyperlink r:id="rId75">
         <w:r>
           <w:rPr>
             <w:rStyle w:val="Hyperlink"/>
@@ -6056,8 +6267,8 @@
         <w:t xml:space="preserve">. Zool J Linn Soc 143:1–26.</w:t>
       </w:r>
     </w:p>
-    <w:bookmarkEnd w:id="74"/>
-    <w:bookmarkStart w:id="76" w:name="ref-boisserie2005"/>
+    <w:bookmarkEnd w:id="76"/>
+    <w:bookmarkStart w:id="78" w:name="ref-boisserie2005"/>
     <w:p>
       <w:pPr>
         <w:pStyle w:val="Bibliography"/>
@@ -6068,7 +6279,7 @@
       <w:r>
         <w:t xml:space="preserve"> </w:t>
       </w:r>
-      <w:hyperlink r:id="rId75">
+      <w:hyperlink r:id="rId77">
         <w:r>
           <w:rPr>
             <w:rStyle w:val="Hyperlink"/>
@@ -6080,8 +6291,8 @@
         <w:t xml:space="preserve">. Proceedings of the National Academy of Sciences 102:1537–1541.</w:t>
       </w:r>
     </w:p>
-    <w:bookmarkEnd w:id="76"/>
-    <w:bookmarkStart w:id="78" w:name="ref-boivin2024"/>
+    <w:bookmarkEnd w:id="78"/>
+    <w:bookmarkStart w:id="80" w:name="ref-boivin2024"/>
     <w:p>
       <w:pPr>
         <w:pStyle w:val="Bibliography"/>
@@ -6092,7 +6303,7 @@
       <w:r>
         <w:t xml:space="preserve"> </w:t>
       </w:r>
-      <w:hyperlink r:id="rId77">
+      <w:hyperlink r:id="rId79">
         <w:r>
           <w:rPr>
             <w:rStyle w:val="Hyperlink"/>
@@ -6104,8 +6315,8 @@
         <w:t xml:space="preserve">. Journal of Mammalian Evolution 31:43.</w:t>
       </w:r>
     </w:p>
-    <w:bookmarkEnd w:id="78"/>
-    <w:bookmarkStart w:id="80" w:name="ref-boivin2019"/>
+    <w:bookmarkEnd w:id="80"/>
+    <w:bookmarkStart w:id="82" w:name="ref-boivin2019"/>
     <w:p>
       <w:pPr>
         <w:pStyle w:val="Bibliography"/>
@@ -6116,7 +6327,7 @@
       <w:r>
         <w:t xml:space="preserve"> </w:t>
       </w:r>
-      <w:hyperlink r:id="rId79">
+      <w:hyperlink r:id="rId81">
         <w:r>
           <w:rPr>
             <w:rStyle w:val="Hyperlink"/>
@@ -6128,8 +6339,8 @@
         <w:t xml:space="preserve">. Geodiversitas 41:143–245.</w:t>
       </w:r>
     </w:p>
-    <w:bookmarkEnd w:id="80"/>
-    <w:bookmarkStart w:id="82" w:name="ref-boscaini2025"/>
+    <w:bookmarkEnd w:id="82"/>
+    <w:bookmarkStart w:id="84" w:name="ref-boscaini2025"/>
     <w:p>
       <w:pPr>
         <w:pStyle w:val="Bibliography"/>
@@ -6140,7 +6351,7 @@
       <w:r>
         <w:t xml:space="preserve"> </w:t>
       </w:r>
-      <w:hyperlink r:id="rId81">
+      <w:hyperlink r:id="rId83">
         <w:r>
           <w:rPr>
             <w:rStyle w:val="Hyperlink"/>
@@ -6152,8 +6363,8 @@
         <w:t xml:space="preserve">. Science 388:864–868.</w:t>
       </w:r>
     </w:p>
-    <w:bookmarkEnd w:id="82"/>
-    <w:bookmarkStart w:id="84" w:name="ref-boschman2021"/>
+    <w:bookmarkEnd w:id="84"/>
+    <w:bookmarkStart w:id="86" w:name="ref-boschman2021"/>
     <w:p>
       <w:pPr>
         <w:pStyle w:val="Bibliography"/>
@@ -6164,7 +6375,7 @@
       <w:r>
         <w:t xml:space="preserve"> </w:t>
       </w:r>
-      <w:hyperlink r:id="rId83">
+      <w:hyperlink r:id="rId85">
         <w:r>
           <w:rPr>
             <w:rStyle w:val="Hyperlink"/>
@@ -6176,8 +6387,8 @@
         <w:t xml:space="preserve">. Earth-Science Reviews 220:103640.</w:t>
       </w:r>
     </w:p>
-    <w:bookmarkEnd w:id="84"/>
-    <w:bookmarkStart w:id="86" w:name="ref-brandoni2016"/>
+    <w:bookmarkEnd w:id="86"/>
+    <w:bookmarkStart w:id="88" w:name="ref-brandoni2016"/>
     <w:p>
       <w:pPr>
         <w:pStyle w:val="Bibliography"/>
@@ -6188,7 +6399,7 @@
       <w:r>
         <w:t xml:space="preserve"> </w:t>
       </w:r>
-      <w:hyperlink r:id="rId85">
+      <w:hyperlink r:id="rId87">
         <w:r>
           <w:rPr>
             <w:rStyle w:val="Hyperlink"/>
@@ -6200,8 +6411,8 @@
         <w:t xml:space="preserve">. PalZ 90:619–628.</w:t>
       </w:r>
     </w:p>
-    <w:bookmarkEnd w:id="86"/>
-    <w:bookmarkStart w:id="88" w:name="ref-brée2022"/>
+    <w:bookmarkEnd w:id="88"/>
+    <w:bookmarkStart w:id="90" w:name="ref-brée2022"/>
     <w:p>
       <w:pPr>
         <w:pStyle w:val="Bibliography"/>
@@ -6212,7 +6423,7 @@
       <w:r>
         <w:t xml:space="preserve"> </w:t>
       </w:r>
-      <w:hyperlink r:id="rId87">
+      <w:hyperlink r:id="rId89">
         <w:r>
           <w:rPr>
             <w:rStyle w:val="Hyperlink"/>
@@ -6224,8 +6435,8 @@
         <w:t xml:space="preserve">. Scientific Reports 12:21906.</w:t>
       </w:r>
     </w:p>
-    <w:bookmarkEnd w:id="88"/>
-    <w:bookmarkStart w:id="90" w:name="ref-buffan2025"/>
+    <w:bookmarkEnd w:id="90"/>
+    <w:bookmarkStart w:id="92" w:name="ref-buffan2025"/>
     <w:p>
       <w:pPr>
         <w:pStyle w:val="Bibliography"/>
@@ -6236,7 +6447,7 @@
       <w:r>
         <w:t xml:space="preserve"> </w:t>
       </w:r>
-      <w:hyperlink r:id="rId89">
+      <w:hyperlink r:id="rId91">
         <w:r>
           <w:rPr>
             <w:rStyle w:val="Hyperlink"/>
@@ -6260,8 +6471,8 @@
         <w:t xml:space="preserve">. Proceedings of the National Academy of Sciences 122:e2419520122.</w:t>
       </w:r>
     </w:p>
-    <w:bookmarkEnd w:id="90"/>
-    <w:bookmarkStart w:id="92" w:name="ref-burgin2025"/>
+    <w:bookmarkEnd w:id="92"/>
+    <w:bookmarkStart w:id="94" w:name="ref-burgin2025"/>
     <w:p>
       <w:pPr>
         <w:pStyle w:val="Bibliography"/>
@@ -6272,7 +6483,7 @@
       <w:r>
         <w:t xml:space="preserve"> </w:t>
       </w:r>
-      <w:hyperlink r:id="rId91">
+      <w:hyperlink r:id="rId93">
         <w:r>
           <w:rPr>
             <w:rStyle w:val="Hyperlink"/>
@@ -6284,8 +6495,8 @@
         <w:t xml:space="preserve">. bioRxiv.</w:t>
       </w:r>
     </w:p>
-    <w:bookmarkEnd w:id="92"/>
-    <w:bookmarkStart w:id="93" w:name="ref-candela2005"/>
+    <w:bookmarkEnd w:id="94"/>
+    <w:bookmarkStart w:id="95" w:name="ref-candela2005"/>
     <w:p>
       <w:pPr>
         <w:pStyle w:val="Bibliography"/>
@@ -6306,8 +6517,8 @@
         <w:t xml:space="preserve">os (argentina). Temas de la Biodiversidad del Litoral fluvial argentino II 37–48.</w:t>
       </w:r>
     </w:p>
-    <w:bookmarkEnd w:id="93"/>
-    <w:bookmarkStart w:id="95" w:name="ref-candela2013"/>
+    <w:bookmarkEnd w:id="95"/>
+    <w:bookmarkStart w:id="97" w:name="ref-candela2013"/>
     <w:p>
       <w:pPr>
         <w:pStyle w:val="Bibliography"/>
@@ -6318,7 +6529,7 @@
       <w:r>
         <w:t xml:space="preserve"> </w:t>
       </w:r>
-      <w:hyperlink r:id="rId94">
+      <w:hyperlink r:id="rId96">
         <w:r>
           <w:rPr>
             <w:rStyle w:val="Hyperlink"/>
@@ -6330,8 +6541,8 @@
         <w:t xml:space="preserve">. Lethaia 46:369–377.</w:t>
       </w:r>
     </w:p>
-    <w:bookmarkEnd w:id="95"/>
-    <w:bookmarkStart w:id="97" w:name="ref-cantalapiedra2021"/>
+    <w:bookmarkEnd w:id="97"/>
+    <w:bookmarkStart w:id="99" w:name="ref-cantalapiedra2021"/>
     <w:p>
       <w:pPr>
         <w:pStyle w:val="Bibliography"/>
@@ -6342,7 +6553,7 @@
       <w:r>
         <w:t xml:space="preserve"> </w:t>
       </w:r>
-      <w:hyperlink r:id="rId96">
+      <w:hyperlink r:id="rId98">
         <w:r>
           <w:rPr>
             <w:rStyle w:val="Hyperlink"/>
@@ -6354,8 +6565,8 @@
         <w:t xml:space="preserve">. Nature Ecology &amp; Evolution 5:1266–1272.</w:t>
       </w:r>
     </w:p>
-    <w:bookmarkEnd w:id="97"/>
-    <w:bookmarkStart w:id="99" w:name="ref-carrillo_giant_2015"/>
+    <w:bookmarkEnd w:id="99"/>
+    <w:bookmarkStart w:id="101" w:name="ref-carrillo_giant_2015"/>
     <w:p>
       <w:pPr>
         <w:pStyle w:val="Bibliography"/>
@@ -6366,7 +6577,7 @@
       <w:r>
         <w:t xml:space="preserve"> </w:t>
       </w:r>
-      <w:hyperlink r:id="rId98">
+      <w:hyperlink r:id="rId100">
         <w:r>
           <w:rPr>
             <w:rStyle w:val="Hyperlink"/>
@@ -6378,8 +6589,8 @@
         <w:t xml:space="preserve">. Paläontol Z 89:1057–1071.</w:t>
       </w:r>
     </w:p>
-    <w:bookmarkEnd w:id="99"/>
-    <w:bookmarkStart w:id="100" w:name="ref-carrillo"/>
+    <w:bookmarkEnd w:id="101"/>
+    <w:bookmarkStart w:id="102" w:name="ref-carrillo"/>
     <w:p>
       <w:pPr>
         <w:pStyle w:val="Bibliography"/>
@@ -6388,8 +6599,8 @@
         <w:t xml:space="preserve">Carrillo, J. D., M. F. Torres Jiménez, F. J. Urrea-Barreto, A. Antonelli, C. Bacon, S. Faurby, and D. Silvestro. n.d. Decoupled diversity and disparity after faunistic turnover in caviomorph rodents.</w:t>
       </w:r>
     </w:p>
-    <w:bookmarkEnd w:id="100"/>
-    <w:bookmarkStart w:id="102" w:name="ref-chiarenza2020"/>
+    <w:bookmarkEnd w:id="102"/>
+    <w:bookmarkStart w:id="104" w:name="ref-chiarenza2020"/>
     <w:p>
       <w:pPr>
         <w:pStyle w:val="Bibliography"/>
@@ -6400,7 +6611,7 @@
       <w:r>
         <w:t xml:space="preserve"> </w:t>
       </w:r>
-      <w:hyperlink r:id="rId101">
+      <w:hyperlink r:id="rId103">
         <w:r>
           <w:rPr>
             <w:rStyle w:val="Hyperlink"/>
@@ -6412,8 +6623,8 @@
         <w:t xml:space="preserve">. Proceedings of the National Academy of Sciences 117:17084–17093.</w:t>
       </w:r>
     </w:p>
-    <w:bookmarkEnd w:id="102"/>
-    <w:bookmarkStart w:id="104" w:name="ref-cohen2025"/>
+    <w:bookmarkEnd w:id="104"/>
+    <w:bookmarkStart w:id="106" w:name="ref-cohen2025"/>
     <w:p>
       <w:pPr>
         <w:pStyle w:val="Bibliography"/>
@@ -6424,7 +6635,7 @@
       <w:r>
         <w:t xml:space="preserve"> </w:t>
       </w:r>
-      <w:hyperlink r:id="rId103">
+      <w:hyperlink r:id="rId105">
         <w:r>
           <w:rPr>
             <w:rStyle w:val="Hyperlink"/>
@@ -6436,8 +6647,8 @@
         <w:t xml:space="preserve">. Episodes Journal of International Geoscience 48:105–115.</w:t>
       </w:r>
     </w:p>
-    <w:bookmarkEnd w:id="104"/>
-    <w:bookmarkStart w:id="106" w:name="ref-condamine2018"/>
+    <w:bookmarkEnd w:id="106"/>
+    <w:bookmarkStart w:id="108" w:name="ref-condamine2018"/>
     <w:p>
       <w:pPr>
         <w:pStyle w:val="Bibliography"/>
@@ -6448,7 +6659,7 @@
       <w:r>
         <w:t xml:space="preserve"> </w:t>
       </w:r>
-      <w:hyperlink r:id="rId105">
+      <w:hyperlink r:id="rId107">
         <w:r>
           <w:rPr>
             <w:rStyle w:val="Hyperlink"/>
@@ -6460,8 +6671,8 @@
         <w:t xml:space="preserve">. Systematic Biology 67:940–964.</w:t>
       </w:r>
     </w:p>
-    <w:bookmarkEnd w:id="106"/>
-    <w:bookmarkStart w:id="108" w:name="ref-condamine2019"/>
+    <w:bookmarkEnd w:id="108"/>
+    <w:bookmarkStart w:id="110" w:name="ref-condamine2019"/>
     <w:p>
       <w:pPr>
         <w:pStyle w:val="Bibliography"/>
@@ -6472,7 +6683,7 @@
       <w:r>
         <w:t xml:space="preserve"> </w:t>
       </w:r>
-      <w:hyperlink r:id="rId107">
+      <w:hyperlink r:id="rId109">
         <w:r>
           <w:rPr>
             <w:rStyle w:val="Hyperlink"/>
@@ -6484,8 +6695,8 @@
         <w:t xml:space="preserve">. Ecology Letters 22:1900–1912.</w:t>
       </w:r>
     </w:p>
-    <w:bookmarkEnd w:id="108"/>
-    <w:bookmarkStart w:id="110" w:name="ref-condamine_climate_2019"/>
+    <w:bookmarkEnd w:id="110"/>
+    <w:bookmarkStart w:id="112" w:name="ref-condamine_climate_2019"/>
     <w:p>
       <w:pPr>
         <w:pStyle w:val="Bibliography"/>
@@ -6496,7 +6707,7 @@
       <w:r>
         <w:t xml:space="preserve"> </w:t>
       </w:r>
-      <w:hyperlink r:id="rId109">
+      <w:hyperlink r:id="rId111">
         <w:r>
           <w:rPr>
             <w:rStyle w:val="Hyperlink"/>
@@ -6508,8 +6719,8 @@
         <w:t xml:space="preserve">. Proc. Nat. Acad. Sc. U.S.A 116. Proceedings of the National Academy of Sciences.</w:t>
       </w:r>
     </w:p>
-    <w:bookmarkEnd w:id="110"/>
-    <w:bookmarkStart w:id="112" w:name="ref-condamine2020"/>
+    <w:bookmarkEnd w:id="112"/>
+    <w:bookmarkStart w:id="114" w:name="ref-condamine2020"/>
     <w:p>
       <w:pPr>
         <w:pStyle w:val="Bibliography"/>
@@ -6520,7 +6731,7 @@
       <w:r>
         <w:t xml:space="preserve"> </w:t>
       </w:r>
-      <w:hyperlink r:id="rId111">
+      <w:hyperlink r:id="rId113">
         <w:r>
           <w:rPr>
             <w:rStyle w:val="Hyperlink"/>
@@ -6532,8 +6743,8 @@
         <w:t xml:space="preserve">. Proceedings of the National Academy of Sciences 117:28867–28875.</w:t>
       </w:r>
     </w:p>
-    <w:bookmarkEnd w:id="112"/>
-    <w:bookmarkStart w:id="114" w:name="ref-cooper2025"/>
+    <w:bookmarkEnd w:id="114"/>
+    <w:bookmarkStart w:id="116" w:name="ref-cooper2025"/>
     <w:p>
       <w:pPr>
         <w:pStyle w:val="Bibliography"/>
@@ -6544,7 +6755,7 @@
       <w:r>
         <w:t xml:space="preserve"> </w:t>
       </w:r>
-      <w:hyperlink r:id="rId113">
+      <w:hyperlink r:id="rId115">
         <w:r>
           <w:rPr>
             <w:rStyle w:val="Hyperlink"/>
@@ -6562,8 +6773,8 @@
         <w:t xml:space="preserve">. Methods in Ecology and Evolution 16:1923–1934.</w:t>
       </w:r>
     </w:p>
-    <w:bookmarkEnd w:id="114"/>
-    <w:bookmarkStart w:id="116" w:name="ref-cooper2024"/>
+    <w:bookmarkEnd w:id="116"/>
+    <w:bookmarkStart w:id="118" w:name="ref-cooper2024"/>
     <w:p>
       <w:pPr>
         <w:pStyle w:val="Bibliography"/>
@@ -6574,7 +6785,7 @@
       <w:r>
         <w:t xml:space="preserve"> </w:t>
       </w:r>
-      <w:hyperlink r:id="rId115">
+      <w:hyperlink r:id="rId117">
         <w:r>
           <w:rPr>
             <w:rStyle w:val="Hyperlink"/>
@@ -6586,8 +6797,8 @@
         <w:t xml:space="preserve">. Nature Communications 15:4199.</w:t>
       </w:r>
     </w:p>
-    <w:bookmarkEnd w:id="116"/>
-    <w:bookmarkStart w:id="118" w:name="ref-cuitiño2021"/>
+    <w:bookmarkEnd w:id="118"/>
+    <w:bookmarkStart w:id="120" w:name="ref-cuitiño2021"/>
     <w:p>
       <w:pPr>
         <w:pStyle w:val="Bibliography"/>
@@ -6598,7 +6809,7 @@
       <w:r>
         <w:t xml:space="preserve"> </w:t>
       </w:r>
-      <w:hyperlink r:id="rId117">
+      <w:hyperlink r:id="rId119">
         <w:r>
           <w:rPr>
             <w:rStyle w:val="Hyperlink"/>
@@ -6616,8 +6827,8 @@
         <w:t xml:space="preserve">. Journal of the Geological Society 178:jgs2020–188.</w:t>
       </w:r>
     </w:p>
-    <w:bookmarkEnd w:id="118"/>
-    <w:bookmarkStart w:id="120" w:name="ref-dacunha2023"/>
+    <w:bookmarkEnd w:id="120"/>
+    <w:bookmarkStart w:id="122" w:name="ref-dacunha2023"/>
     <w:p>
       <w:pPr>
         <w:pStyle w:val="Bibliography"/>
@@ -6628,7 +6839,7 @@
       <w:r>
         <w:t xml:space="preserve"> </w:t>
       </w:r>
-      <w:hyperlink r:id="rId119">
+      <w:hyperlink r:id="rId121">
         <w:r>
           <w:rPr>
             <w:rStyle w:val="Hyperlink"/>
@@ -6640,8 +6851,8 @@
         <w:t xml:space="preserve">. Journal of Mammalian Evolution 30:1155–1176.</w:t>
       </w:r>
     </w:p>
-    <w:bookmarkEnd w:id="120"/>
-    <w:bookmarkStart w:id="122" w:name="ref-damuth1993"/>
+    <w:bookmarkEnd w:id="122"/>
+    <w:bookmarkStart w:id="124" w:name="ref-damuth1993"/>
     <w:p>
       <w:pPr>
         <w:pStyle w:val="Bibliography"/>
@@ -6652,7 +6863,7 @@
       <w:r>
         <w:t xml:space="preserve"> </w:t>
       </w:r>
-      <w:hyperlink r:id="rId121">
+      <w:hyperlink r:id="rId123">
         <w:r>
           <w:rPr>
             <w:rStyle w:val="Hyperlink"/>
@@ -6664,8 +6875,8 @@
         <w:t xml:space="preserve">. Nature 365:748–750.</w:t>
       </w:r>
     </w:p>
-    <w:bookmarkEnd w:id="122"/>
-    <w:bookmarkStart w:id="124" w:name="ref-damuth2011"/>
+    <w:bookmarkEnd w:id="124"/>
+    <w:bookmarkStart w:id="126" w:name="ref-damuth2011"/>
     <w:p>
       <w:pPr>
         <w:pStyle w:val="Bibliography"/>
@@ -6676,7 +6887,7 @@
       <w:r>
         <w:t xml:space="preserve"> </w:t>
       </w:r>
-      <w:hyperlink r:id="rId123">
+      <w:hyperlink r:id="rId125">
         <w:r>
           <w:rPr>
             <w:rStyle w:val="Hyperlink"/>
@@ -6688,8 +6899,8 @@
         <w:t xml:space="preserve">. Biological Reviews 86:733–758.</w:t>
       </w:r>
     </w:p>
-    <w:bookmarkEnd w:id="124"/>
-    <w:bookmarkStart w:id="126" w:name="ref-drury2016"/>
+    <w:bookmarkEnd w:id="126"/>
+    <w:bookmarkStart w:id="128" w:name="ref-drury2016"/>
     <w:p>
       <w:pPr>
         <w:pStyle w:val="Bibliography"/>
@@ -6700,7 +6911,7 @@
       <w:r>
         <w:t xml:space="preserve"> </w:t>
       </w:r>
-      <w:hyperlink r:id="rId125">
+      <w:hyperlink r:id="rId127">
         <w:r>
           <w:rPr>
             <w:rStyle w:val="Hyperlink"/>
@@ -6712,8 +6923,8 @@
         <w:t xml:space="preserve">. Systematic Biology 65:700–710.</w:t>
       </w:r>
     </w:p>
-    <w:bookmarkEnd w:id="126"/>
-    <w:bookmarkStart w:id="128" w:name="ref-dunn2013"/>
+    <w:bookmarkEnd w:id="128"/>
+    <w:bookmarkStart w:id="130" w:name="ref-dunn2013"/>
     <w:p>
       <w:pPr>
         <w:pStyle w:val="Bibliography"/>
@@ -6724,7 +6935,7 @@
       <w:r>
         <w:t xml:space="preserve"> </w:t>
       </w:r>
-      <w:hyperlink r:id="rId127">
+      <w:hyperlink r:id="rId129">
         <w:r>
           <w:rPr>
             <w:rStyle w:val="Hyperlink"/>
@@ -6742,8 +6953,8 @@
         <w:t xml:space="preserve">. GSA Bulletin 125:539–555.</w:t>
       </w:r>
     </w:p>
-    <w:bookmarkEnd w:id="128"/>
-    <w:bookmarkStart w:id="130" w:name="ref-esteve2025"/>
+    <w:bookmarkEnd w:id="130"/>
+    <w:bookmarkStart w:id="132" w:name="ref-esteve2025"/>
     <w:p>
       <w:pPr>
         <w:pStyle w:val="Bibliography"/>
@@ -6754,7 +6965,7 @@
       <w:r>
         <w:t xml:space="preserve"> </w:t>
       </w:r>
-      <w:hyperlink r:id="rId129">
+      <w:hyperlink r:id="rId131">
         <w:r>
           <w:rPr>
             <w:rStyle w:val="Hyperlink"/>
@@ -6766,8 +6977,8 @@
         <w:t xml:space="preserve">. Proceedings of the Royal Society B: Biological Sciences 292:20252245.</w:t>
       </w:r>
     </w:p>
-    <w:bookmarkEnd w:id="130"/>
-    <w:bookmarkStart w:id="132" w:name="ref-etienne2011"/>
+    <w:bookmarkEnd w:id="132"/>
+    <w:bookmarkStart w:id="134" w:name="ref-etienne2011"/>
     <w:p>
       <w:pPr>
         <w:pStyle w:val="Bibliography"/>
@@ -6778,7 +6989,7 @@
       <w:r>
         <w:t xml:space="preserve"> </w:t>
       </w:r>
-      <w:hyperlink r:id="rId131">
+      <w:hyperlink r:id="rId133">
         <w:r>
           <w:rPr>
             <w:rStyle w:val="Hyperlink"/>
@@ -6790,8 +7001,8 @@
         <w:t xml:space="preserve">. Proceedings of the Royal Society B: Biological Sciences 279:1300–1309.</w:t>
       </w:r>
     </w:p>
-    <w:bookmarkEnd w:id="132"/>
-    <w:bookmarkStart w:id="134" w:name="ref-faurby2016"/>
+    <w:bookmarkEnd w:id="134"/>
+    <w:bookmarkStart w:id="136" w:name="ref-faurby2016"/>
     <w:p>
       <w:pPr>
         <w:pStyle w:val="Bibliography"/>
@@ -6802,7 +7013,7 @@
       <w:r>
         <w:t xml:space="preserve"> </w:t>
       </w:r>
-      <w:hyperlink r:id="rId133">
+      <w:hyperlink r:id="rId135">
         <w:r>
           <w:rPr>
             <w:rStyle w:val="Hyperlink"/>
@@ -6814,8 +7025,8 @@
         <w:t xml:space="preserve">. The American Naturalist 187:812–820.</w:t>
       </w:r>
     </w:p>
-    <w:bookmarkEnd w:id="134"/>
-    <w:bookmarkStart w:id="136" w:name="ref-fernicola2019"/>
+    <w:bookmarkEnd w:id="136"/>
+    <w:bookmarkStart w:id="138" w:name="ref-fernicola2019"/>
     <w:p>
       <w:pPr>
         <w:pStyle w:val="Bibliography"/>
@@ -6826,7 +7037,7 @@
       <w:r>
         <w:t xml:space="preserve"> </w:t>
       </w:r>
-      <w:hyperlink r:id="rId135">
+      <w:hyperlink r:id="rId137">
         <w:r>
           <w:rPr>
             <w:rStyle w:val="Hyperlink"/>
@@ -6844,8 +7055,8 @@
         <w:t xml:space="preserve">. Publicación Electrónica de la Asociación Paleontológica Argentina 19.</w:t>
       </w:r>
     </w:p>
-    <w:bookmarkEnd w:id="136"/>
-    <w:bookmarkStart w:id="138" w:name="ref-flannery-sutherland2022"/>
+    <w:bookmarkEnd w:id="138"/>
+    <w:bookmarkStart w:id="140" w:name="ref-flannery-sutherland2022"/>
     <w:p>
       <w:pPr>
         <w:pStyle w:val="Bibliography"/>
@@ -6856,7 +7067,7 @@
       <w:r>
         <w:t xml:space="preserve"> </w:t>
       </w:r>
-      <w:hyperlink r:id="rId137">
+      <w:hyperlink r:id="rId139">
         <w:r>
           <w:rPr>
             <w:rStyle w:val="Hyperlink"/>
@@ -6868,8 +7079,8 @@
         <w:t xml:space="preserve">. Nature Communications 13:2751.</w:t>
       </w:r>
     </w:p>
-    <w:bookmarkEnd w:id="138"/>
-    <w:bookmarkStart w:id="140" w:name="ref-foote1993"/>
+    <w:bookmarkEnd w:id="140"/>
+    <w:bookmarkStart w:id="142" w:name="ref-foote1993"/>
     <w:p>
       <w:pPr>
         <w:pStyle w:val="Bibliography"/>
@@ -6880,7 +7091,7 @@
       <w:r>
         <w:t xml:space="preserve"> </w:t>
       </w:r>
-      <w:hyperlink r:id="rId139">
+      <w:hyperlink r:id="rId141">
         <w:r>
           <w:rPr>
             <w:rStyle w:val="Hyperlink"/>
@@ -6892,19 +7103,43 @@
         <w:t xml:space="preserve">. Paleobiology 19:185–204.</w:t>
       </w:r>
     </w:p>
-    <w:bookmarkEnd w:id="140"/>
-    <w:bookmarkStart w:id="142" w:name="ref-foote1997"/>
+    <w:bookmarkEnd w:id="142"/>
+    <w:bookmarkStart w:id="144" w:name="ref-foote2007"/>
     <w:p>
       <w:pPr>
         <w:pStyle w:val="Bibliography"/>
       </w:pPr>
       <w:r>
+        <w:t xml:space="preserve">Foote, M. 2007.</w:t>
+      </w:r>
+      <w:r>
+        <w:t xml:space="preserve"> </w:t>
+      </w:r>
+      <w:hyperlink r:id="rId143">
+        <w:r>
+          <w:rPr>
+            <w:rStyle w:val="Hyperlink"/>
+          </w:rPr>
+          <w:t xml:space="preserve">Symmetric waxing and waning of marine invertebrate genera</w:t>
+        </w:r>
+      </w:hyperlink>
+      <w:r>
+        <w:t xml:space="preserve">. Paleobiology 33:517–529.</w:t>
+      </w:r>
+    </w:p>
+    <w:bookmarkEnd w:id="144"/>
+    <w:bookmarkStart w:id="146" w:name="ref-foote1997"/>
+    <w:p>
+      <w:pPr>
+        <w:pStyle w:val="Bibliography"/>
+      </w:pPr>
+      <w:r>
         <w:t xml:space="preserve">Foote, M. 1997.</w:t>
       </w:r>
       <w:r>
         <w:t xml:space="preserve"> </w:t>
       </w:r>
-      <w:hyperlink r:id="rId141">
+      <w:hyperlink r:id="rId145">
         <w:r>
           <w:rPr>
             <w:rStyle w:val="Hyperlink"/>
@@ -6916,8 +7151,8 @@
         <w:t xml:space="preserve">. Annual Review of Ecology, Evolution, and Systematics 28:129–152.</w:t>
       </w:r>
     </w:p>
-    <w:bookmarkEnd w:id="142"/>
-    <w:bookmarkStart w:id="144" w:name="ref-guayasamin2024"/>
+    <w:bookmarkEnd w:id="146"/>
+    <w:bookmarkStart w:id="148" w:name="ref-guayasamin2024"/>
     <w:p>
       <w:pPr>
         <w:pStyle w:val="Bibliography"/>
@@ -6928,7 +7163,7 @@
       <w:r>
         <w:t xml:space="preserve"> </w:t>
       </w:r>
-      <w:hyperlink r:id="rId143">
+      <w:hyperlink r:id="rId147">
         <w:r>
           <w:rPr>
             <w:rStyle w:val="Hyperlink"/>
@@ -6940,8 +7175,8 @@
         <w:t xml:space="preserve">. Acta Amazonica 54:e54bc21360.</w:t>
       </w:r>
     </w:p>
-    <w:bookmarkEnd w:id="144"/>
-    <w:bookmarkStart w:id="146" w:name="ref-hagen2018"/>
+    <w:bookmarkEnd w:id="148"/>
+    <w:bookmarkStart w:id="150" w:name="ref-hagen2018"/>
     <w:p>
       <w:pPr>
         <w:pStyle w:val="Bibliography"/>
@@ -6952,7 +7187,7 @@
       <w:r>
         <w:t xml:space="preserve"> </w:t>
       </w:r>
-      <w:hyperlink r:id="rId145">
+      <w:hyperlink r:id="rId149">
         <w:r>
           <w:rPr>
             <w:rStyle w:val="Hyperlink"/>
@@ -6964,8 +7199,8 @@
         <w:t xml:space="preserve">. Systematic Biology 67:458–474.</w:t>
       </w:r>
     </w:p>
-    <w:bookmarkEnd w:id="146"/>
-    <w:bookmarkStart w:id="148" w:name="ref-hauffe2024"/>
+    <w:bookmarkEnd w:id="150"/>
+    <w:bookmarkStart w:id="152" w:name="ref-hauffe2024"/>
     <w:p>
       <w:pPr>
         <w:pStyle w:val="Bibliography"/>
@@ -6976,7 +7211,7 @@
       <w:r>
         <w:t xml:space="preserve"> </w:t>
       </w:r>
-      <w:hyperlink r:id="rId147">
+      <w:hyperlink r:id="rId151">
         <w:r>
           <w:rPr>
             <w:rStyle w:val="Hyperlink"/>
@@ -6988,8 +7223,8 @@
         <w:t xml:space="preserve">. Science Advances 10:eadl2643. American Association for the Advancement of Science.</w:t>
       </w:r>
     </w:p>
-    <w:bookmarkEnd w:id="148"/>
-    <w:bookmarkStart w:id="150" w:name="ref-hernández2005"/>
+    <w:bookmarkEnd w:id="152"/>
+    <w:bookmarkStart w:id="154" w:name="ref-hernández2005"/>
     <w:p>
       <w:pPr>
         <w:pStyle w:val="Bibliography"/>
@@ -7000,7 +7235,7 @@
       <w:r>
         <w:t xml:space="preserve"> </w:t>
       </w:r>
-      <w:hyperlink r:id="rId149">
+      <w:hyperlink r:id="rId153">
         <w:r>
           <w:rPr>
             <w:rStyle w:val="Hyperlink"/>
@@ -7012,18 +7247,42 @@
         <w:t xml:space="preserve">. Journal of South American Earth Sciences 19:495–512.</w:t>
       </w:r>
     </w:p>
-    <w:bookmarkEnd w:id="150"/>
-    <w:bookmarkStart w:id="151" w:name="ref-homerocamacho1967"/>
+    <w:bookmarkEnd w:id="154"/>
+    <w:bookmarkStart w:id="156" w:name="ref-hohmann2019"/>
     <w:p>
       <w:pPr>
         <w:pStyle w:val="Bibliography"/>
       </w:pPr>
       <w:r>
+        <w:t xml:space="preserve">Hohmann, N., and E. Jarochowska. 2019.</w:t>
+      </w:r>
+      <w:r>
+        <w:t xml:space="preserve"> </w:t>
+      </w:r>
+      <w:hyperlink r:id="rId155">
+        <w:r>
+          <w:rPr>
+            <w:rStyle w:val="Hyperlink"/>
+          </w:rPr>
+          <w:t xml:space="preserve">Enforced symmetry: the necessity of symmetric waxing and waning</w:t>
+        </w:r>
+      </w:hyperlink>
+      <w:r>
+        <w:t xml:space="preserve">. PeerJ 7:e8011.</w:t>
+      </w:r>
+    </w:p>
+    <w:bookmarkEnd w:id="156"/>
+    <w:bookmarkStart w:id="157" w:name="ref-homerocamacho1967"/>
+    <w:p>
+      <w:pPr>
+        <w:pStyle w:val="Bibliography"/>
+      </w:pPr>
+      <w:r>
         <w:t xml:space="preserve">Homero Camacho, H. 1967. Las transgresiones del cretácico superior y terciario de la argentina. Revista de la Asociación Geológica Argentina 22:253–280.</w:t>
       </w:r>
     </w:p>
-    <w:bookmarkEnd w:id="151"/>
-    <w:bookmarkStart w:id="153" w:name="ref-hoorn2022"/>
+    <w:bookmarkEnd w:id="157"/>
+    <w:bookmarkStart w:id="159" w:name="ref-hoorn2022"/>
     <w:p>
       <w:pPr>
         <w:pStyle w:val="Bibliography"/>
@@ -7034,7 +7293,7 @@
       <w:r>
         <w:t xml:space="preserve"> </w:t>
       </w:r>
-      <w:hyperlink r:id="rId152">
+      <w:hyperlink r:id="rId158">
         <w:r>
           <w:rPr>
             <w:rStyle w:val="Hyperlink"/>
@@ -7046,8 +7305,8 @@
         <w:t xml:space="preserve">. Botanical Journal of the Linnean Society 199:25–35.</w:t>
       </w:r>
     </w:p>
-    <w:bookmarkEnd w:id="153"/>
-    <w:bookmarkStart w:id="155" w:name="ref-hoorn1995"/>
+    <w:bookmarkEnd w:id="159"/>
+    <w:bookmarkStart w:id="161" w:name="ref-hoorn1995"/>
     <w:p>
       <w:pPr>
         <w:pStyle w:val="Bibliography"/>
@@ -7058,7 +7317,7 @@
       <w:r>
         <w:t xml:space="preserve"> </w:t>
       </w:r>
-      <w:hyperlink r:id="rId154">
+      <w:hyperlink r:id="rId160">
         <w:r>
           <w:rPr>
             <w:rStyle w:val="Hyperlink"/>
@@ -7070,8 +7329,8 @@
         <w:t xml:space="preserve">. Geology 23:237.</w:t>
       </w:r>
     </w:p>
-    <w:bookmarkEnd w:id="155"/>
-    <w:bookmarkStart w:id="157" w:name="ref-hoorn2010"/>
+    <w:bookmarkEnd w:id="161"/>
+    <w:bookmarkStart w:id="163" w:name="ref-hoorn2010"/>
     <w:p>
       <w:pPr>
         <w:pStyle w:val="Bibliography"/>
@@ -7082,7 +7341,7 @@
       <w:r>
         <w:t xml:space="preserve"> </w:t>
       </w:r>
-      <w:hyperlink r:id="rId156">
+      <w:hyperlink r:id="rId162">
         <w:r>
           <w:rPr>
             <w:rStyle w:val="Hyperlink"/>
@@ -7094,8 +7353,8 @@
         <w:t xml:space="preserve">. Science 330:927–931.</w:t>
       </w:r>
     </w:p>
-    <w:bookmarkEnd w:id="157"/>
-    <w:bookmarkStart w:id="159" w:name="ref-hullot2025"/>
+    <w:bookmarkEnd w:id="163"/>
+    <w:bookmarkStart w:id="165" w:name="ref-hullot2025"/>
     <w:p>
       <w:pPr>
         <w:pStyle w:val="Bibliography"/>
@@ -7106,7 +7365,7 @@
       <w:r>
         <w:t xml:space="preserve"> </w:t>
       </w:r>
-      <w:hyperlink r:id="rId158">
+      <w:hyperlink r:id="rId164">
         <w:r>
           <w:rPr>
             <w:rStyle w:val="Hyperlink"/>
@@ -7118,8 +7377,8 @@
         <w:t xml:space="preserve">. Palaeogeography, Palaeoclimatology, Palaeoecology 675:113076.</w:t>
       </w:r>
     </w:p>
-    <w:bookmarkEnd w:id="159"/>
-    <w:bookmarkStart w:id="160" w:name="ref-janis1988"/>
+    <w:bookmarkEnd w:id="165"/>
+    <w:bookmarkStart w:id="166" w:name="ref-janis1988"/>
     <w:p>
       <w:pPr>
         <w:pStyle w:val="Bibliography"/>
@@ -7128,8 +7387,8 @@
         <w:t xml:space="preserve">Janis, C. M. 1988. An estimation of tooth volume and hypsodonty indices in ungulate mammals, and the correlation of these factors with dietary preferences. Mémoires du Moséum d’Histoire Naturelle de Paris 367–387.</w:t>
       </w:r>
     </w:p>
-    <w:bookmarkEnd w:id="160"/>
-    <w:bookmarkStart w:id="162" w:name="ref-jaramillo2017"/>
+    <w:bookmarkEnd w:id="166"/>
+    <w:bookmarkStart w:id="168" w:name="ref-jaramillo2017"/>
     <w:p>
       <w:pPr>
         <w:pStyle w:val="Bibliography"/>
@@ -7140,7 +7399,7 @@
       <w:r>
         <w:t xml:space="preserve"> </w:t>
       </w:r>
-      <w:hyperlink r:id="rId161">
+      <w:hyperlink r:id="rId167">
         <w:r>
           <w:rPr>
             <w:rStyle w:val="Hyperlink"/>
@@ -7152,8 +7411,8 @@
         <w:t xml:space="preserve">. Science Advances 3:e1601693.</w:t>
       </w:r>
     </w:p>
-    <w:bookmarkEnd w:id="162"/>
-    <w:bookmarkStart w:id="164" w:name="ref-jardine2012"/>
+    <w:bookmarkEnd w:id="168"/>
+    <w:bookmarkStart w:id="170" w:name="ref-jardine2012"/>
     <w:p>
       <w:pPr>
         <w:pStyle w:val="Bibliography"/>
@@ -7164,7 +7423,7 @@
       <w:r>
         <w:t xml:space="preserve"> </w:t>
       </w:r>
-      <w:hyperlink r:id="rId163">
+      <w:hyperlink r:id="rId169">
         <w:r>
           <w:rPr>
             <w:rStyle w:val="Hyperlink"/>
@@ -7176,19 +7435,43 @@
         <w:t xml:space="preserve">. Palaeogeography, Palaeoclimatology, Palaeoecology 365-366:1–10.</w:t>
       </w:r>
     </w:p>
-    <w:bookmarkEnd w:id="164"/>
-    <w:bookmarkStart w:id="166" w:name="ref-lehtonen2017"/>
+    <w:bookmarkEnd w:id="170"/>
+    <w:bookmarkStart w:id="172" w:name="ref-kass1995"/>
     <w:p>
       <w:pPr>
         <w:pStyle w:val="Bibliography"/>
       </w:pPr>
       <w:r>
+        <w:t xml:space="preserve">Kass, R. E., and A. E. Raftery. 1995.</w:t>
+      </w:r>
+      <w:r>
+        <w:t xml:space="preserve"> </w:t>
+      </w:r>
+      <w:hyperlink r:id="rId171">
+        <w:r>
+          <w:rPr>
+            <w:rStyle w:val="Hyperlink"/>
+          </w:rPr>
+          <w:t xml:space="preserve">Bayes factors</w:t>
+        </w:r>
+      </w:hyperlink>
+      <w:r>
+        <w:t xml:space="preserve">. Journal of the American Statistical Association 90:773–795.</w:t>
+      </w:r>
+    </w:p>
+    <w:bookmarkEnd w:id="172"/>
+    <w:bookmarkStart w:id="174" w:name="ref-lehtonen2017"/>
+    <w:p>
+      <w:pPr>
+        <w:pStyle w:val="Bibliography"/>
+      </w:pPr>
+      <w:r>
         <w:t xml:space="preserve">Lehtonen, S., D. Silvestro, D. N. Karger, C. Scotese, H. Tuomisto, M. Kessler, C. Peña, N. Wahlberg, and A. Antonelli. 2017.</w:t>
       </w:r>
       <w:r>
         <w:t xml:space="preserve"> </w:t>
       </w:r>
-      <w:hyperlink r:id="rId165">
+      <w:hyperlink r:id="rId173">
         <w:r>
           <w:rPr>
             <w:rStyle w:val="Hyperlink"/>
@@ -7200,8 +7483,8 @@
         <w:t xml:space="preserve">. Scientific Reports 7:4831.</w:t>
       </w:r>
     </w:p>
-    <w:bookmarkEnd w:id="166"/>
-    <w:bookmarkStart w:id="168" w:name="ref-liow2008"/>
+    <w:bookmarkEnd w:id="174"/>
+    <w:bookmarkStart w:id="176" w:name="ref-liow2008"/>
     <w:p>
       <w:pPr>
         <w:pStyle w:val="Bibliography"/>
@@ -7212,7 +7495,7 @@
       <w:r>
         <w:t xml:space="preserve"> </w:t>
       </w:r>
-      <w:hyperlink r:id="rId167">
+      <w:hyperlink r:id="rId175">
         <w:r>
           <w:rPr>
             <w:rStyle w:val="Hyperlink"/>
@@ -7224,8 +7507,8 @@
         <w:t xml:space="preserve">. Proceedings of the National Academy of Sciences 105:6097–6102.</w:t>
       </w:r>
     </w:p>
-    <w:bookmarkEnd w:id="168"/>
-    <w:bookmarkStart w:id="170" w:name="ref-liow2010"/>
+    <w:bookmarkEnd w:id="176"/>
+    <w:bookmarkStart w:id="178" w:name="ref-liow2010"/>
     <w:p>
       <w:pPr>
         <w:pStyle w:val="Bibliography"/>
@@ -7236,7 +7519,7 @@
       <w:r>
         <w:t xml:space="preserve"> </w:t>
       </w:r>
-      <w:hyperlink r:id="rId169">
+      <w:hyperlink r:id="rId177">
         <w:r>
           <w:rPr>
             <w:rStyle w:val="Hyperlink"/>
@@ -7248,8 +7531,8 @@
         <w:t xml:space="preserve"> Systematic Biology 59:646–659.</w:t>
       </w:r>
     </w:p>
-    <w:bookmarkEnd w:id="170"/>
-    <w:bookmarkStart w:id="172" w:name="ref-lomolino2005"/>
+    <w:bookmarkEnd w:id="178"/>
+    <w:bookmarkStart w:id="180" w:name="ref-lomolino2005"/>
     <w:p>
       <w:pPr>
         <w:pStyle w:val="Bibliography"/>
@@ -7260,7 +7543,7 @@
       <w:r>
         <w:t xml:space="preserve"> </w:t>
       </w:r>
-      <w:hyperlink r:id="rId171">
+      <w:hyperlink r:id="rId179">
         <w:r>
           <w:rPr>
             <w:rStyle w:val="Hyperlink"/>
@@ -7272,8 +7555,8 @@
         <w:t xml:space="preserve">. Journal of Biogeography 32:1683–1699.</w:t>
       </w:r>
     </w:p>
-    <w:bookmarkEnd w:id="172"/>
-    <w:bookmarkStart w:id="174" w:name="ref-macfadden2000"/>
+    <w:bookmarkEnd w:id="180"/>
+    <w:bookmarkStart w:id="182" w:name="ref-macfadden2000"/>
     <w:p>
       <w:pPr>
         <w:pStyle w:val="Bibliography"/>
@@ -7284,7 +7567,7 @@
       <w:r>
         <w:t xml:space="preserve"> </w:t>
       </w:r>
-      <w:hyperlink r:id="rId173">
+      <w:hyperlink r:id="rId181">
         <w:r>
           <w:rPr>
             <w:rStyle w:val="Hyperlink"/>
@@ -7296,8 +7579,8 @@
         <w:t xml:space="preserve">. Annual Review of Ecology and Systematics 31:33–59.</w:t>
       </w:r>
     </w:p>
-    <w:bookmarkEnd w:id="174"/>
-    <w:bookmarkStart w:id="176" w:name="ref-macphee2011"/>
+    <w:bookmarkEnd w:id="182"/>
+    <w:bookmarkStart w:id="184" w:name="ref-macphee2011"/>
     <w:p>
       <w:pPr>
         <w:pStyle w:val="Bibliography"/>
@@ -7308,7 +7591,7 @@
       <w:r>
         <w:t xml:space="preserve"> </w:t>
       </w:r>
-      <w:hyperlink r:id="rId175">
+      <w:hyperlink r:id="rId183">
         <w:r>
           <w:rPr>
             <w:rStyle w:val="Hyperlink"/>
@@ -7320,8 +7603,8 @@
         <w:t xml:space="preserve">. Bulletin of the American Museum of Natural History 2011:1–70.</w:t>
       </w:r>
     </w:p>
-    <w:bookmarkEnd w:id="176"/>
-    <w:bookmarkStart w:id="178" w:name="ref-marion_bioluminescence_2025"/>
+    <w:bookmarkEnd w:id="184"/>
+    <w:bookmarkStart w:id="186" w:name="ref-marion_bioluminescence_2025"/>
     <w:p>
       <w:pPr>
         <w:pStyle w:val="Bibliography"/>
@@ -7332,7 +7615,7 @@
       <w:r>
         <w:t xml:space="preserve"> </w:t>
       </w:r>
-      <w:hyperlink r:id="rId177">
+      <w:hyperlink r:id="rId185">
         <w:r>
           <w:rPr>
             <w:rStyle w:val="Hyperlink"/>
@@ -7344,8 +7627,8 @@
         <w:t xml:space="preserve">. Proceedings of the Royal Society B: Biological Sciences 292:20242932. Royal Society.</w:t>
       </w:r>
     </w:p>
-    <w:bookmarkEnd w:id="178"/>
-    <w:bookmarkStart w:id="180" w:name="ref-marivaux2022"/>
+    <w:bookmarkEnd w:id="186"/>
+    <w:bookmarkStart w:id="188" w:name="ref-marivaux2022"/>
     <w:p>
       <w:pPr>
         <w:pStyle w:val="Bibliography"/>
@@ -7356,7 +7639,7 @@
       <w:r>
         <w:t xml:space="preserve"> </w:t>
       </w:r>
-      <w:hyperlink r:id="rId179">
+      <w:hyperlink r:id="rId187">
         <w:r>
           <w:rPr>
             <w:rStyle w:val="Hyperlink"/>
@@ -7368,8 +7651,8 @@
         <w:t xml:space="preserve">. Journal of Mammalian Evolution 29:969–995.</w:t>
       </w:r>
     </w:p>
-    <w:bookmarkEnd w:id="180"/>
-    <w:bookmarkStart w:id="182" w:name="ref-marivaux_early_2020"/>
+    <w:bookmarkEnd w:id="188"/>
+    <w:bookmarkStart w:id="190" w:name="ref-marivaux_early_2020"/>
     <w:p>
       <w:pPr>
         <w:pStyle w:val="Bibliography"/>
@@ -7380,7 +7663,7 @@
       <w:r>
         <w:t xml:space="preserve"> </w:t>
       </w:r>
-      <w:hyperlink r:id="rId181">
+      <w:hyperlink r:id="rId189">
         <w:r>
           <w:rPr>
             <w:rStyle w:val="Hyperlink"/>
@@ -7392,8 +7675,8 @@
         <w:t xml:space="preserve">. Proceedings of the Royal Society B: Biological Sciences 287:20192806.</w:t>
       </w:r>
     </w:p>
-    <w:bookmarkEnd w:id="182"/>
-    <w:bookmarkStart w:id="184" w:name="ref-marshall1982"/>
+    <w:bookmarkEnd w:id="190"/>
+    <w:bookmarkStart w:id="192" w:name="ref-marshall1982"/>
     <w:p>
       <w:pPr>
         <w:pStyle w:val="Bibliography"/>
@@ -7404,7 +7687,7 @@
       <w:r>
         <w:t xml:space="preserve"> </w:t>
       </w:r>
-      <w:hyperlink r:id="rId183">
+      <w:hyperlink r:id="rId191">
         <w:r>
           <w:rPr>
             <w:rStyle w:val="Hyperlink"/>
@@ -7416,8 +7699,8 @@
         <w:t xml:space="preserve">. Science 215:1351–1357.</w:t>
       </w:r>
     </w:p>
-    <w:bookmarkEnd w:id="184"/>
-    <w:bookmarkStart w:id="186" w:name="ref-mcfarlane1998"/>
+    <w:bookmarkEnd w:id="192"/>
+    <w:bookmarkStart w:id="194" w:name="ref-mcfarlane1998"/>
     <w:p>
       <w:pPr>
         <w:pStyle w:val="Bibliography"/>
@@ -7428,7 +7711,7 @@
       <w:r>
         <w:t xml:space="preserve"> </w:t>
       </w:r>
-      <w:hyperlink r:id="rId185">
+      <w:hyperlink r:id="rId193">
         <w:r>
           <w:rPr>
             <w:rStyle w:val="Hyperlink"/>
@@ -7440,8 +7723,8 @@
         <w:t xml:space="preserve">. Quaternary Research 50:80–89.</w:t>
       </w:r>
     </w:p>
-    <w:bookmarkEnd w:id="186"/>
-    <w:bookmarkStart w:id="188" w:name="ref-meiri2007"/>
+    <w:bookmarkEnd w:id="194"/>
+    <w:bookmarkStart w:id="196" w:name="ref-meiri2007"/>
     <w:p>
       <w:pPr>
         <w:pStyle w:val="Bibliography"/>
@@ -7452,7 +7735,7 @@
       <w:r>
         <w:t xml:space="preserve"> </w:t>
       </w:r>
-      <w:hyperlink r:id="rId187">
+      <w:hyperlink r:id="rId195">
         <w:r>
           <w:rPr>
             <w:rStyle w:val="Hyperlink"/>
@@ -7464,8 +7747,8 @@
         <w:t xml:space="preserve"> Proceedings of the Royal Society B: Biological Sciences 275:141–148.</w:t>
       </w:r>
     </w:p>
-    <w:bookmarkEnd w:id="188"/>
-    <w:bookmarkStart w:id="190" w:name="ref-miller2020"/>
+    <w:bookmarkEnd w:id="196"/>
+    <w:bookmarkStart w:id="198" w:name="ref-miller2020"/>
     <w:p>
       <w:pPr>
         <w:pStyle w:val="Bibliography"/>
@@ -7476,7 +7759,7 @@
       <w:r>
         <w:t xml:space="preserve"> </w:t>
       </w:r>
-      <w:hyperlink r:id="rId189">
+      <w:hyperlink r:id="rId197">
         <w:r>
           <w:rPr>
             <w:rStyle w:val="Hyperlink"/>
@@ -7488,8 +7771,8 @@
         <w:t xml:space="preserve">. Science Advances 6:eaaz1346.</w:t>
       </w:r>
     </w:p>
-    <w:bookmarkEnd w:id="190"/>
-    <w:bookmarkStart w:id="192" w:name="ref-mones1982"/>
+    <w:bookmarkEnd w:id="198"/>
+    <w:bookmarkStart w:id="200" w:name="ref-mones1982"/>
     <w:p>
       <w:pPr>
         <w:pStyle w:val="Bibliography"/>
@@ -7500,7 +7783,7 @@
       <w:r>
         <w:t xml:space="preserve"> </w:t>
       </w:r>
-      <w:hyperlink r:id="rId191">
+      <w:hyperlink r:id="rId199">
         <w:r>
           <w:rPr>
             <w:rStyle w:val="Hyperlink"/>
@@ -7512,19 +7795,43 @@
         <w:t xml:space="preserve"> Paläontologische Zeitschrift 56:107–111.</w:t>
       </w:r>
     </w:p>
-    <w:bookmarkEnd w:id="192"/>
-    <w:bookmarkStart w:id="194" w:name="ref-muñoz2023"/>
+    <w:bookmarkEnd w:id="200"/>
+    <w:bookmarkStart w:id="202" w:name="ref-morlon2024"/>
     <w:p>
       <w:pPr>
         <w:pStyle w:val="Bibliography"/>
       </w:pPr>
       <w:r>
+        <w:t xml:space="preserve">Morlon, H., J. Andréoletti, J. Barido-Sottani, S. Lambert, B. Perez-Lamarque, I. Quintero, V. Senderov, and P. Veron. 2024. Phylogenetic Insights into Diversification. Annual Review of Ecology, Evolution, and Systematics, doi:</w:t>
+      </w:r>
+      <w:r>
+        <w:t xml:space="preserve"> </w:t>
+      </w:r>
+      <w:hyperlink r:id="rId201">
+        <w:r>
+          <w:rPr>
+            <w:rStyle w:val="Hyperlink"/>
+          </w:rPr>
+          <w:t xml:space="preserve">10.1146/annurev-ecolsys-102722-020508</w:t>
+        </w:r>
+      </w:hyperlink>
+      <w:r>
+        <w:t xml:space="preserve">.</w:t>
+      </w:r>
+    </w:p>
+    <w:bookmarkEnd w:id="202"/>
+    <w:bookmarkStart w:id="204" w:name="ref-muñoz2023"/>
+    <w:p>
+      <w:pPr>
+        <w:pStyle w:val="Bibliography"/>
+      </w:pPr>
+      <w:r>
         <w:t xml:space="preserve">Muñoz, C. O. R., R. Bonini, S. Hemming, M. Cenizo, U. F. J. Pardiñas, and F. J. Prevosti. 2023.</w:t>
       </w:r>
       <w:r>
         <w:t xml:space="preserve"> </w:t>
       </w:r>
-      <w:hyperlink r:id="rId193">
+      <w:hyperlink r:id="rId203">
         <w:r>
           <w:rPr>
             <w:rStyle w:val="Hyperlink"/>
@@ -7572,8 +7879,8 @@
         <w:t xml:space="preserve">. Ameghiniana 60:465–491.</w:t>
       </w:r>
     </w:p>
-    <w:bookmarkEnd w:id="194"/>
-    <w:bookmarkStart w:id="196" w:name="ref-neige2026"/>
+    <w:bookmarkEnd w:id="204"/>
+    <w:bookmarkStart w:id="206" w:name="ref-neige2026"/>
     <w:p>
       <w:pPr>
         <w:pStyle w:val="Bibliography"/>
@@ -7584,7 +7891,7 @@
       <w:r>
         <w:t xml:space="preserve"> </w:t>
       </w:r>
-      <w:hyperlink r:id="rId195">
+      <w:hyperlink r:id="rId205">
         <w:r>
           <w:rPr>
             <w:rStyle w:val="Hyperlink"/>
@@ -7596,8 +7903,8 @@
         <w:t xml:space="preserve">. Paleobiology 1–17.</w:t>
       </w:r>
     </w:p>
-    <w:bookmarkEnd w:id="196"/>
-    <w:bookmarkStart w:id="198" w:name="ref-ogg2020"/>
+    <w:bookmarkEnd w:id="206"/>
+    <w:bookmarkStart w:id="208" w:name="ref-ogg2020"/>
     <w:p>
       <w:pPr>
         <w:pStyle w:val="Bibliography"/>
@@ -7608,7 +7915,7 @@
       <w:r>
         <w:t xml:space="preserve"> </w:t>
       </w:r>
-      <w:hyperlink r:id="rId197">
+      <w:hyperlink r:id="rId207">
         <w:r>
           <w:rPr>
             <w:rStyle w:val="Hyperlink"/>
@@ -7633,8 +7940,8 @@
         <w:t xml:space="preserve">. Elsevier.</w:t>
       </w:r>
     </w:p>
-    <w:bookmarkEnd w:id="198"/>
-    <w:bookmarkStart w:id="200" w:name="ref-paiva2026"/>
+    <w:bookmarkEnd w:id="208"/>
+    <w:bookmarkStart w:id="210" w:name="ref-paiva2026"/>
     <w:p>
       <w:pPr>
         <w:pStyle w:val="Bibliography"/>
@@ -7645,7 +7952,7 @@
       <w:r>
         <w:t xml:space="preserve"> </w:t>
       </w:r>
-      <w:hyperlink r:id="rId199">
+      <w:hyperlink r:id="rId209">
         <w:r>
           <w:rPr>
             <w:rStyle w:val="Hyperlink"/>
@@ -7657,8 +7964,8 @@
         <w:t xml:space="preserve">. Palaeontology.</w:t>
       </w:r>
     </w:p>
-    <w:bookmarkEnd w:id="200"/>
-    <w:bookmarkStart w:id="202" w:name="ref-palazzesi2012"/>
+    <w:bookmarkEnd w:id="210"/>
+    <w:bookmarkStart w:id="212" w:name="ref-palazzesi2012"/>
     <w:p>
       <w:pPr>
         <w:pStyle w:val="Bibliography"/>
@@ -7669,7 +7976,7 @@
       <w:r>
         <w:t xml:space="preserve"> </w:t>
       </w:r>
-      <w:hyperlink r:id="rId201">
+      <w:hyperlink r:id="rId211">
         <w:r>
           <w:rPr>
             <w:rStyle w:val="Hyperlink"/>
@@ -7681,8 +7988,8 @@
         <w:t xml:space="preserve">. Nature Communications 3:1294.</w:t>
       </w:r>
     </w:p>
-    <w:bookmarkEnd w:id="202"/>
-    <w:bookmarkStart w:id="203" w:name="ref-pascual1996"/>
+    <w:bookmarkEnd w:id="212"/>
+    <w:bookmarkStart w:id="213" w:name="ref-pascual1996"/>
     <w:p>
       <w:pPr>
         <w:pStyle w:val="Bibliography"/>
@@ -7691,8 +7998,8 @@
         <w:t xml:space="preserve">Pascual, R., E. Ortiz-Jaureguizar, and J. L. Prado. 1996. Land mammals: Paradigm for cenozoic south american geobiotic evolution.</w:t>
       </w:r>
     </w:p>
-    <w:bookmarkEnd w:id="203"/>
-    <w:bookmarkStart w:id="205" w:name="ref-patton2015"/>
+    <w:bookmarkEnd w:id="213"/>
+    <w:bookmarkStart w:id="215" w:name="ref-patton2015"/>
     <w:p>
       <w:pPr>
         <w:pStyle w:val="Bibliography"/>
@@ -7703,7 +8010,7 @@
       <w:r>
         <w:t xml:space="preserve"> </w:t>
       </w:r>
-      <w:hyperlink r:id="rId204">
+      <w:hyperlink r:id="rId214">
         <w:r>
           <w:rPr>
             <w:rStyle w:val="Hyperlink"/>
@@ -7715,8 +8022,8 @@
         <w:t xml:space="preserve">. University of Chicago Press, Chicago, IL.</w:t>
       </w:r>
     </w:p>
-    <w:bookmarkEnd w:id="205"/>
-    <w:bookmarkStart w:id="207" w:name="ref-pérez_new_2010"/>
+    <w:bookmarkEnd w:id="215"/>
+    <w:bookmarkStart w:id="217" w:name="ref-pérez_new_2010"/>
     <w:p>
       <w:pPr>
         <w:pStyle w:val="Bibliography"/>
@@ -7727,7 +8034,7 @@
       <w:r>
         <w:t xml:space="preserve"> </w:t>
       </w:r>
-      <w:hyperlink r:id="rId206">
+      <w:hyperlink r:id="rId216">
         <w:r>
           <w:rPr>
             <w:rStyle w:val="Hyperlink"/>
@@ -7739,8 +8046,8 @@
         <w:t xml:space="preserve">. Journal of Vertebrate Paleontology 30:1848–1859.</w:t>
       </w:r>
     </w:p>
-    <w:bookmarkEnd w:id="207"/>
-    <w:bookmarkStart w:id="209" w:name="ref-pimiento2019"/>
+    <w:bookmarkEnd w:id="217"/>
+    <w:bookmarkStart w:id="219" w:name="ref-pimiento2019"/>
     <w:p>
       <w:pPr>
         <w:pStyle w:val="Bibliography"/>
@@ -7751,7 +8058,7 @@
       <w:r>
         <w:t xml:space="preserve"> </w:t>
       </w:r>
-      <w:hyperlink r:id="rId208">
+      <w:hyperlink r:id="rId218">
         <w:r>
           <w:rPr>
             <w:rStyle w:val="Hyperlink"/>
@@ -7763,8 +8070,8 @@
         <w:t xml:space="preserve">. Evolution 73:588–599.</w:t>
       </w:r>
     </w:p>
-    <w:bookmarkEnd w:id="209"/>
-    <w:bookmarkStart w:id="211" w:name="ref-quental2013"/>
+    <w:bookmarkEnd w:id="219"/>
+    <w:bookmarkStart w:id="221" w:name="ref-quental2013"/>
     <w:p>
       <w:pPr>
         <w:pStyle w:val="Bibliography"/>
@@ -7775,7 +8082,7 @@
       <w:r>
         <w:t xml:space="preserve"> </w:t>
       </w:r>
-      <w:hyperlink r:id="rId210">
+      <w:hyperlink r:id="rId220">
         <w:r>
           <w:rPr>
             <w:rStyle w:val="Hyperlink"/>
@@ -7787,19 +8094,43 @@
         <w:t xml:space="preserve">. Science 341:290–292.</w:t>
       </w:r>
     </w:p>
-    <w:bookmarkEnd w:id="211"/>
-    <w:bookmarkStart w:id="213" w:name="ref-rasia_reappraisal_2018"/>
+    <w:bookmarkEnd w:id="221"/>
+    <w:bookmarkStart w:id="223" w:name="ref-quintero_loss_2025"/>
     <w:p>
       <w:pPr>
         <w:pStyle w:val="Bibliography"/>
       </w:pPr>
       <w:r>
+        <w:t xml:space="preserve">Quintero, I., J. Andréoletti, D. Silvestro, and H. Morlon. 2025.</w:t>
+      </w:r>
+      <w:r>
+        <w:t xml:space="preserve"> </w:t>
+      </w:r>
+      <w:hyperlink r:id="rId222">
+        <w:r>
+          <w:rPr>
+            <w:rStyle w:val="Hyperlink"/>
+          </w:rPr>
+          <w:t xml:space="preserve">Loss of macroevolutionary species fitness explains the rise and fall of clades</w:t>
+        </w:r>
+      </w:hyperlink>
+      <w:r>
+        <w:t xml:space="preserve">. Nat Ecol Evol 1–12. Nature Publishing Group.</w:t>
+      </w:r>
+    </w:p>
+    <w:bookmarkEnd w:id="223"/>
+    <w:bookmarkStart w:id="225" w:name="ref-rasia_reappraisal_2018"/>
+    <w:p>
+      <w:pPr>
+        <w:pStyle w:val="Bibliography"/>
+      </w:pPr>
+      <w:r>
         <w:t xml:space="preserve">Rasia, L. L., and A. M. Candela. 2018.</w:t>
       </w:r>
       <w:r>
         <w:t xml:space="preserve"> </w:t>
       </w:r>
-      <w:hyperlink r:id="rId212">
+      <w:hyperlink r:id="rId224">
         <w:r>
           <w:rPr>
             <w:rStyle w:val="Hyperlink"/>
@@ -7811,8 +8142,8 @@
         <w:t xml:space="preserve">. Historical Biology 30:486–495. Taylor &amp; Francis.</w:t>
       </w:r>
     </w:p>
-    <w:bookmarkEnd w:id="213"/>
-    <w:bookmarkStart w:id="215" w:name="ref-rasia_comprehensive_2021"/>
+    <w:bookmarkEnd w:id="225"/>
+    <w:bookmarkStart w:id="227" w:name="ref-rasia_comprehensive_2021"/>
     <w:p>
       <w:pPr>
         <w:pStyle w:val="Bibliography"/>
@@ -7823,7 +8154,7 @@
       <w:r>
         <w:t xml:space="preserve"> </w:t>
       </w:r>
-      <w:hyperlink r:id="rId214">
+      <w:hyperlink r:id="rId226">
         <w:r>
           <w:rPr>
             <w:rStyle w:val="Hyperlink"/>
@@ -7835,8 +8166,8 @@
         <w:t xml:space="preserve">. Journal of Anatomy 239:405–423.</w:t>
       </w:r>
     </w:p>
-    <w:bookmarkEnd w:id="215"/>
-    <w:bookmarkStart w:id="217" w:name="ref-rasia2024"/>
+    <w:bookmarkEnd w:id="227"/>
+    <w:bookmarkStart w:id="229" w:name="ref-rasia2024"/>
     <w:p>
       <w:pPr>
         <w:pStyle w:val="Bibliography"/>
@@ -7847,7 +8178,7 @@
       <w:r>
         <w:t xml:space="preserve"> </w:t>
       </w:r>
-      <w:hyperlink r:id="rId216">
+      <w:hyperlink r:id="rId228">
         <w:r>
           <w:rPr>
             <w:rStyle w:val="Hyperlink"/>
@@ -7859,8 +8190,8 @@
         <w:t xml:space="preserve">. Historical Biology 37:1902–1914.</w:t>
       </w:r>
     </w:p>
-    <w:bookmarkEnd w:id="217"/>
-    <w:bookmarkStart w:id="219" w:name="ref-rinderknecht2008"/>
+    <w:bookmarkEnd w:id="229"/>
+    <w:bookmarkStart w:id="231" w:name="ref-rinderknecht2008"/>
     <w:p>
       <w:pPr>
         <w:pStyle w:val="Bibliography"/>
@@ -7871,7 +8202,7 @@
       <w:r>
         <w:t xml:space="preserve"> </w:t>
       </w:r>
-      <w:hyperlink r:id="rId218">
+      <w:hyperlink r:id="rId230">
         <w:r>
           <w:rPr>
             <w:rStyle w:val="Hyperlink"/>
@@ -7883,8 +8214,8 @@
         <w:t xml:space="preserve">. Proceedings of the Royal Society B: Biological Sciences 275:923–928.</w:t>
       </w:r>
     </w:p>
-    <w:bookmarkEnd w:id="219"/>
-    <w:bookmarkStart w:id="221" w:name="ref-robinet2020"/>
+    <w:bookmarkEnd w:id="231"/>
+    <w:bookmarkStart w:id="233" w:name="ref-robinet2020"/>
     <w:p>
       <w:pPr>
         <w:pStyle w:val="Bibliography"/>
@@ -7895,7 +8226,7 @@
       <w:r>
         <w:t xml:space="preserve"> </w:t>
       </w:r>
-      <w:hyperlink r:id="rId220">
+      <w:hyperlink r:id="rId232">
         <w:r>
           <w:rPr>
             <w:rStyle w:val="Hyperlink"/>
@@ -7907,8 +8238,8 @@
         <w:t xml:space="preserve">. Journal of Mammalogy 101:386–402.</w:t>
       </w:r>
     </w:p>
-    <w:bookmarkEnd w:id="221"/>
-    <w:bookmarkStart w:id="223" w:name="ref-salas-gismondi2015"/>
+    <w:bookmarkEnd w:id="233"/>
+    <w:bookmarkStart w:id="235" w:name="ref-salas-gismondi2015"/>
     <w:p>
       <w:pPr>
         <w:pStyle w:val="Bibliography"/>
@@ -7919,7 +8250,7 @@
       <w:r>
         <w:t xml:space="preserve"> </w:t>
       </w:r>
-      <w:hyperlink r:id="rId222">
+      <w:hyperlink r:id="rId234">
         <w:r>
           <w:rPr>
             <w:rStyle w:val="Hyperlink"/>
@@ -7931,8 +8262,8 @@
         <w:t xml:space="preserve">. Proceedings of the Royal Society B: Biological Sciences 282:20142490.</w:t>
       </w:r>
     </w:p>
-    <w:bookmarkEnd w:id="223"/>
-    <w:bookmarkStart w:id="225" w:name="ref-sánchez-villagra2003"/>
+    <w:bookmarkEnd w:id="235"/>
+    <w:bookmarkStart w:id="237" w:name="ref-sánchez-villagra2003"/>
     <w:p>
       <w:pPr>
         <w:pStyle w:val="Bibliography"/>
@@ -7943,7 +8274,7 @@
       <w:r>
         <w:t xml:space="preserve"> </w:t>
       </w:r>
-      <w:hyperlink r:id="rId224">
+      <w:hyperlink r:id="rId236">
         <w:r>
           <w:rPr>
             <w:rStyle w:val="Hyperlink"/>
@@ -7955,8 +8286,8 @@
         <w:t xml:space="preserve">. Science 301:1708–1710.</w:t>
       </w:r>
     </w:p>
-    <w:bookmarkEnd w:id="225"/>
-    <w:bookmarkStart w:id="227" w:name="ref-sander2011"/>
+    <w:bookmarkEnd w:id="237"/>
+    <w:bookmarkStart w:id="239" w:name="ref-sander2011"/>
     <w:p>
       <w:pPr>
         <w:pStyle w:val="Bibliography"/>
@@ -7967,7 +8298,7 @@
       <w:r>
         <w:t xml:space="preserve"> </w:t>
       </w:r>
-      <w:hyperlink r:id="rId226">
+      <w:hyperlink r:id="rId238">
         <w:r>
           <w:rPr>
             <w:rStyle w:val="Hyperlink"/>
@@ -7979,8 +8310,8 @@
         <w:t xml:space="preserve">. Biological Reviews 86:117–155.</w:t>
       </w:r>
     </w:p>
-    <w:bookmarkEnd w:id="227"/>
-    <w:bookmarkStart w:id="229" w:name="ref-silvestro2015"/>
+    <w:bookmarkEnd w:id="239"/>
+    <w:bookmarkStart w:id="241" w:name="ref-silvestro2015"/>
     <w:p>
       <w:pPr>
         <w:pStyle w:val="Bibliography"/>
@@ -7991,7 +8322,7 @@
       <w:r>
         <w:t xml:space="preserve"> </w:t>
       </w:r>
-      <w:hyperlink r:id="rId228">
+      <w:hyperlink r:id="rId240">
         <w:r>
           <w:rPr>
             <w:rStyle w:val="Hyperlink"/>
@@ -8003,8 +8334,8 @@
         <w:t xml:space="preserve">. Proceedings of the National Academy of Sciences 112:8684–8689.</w:t>
       </w:r>
     </w:p>
-    <w:bookmarkEnd w:id="229"/>
-    <w:bookmarkStart w:id="231" w:name="ref-silvestro2019"/>
+    <w:bookmarkEnd w:id="241"/>
+    <w:bookmarkStart w:id="243" w:name="ref-silvestro2019"/>
     <w:p>
       <w:pPr>
         <w:pStyle w:val="Bibliography"/>
@@ -8015,7 +8346,7 @@
       <w:r>
         <w:t xml:space="preserve"> </w:t>
       </w:r>
-      <w:hyperlink r:id="rId230">
+      <w:hyperlink r:id="rId242">
         <w:r>
           <w:rPr>
             <w:rStyle w:val="Hyperlink"/>
@@ -8027,8 +8358,8 @@
         <w:t xml:space="preserve">. Paleobiology 45:546–570.</w:t>
       </w:r>
     </w:p>
-    <w:bookmarkEnd w:id="231"/>
-    <w:bookmarkStart w:id="233" w:name="ref-silvestro2014"/>
+    <w:bookmarkEnd w:id="243"/>
+    <w:bookmarkStart w:id="245" w:name="ref-silvestro2014"/>
     <w:p>
       <w:pPr>
         <w:pStyle w:val="Bibliography"/>
@@ -8039,7 +8370,7 @@
       <w:r>
         <w:t xml:space="preserve"> </w:t>
       </w:r>
-      <w:hyperlink r:id="rId232">
+      <w:hyperlink r:id="rId244">
         <w:r>
           <w:rPr>
             <w:rStyle w:val="Hyperlink"/>
@@ -8051,8 +8382,8 @@
         <w:t xml:space="preserve">. Methods in Ecology and Evolution 5:1126–1131.</w:t>
       </w:r>
     </w:p>
-    <w:bookmarkEnd w:id="233"/>
-    <w:bookmarkStart w:id="234" w:name="ref-simpson1980"/>
+    <w:bookmarkEnd w:id="245"/>
+    <w:bookmarkStart w:id="246" w:name="ref-simpson1980"/>
     <w:p>
       <w:pPr>
         <w:pStyle w:val="Bibliography"/>
@@ -8061,8 +8392,8 @@
         <w:t xml:space="preserve">Simpson, G. G. 1980. Splendid isolation : The curious history of south american mammals. Yale University Press, New Haven.</w:t>
       </w:r>
     </w:p>
-    <w:bookmarkEnd w:id="234"/>
-    <w:bookmarkStart w:id="235" w:name="ref-simpson1944"/>
+    <w:bookmarkEnd w:id="246"/>
+    <w:bookmarkStart w:id="247" w:name="ref-simpson1944"/>
     <w:p>
       <w:pPr>
         <w:pStyle w:val="Bibliography"/>
@@ -8071,8 +8402,8 @@
         <w:t xml:space="preserve">Simpson, G. G. 1944. Tempo and mode in evolution. Columbia University Press.</w:t>
       </w:r>
     </w:p>
-    <w:bookmarkEnd w:id="235"/>
-    <w:bookmarkStart w:id="237" w:name="ref-solórzano2024"/>
+    <w:bookmarkEnd w:id="247"/>
+    <w:bookmarkStart w:id="249" w:name="ref-solórzano2024"/>
     <w:p>
       <w:pPr>
         <w:pStyle w:val="Bibliography"/>
@@ -8083,7 +8414,7 @@
       <w:r>
         <w:t xml:space="preserve"> </w:t>
       </w:r>
-      <w:hyperlink r:id="rId236">
+      <w:hyperlink r:id="rId248">
         <w:r>
           <w:rPr>
             <w:rStyle w:val="Hyperlink"/>
@@ -8095,8 +8426,8 @@
         <w:t xml:space="preserve">.</w:t>
       </w:r>
     </w:p>
-    <w:bookmarkEnd w:id="237"/>
-    <w:bookmarkStart w:id="238" w:name="ref-stebbins1974"/>
+    <w:bookmarkEnd w:id="249"/>
+    <w:bookmarkStart w:id="250" w:name="ref-stebbins1974"/>
     <w:p>
       <w:pPr>
         <w:pStyle w:val="Bibliography"/>
@@ -8118,8 +8449,8 @@
         <w:t xml:space="preserve">. Cambridge, Mass.</w:t>
       </w:r>
     </w:p>
-    <w:bookmarkEnd w:id="238"/>
-    <w:bookmarkStart w:id="240" w:name="ref-stenseth_coevolution_1984"/>
+    <w:bookmarkEnd w:id="250"/>
+    <w:bookmarkStart w:id="252" w:name="ref-stenseth_coevolution_1984"/>
     <w:p>
       <w:pPr>
         <w:pStyle w:val="Bibliography"/>
@@ -8130,7 +8461,7 @@
       <w:r>
         <w:t xml:space="preserve"> </w:t>
       </w:r>
-      <w:hyperlink r:id="rId239">
+      <w:hyperlink r:id="rId251">
         <w:r>
           <w:rPr>
             <w:rStyle w:val="Hyperlink"/>
@@ -8142,8 +8473,8 @@
         <w:t xml:space="preserve"> Evol 38:870–880.</w:t>
       </w:r>
     </w:p>
-    <w:bookmarkEnd w:id="240"/>
-    <w:bookmarkStart w:id="242" w:name="ref-strömberg2013"/>
+    <w:bookmarkEnd w:id="252"/>
+    <w:bookmarkStart w:id="254" w:name="ref-strömberg2013"/>
     <w:p>
       <w:pPr>
         <w:pStyle w:val="Bibliography"/>
@@ -8154,7 +8485,7 @@
       <w:r>
         <w:t xml:space="preserve"> </w:t>
       </w:r>
-      <w:hyperlink r:id="rId241">
+      <w:hyperlink r:id="rId253">
         <w:r>
           <w:rPr>
             <w:rStyle w:val="Hyperlink"/>
@@ -8166,8 +8497,8 @@
         <w:t xml:space="preserve">. Nature Communications 4:1478.</w:t>
       </w:r>
     </w:p>
-    <w:bookmarkEnd w:id="242"/>
-    <w:bookmarkStart w:id="244" w:name="ref-tardif2025"/>
+    <w:bookmarkEnd w:id="254"/>
+    <w:bookmarkStart w:id="256" w:name="ref-tardif2025"/>
     <w:p>
       <w:pPr>
         <w:pStyle w:val="Bibliography"/>
@@ -8178,7 +8509,7 @@
       <w:r>
         <w:t xml:space="preserve"> </w:t>
       </w:r>
-      <w:hyperlink r:id="rId243">
+      <w:hyperlink r:id="rId255">
         <w:r>
           <w:rPr>
             <w:rStyle w:val="Hyperlink"/>
@@ -8190,8 +8521,8 @@
         <w:t xml:space="preserve">. Global Ecology and Biogeography 34:e70024.</w:t>
       </w:r>
     </w:p>
-    <w:bookmarkEnd w:id="244"/>
-    <w:bookmarkStart w:id="246" w:name="ref-tarquini2022"/>
+    <w:bookmarkEnd w:id="256"/>
+    <w:bookmarkStart w:id="258" w:name="ref-tarquini2022"/>
     <w:p>
       <w:pPr>
         <w:pStyle w:val="Bibliography"/>
@@ -8202,7 +8533,7 @@
       <w:r>
         <w:t xml:space="preserve"> </w:t>
       </w:r>
-      <w:hyperlink r:id="rId245">
+      <w:hyperlink r:id="rId257">
         <w:r>
           <w:rPr>
             <w:rStyle w:val="Hyperlink"/>
@@ -8214,8 +8545,8 @@
         <w:t xml:space="preserve">. Scientific Reports 12:1224.</w:t>
       </w:r>
     </w:p>
-    <w:bookmarkEnd w:id="246"/>
-    <w:bookmarkStart w:id="248" w:name="ref-database"/>
+    <w:bookmarkEnd w:id="258"/>
+    <w:bookmarkStart w:id="260" w:name="ref-database"/>
     <w:p>
       <w:pPr>
         <w:pStyle w:val="Bibliography"/>
@@ -8226,7 +8557,7 @@
       <w:r>
         <w:t xml:space="preserve"> </w:t>
       </w:r>
-      <w:hyperlink r:id="rId247">
+      <w:hyperlink r:id="rId259">
         <w:r>
           <w:rPr>
             <w:rStyle w:val="Hyperlink"/>
@@ -8238,8 +8569,8 @@
         <w:t xml:space="preserve">.</w:t>
       </w:r>
     </w:p>
-    <w:bookmarkEnd w:id="248"/>
-    <w:bookmarkStart w:id="250" w:name="ref-vallejos-garrido2023"/>
+    <w:bookmarkEnd w:id="260"/>
+    <w:bookmarkStart w:id="262" w:name="ref-vallejos-garrido2023"/>
     <w:p>
       <w:pPr>
         <w:pStyle w:val="Bibliography"/>
@@ -8250,7 +8581,7 @@
       <w:r>
         <w:t xml:space="preserve"> </w:t>
       </w:r>
-      <w:hyperlink r:id="rId249">
+      <w:hyperlink r:id="rId261">
         <w:r>
           <w:rPr>
             <w:rStyle w:val="Hyperlink"/>
@@ -8262,8 +8593,8 @@
         <w:t xml:space="preserve">. Scientific Reports 13:2207.</w:t>
       </w:r>
     </w:p>
-    <w:bookmarkEnd w:id="250"/>
-    <w:bookmarkStart w:id="252" w:name="ref-vanvalen1960"/>
+    <w:bookmarkEnd w:id="262"/>
+    <w:bookmarkStart w:id="264" w:name="ref-vanvalen1960"/>
     <w:p>
       <w:pPr>
         <w:pStyle w:val="Bibliography"/>
@@ -8274,7 +8605,7 @@
       <w:r>
         <w:t xml:space="preserve"> </w:t>
       </w:r>
-      <w:hyperlink r:id="rId251">
+      <w:hyperlink r:id="rId263">
         <w:r>
           <w:rPr>
             <w:rStyle w:val="Hyperlink"/>
@@ -8286,8 +8617,8 @@
         <w:t xml:space="preserve">. Evolution 14:531–532.</w:t>
       </w:r>
     </w:p>
-    <w:bookmarkEnd w:id="252"/>
-    <w:bookmarkStart w:id="253" w:name="ref-vanvalen1973"/>
+    <w:bookmarkEnd w:id="264"/>
+    <w:bookmarkStart w:id="265" w:name="ref-vanvalen1973"/>
     <w:p>
       <w:pPr>
         <w:pStyle w:val="Bibliography"/>
@@ -8296,8 +8627,8 @@
         <w:t xml:space="preserve">Van Valen, L. 1973a. A new evolutionary law. Evolutionary Theory 1–30.</w:t>
       </w:r>
     </w:p>
-    <w:bookmarkEnd w:id="253"/>
-    <w:bookmarkStart w:id="254" w:name="ref-van_valen_pattern_1973"/>
+    <w:bookmarkEnd w:id="265"/>
+    <w:bookmarkStart w:id="266" w:name="ref-van_valen_pattern_1973"/>
     <w:p>
       <w:pPr>
         <w:pStyle w:val="Bibliography"/>
@@ -8306,8 +8637,8 @@
         <w:t xml:space="preserve">Van Valen, L. 1973b. Pattern and the balance of nature. Evol. Theory 1:31–49.</w:t>
       </w:r>
     </w:p>
-    <w:bookmarkEnd w:id="254"/>
-    <w:bookmarkStart w:id="255" w:name="ref-vrba1995"/>
+    <w:bookmarkEnd w:id="266"/>
+    <w:bookmarkStart w:id="267" w:name="ref-vrba1995"/>
     <w:p>
       <w:pPr>
         <w:pStyle w:val="Bibliography"/>
@@ -8329,8 +8660,8 @@
         <w:t xml:space="preserve">. New Haven; London.</w:t>
       </w:r>
     </w:p>
-    <w:bookmarkEnd w:id="255"/>
-    <w:bookmarkStart w:id="256" w:name="ref-vrba1993"/>
+    <w:bookmarkEnd w:id="267"/>
+    <w:bookmarkStart w:id="268" w:name="ref-vrba1993"/>
     <w:p>
       <w:pPr>
         <w:pStyle w:val="Bibliography"/>
@@ -8339,8 +8670,8 @@
         <w:t xml:space="preserve">Vrba, E. S. 1993. Turnover-pulses, the red queen and related topics. American Journal of Science 293:418–452.</w:t>
       </w:r>
     </w:p>
-    <w:bookmarkEnd w:id="256"/>
-    <w:bookmarkStart w:id="257" w:name="ref-vucetich2015"/>
+    <w:bookmarkEnd w:id="268"/>
+    <w:bookmarkStart w:id="269" w:name="ref-vucetich2015"/>
     <w:p>
       <w:pPr>
         <w:pStyle w:val="Bibliography"/>
@@ -8362,8 +8693,8 @@
         <w:t xml:space="preserve">. Sociedad Argentina para el Estudio de los Mammíferos (SAREM), Buenos Aires, Argentina.</w:t>
       </w:r>
     </w:p>
-    <w:bookmarkEnd w:id="257"/>
-    <w:bookmarkStart w:id="258" w:name="ref-webb1985"/>
+    <w:bookmarkEnd w:id="269"/>
+    <w:bookmarkStart w:id="270" w:name="ref-webb1985"/>
     <w:p>
       <w:pPr>
         <w:pStyle w:val="Bibliography"/>
@@ -8372,8 +8703,8 @@
         <w:t xml:space="preserve">Webb, S. D. 1985. Late cenozoic mammal dispersals between the americas.</w:t>
       </w:r>
     </w:p>
-    <w:bookmarkEnd w:id="258"/>
-    <w:bookmarkStart w:id="260" w:name="ref-weppe2023"/>
+    <w:bookmarkEnd w:id="270"/>
+    <w:bookmarkStart w:id="272" w:name="ref-weppe2023"/>
     <w:p>
       <w:pPr>
         <w:pStyle w:val="Bibliography"/>
@@ -8384,7 +8715,7 @@
       <w:r>
         <w:t xml:space="preserve"> </w:t>
       </w:r>
-      <w:hyperlink r:id="rId259">
+      <w:hyperlink r:id="rId271">
         <w:r>
           <w:rPr>
             <w:rStyle w:val="Hyperlink"/>
@@ -8402,8 +8733,8 @@
         <w:t xml:space="preserve">. Proceedings of the National Academy of Sciences 120:e2309945120.</w:t>
       </w:r>
     </w:p>
-    <w:bookmarkEnd w:id="260"/>
-    <w:bookmarkStart w:id="262" w:name="ref-westerhold2020"/>
+    <w:bookmarkEnd w:id="272"/>
+    <w:bookmarkStart w:id="274" w:name="ref-westerhold2020"/>
     <w:p>
       <w:pPr>
         <w:pStyle w:val="Bibliography"/>
@@ -8414,7 +8745,7 @@
       <w:r>
         <w:t xml:space="preserve"> </w:t>
       </w:r>
-      <w:hyperlink r:id="rId261">
+      <w:hyperlink r:id="rId273">
         <w:r>
           <w:rPr>
             <w:rStyle w:val="Hyperlink"/>
@@ -8438,8 +8769,8 @@
         <w:t xml:space="preserve">. Science 369:1383–1387.</w:t>
       </w:r>
     </w:p>
-    <w:bookmarkEnd w:id="262"/>
-    <w:bookmarkStart w:id="264" w:name="ref-woods2021"/>
+    <w:bookmarkEnd w:id="274"/>
+    <w:bookmarkStart w:id="276" w:name="ref-woods2021"/>
     <w:p>
       <w:pPr>
         <w:pStyle w:val="Bibliography"/>
@@ -8450,7 +8781,7 @@
       <w:r>
         <w:t xml:space="preserve"> </w:t>
       </w:r>
-      <w:hyperlink r:id="rId263">
+      <w:hyperlink r:id="rId275">
         <w:r>
           <w:rPr>
             <w:rStyle w:val="Hyperlink"/>
@@ -8462,15 +8793,15 @@
         <w:t xml:space="preserve">. Molecular Biology and Evolution 38:84–95.</w:t>
       </w:r>
     </w:p>
-    <w:bookmarkEnd w:id="264"/>
-    <w:bookmarkEnd w:id="265"/>
+    <w:bookmarkEnd w:id="276"/>
+    <w:bookmarkEnd w:id="277"/>
     <w:p>
       <w:r>
         <w:br w:type="page"/>
       </w:r>
     </w:p>
-    <w:bookmarkEnd w:id="266"/>
-    <w:bookmarkStart w:id="284" w:name="figures"/>
+    <w:bookmarkEnd w:id="278"/>
+    <w:bookmarkStart w:id="296" w:name="figures"/>
     <w:p>
       <w:pPr>
         <w:pStyle w:val="Heading1"/>
@@ -8492,7 +8823,7 @@
       <w:tr>
         <w:tc>
           <w:tcPr/>
-          <w:bookmarkStart w:id="271" w:name="fig-ExtSampl"/>
+          <w:bookmarkStart w:id="283" w:name="fig-ExtSampl"/>
           <w:p>
             <w:pPr>
               <w:pStyle w:val="Compact"/>
@@ -8503,18 +8834,18 @@
                 <wp:inline>
                   <wp:extent cx="5943600" cy="1635861"/>
                   <wp:effectExtent b="0" l="0" r="0" t="0"/>
-                  <wp:docPr descr="" title="" id="268" name="Picture"/>
+                  <wp:docPr descr="" title="" id="280" name="Picture"/>
                   <a:graphic>
                     <a:graphicData uri="http://schemas.openxmlformats.org/drawingml/2006/picture">
                       <pic:pic>
                         <pic:nvPicPr>
-                          <pic:cNvPr descr="../Figures/Main/extant_sampling/extant_sampling.png" id="269" name="Picture"/>
+                          <pic:cNvPr descr="../Figures/Main/extant_sampling/extant_sampling.png" id="281" name="Picture"/>
                           <pic:cNvPicPr>
                             <a:picLocks noChangeArrowheads="1" noChangeAspect="1"/>
                           </pic:cNvPicPr>
                         </pic:nvPicPr>
                         <pic:blipFill>
-                          <a:blip r:embed="rId267"/>
+                          <a:blip r:embed="rId279"/>
                           <a:stretch>
                             <a:fillRect/>
                           </a:stretch>
@@ -9058,7 +9389,7 @@
             <w:r>
               <w:t xml:space="preserve"> </w:t>
             </w:r>
-            <w:hyperlink r:id="rId270">
+            <w:hyperlink r:id="rId282">
               <w:r>
                 <w:rPr>
                   <w:rStyle w:val="Hyperlink"/>
@@ -9070,7 +9401,7 @@
               <w:t xml:space="preserve">, see Tab. S3 for additional information.</w:t>
             </w:r>
           </w:p>
-          <w:bookmarkEnd w:id="271"/>
+          <w:bookmarkEnd w:id="283"/>
         </w:tc>
       </w:tr>
     </w:tbl>
@@ -9095,7 +9426,7 @@
       <w:tr>
         <w:tc>
           <w:tcPr/>
-          <w:bookmarkStart w:id="275" w:name="fig-lifespans"/>
+          <w:bookmarkStart w:id="287" w:name="fig-lifespans"/>
           <w:p>
             <w:pPr>
               <w:pStyle w:val="Compact"/>
@@ -9106,18 +9437,18 @@
                 <wp:inline>
                   <wp:extent cx="5399999" cy="6839999"/>
                   <wp:effectExtent b="0" l="0" r="0" t="0"/>
-                  <wp:docPr descr="" title="" id="273" name="Picture"/>
+                  <wp:docPr descr="" title="" id="285" name="Picture"/>
                   <a:graphic>
                     <a:graphicData uri="http://schemas.openxmlformats.org/drawingml/2006/picture">
                       <pic:pic>
                         <pic:nvPicPr>
-                          <pic:cNvPr descr="../Figures/Main/Lifespans/lifespans_distribs.png" id="274" name="Picture"/>
+                          <pic:cNvPr descr="../Figures/Main/Lifespans/lifespans_distribs.png" id="286" name="Picture"/>
                           <pic:cNvPicPr>
                             <a:picLocks noChangeArrowheads="1" noChangeAspect="1"/>
                           </pic:cNvPicPr>
                         </pic:nvPicPr>
                         <pic:blipFill>
-                          <a:blip r:embed="rId272"/>
+                          <a:blip r:embed="rId284"/>
                           <a:stretch>
                             <a:fillRect/>
                           </a:stretch>
@@ -9192,7 +9523,7 @@
               <w:t xml:space="preserve">.</w:t>
             </w:r>
           </w:p>
-          <w:bookmarkEnd w:id="275"/>
+          <w:bookmarkEnd w:id="287"/>
         </w:tc>
       </w:tr>
     </w:tbl>
@@ -9217,7 +9548,7 @@
       <w:tr>
         <w:tc>
           <w:tcPr/>
-          <w:bookmarkStart w:id="279" w:name="fig-diversityBM"/>
+          <w:bookmarkStart w:id="291" w:name="fig-diversityBM"/>
           <w:p>
             <w:pPr>
               <w:pStyle w:val="Compact"/>
@@ -9228,18 +9559,18 @@
                 <wp:inline>
                   <wp:extent cx="2519999" cy="7199999"/>
                   <wp:effectExtent b="0" l="0" r="0" t="0"/>
-                  <wp:docPr descr="" title="" id="277" name="Picture"/>
+                  <wp:docPr descr="" title="" id="289" name="Picture"/>
                   <a:graphic>
                     <a:graphicData uri="http://schemas.openxmlformats.org/drawingml/2006/picture">
                       <pic:pic>
                         <pic:nvPicPr>
-                          <pic:cNvPr descr="../Figures/Main/Diversity_and_BM_through_time.png" id="278" name="Picture"/>
+                          <pic:cNvPr descr="../Figures/Main/Diversity_and_BM_through_time.png" id="290" name="Picture"/>
                           <pic:cNvPicPr>
                             <a:picLocks noChangeArrowheads="1" noChangeAspect="1"/>
                           </pic:cNvPicPr>
                         </pic:nvPicPr>
                         <pic:blipFill>
-                          <a:blip r:embed="rId276"/>
+                          <a:blip r:embed="rId288"/>
                           <a:stretch>
                             <a:fillRect/>
                           </a:stretch>
@@ -9276,38 +9607,24 @@
               <w:pStyle w:val="ImageCaption"/>
             </w:pPr>
             <w:r>
-              <w:t xml:space="preserve">Figure 3: The joint diversity and clade-wise body size dynamics of Chinchilloidea. Occurrence-based diversity reconstructions were either produced in a bayesian preservation-aware framework jointly assessing the times of speciation and extinction of each species from the temporal occurrence database (PyRate)</w:t>
+              <w:t xml:space="preserve">Figure 3: The joint diversity and clade-wise body size dynamics of Chinchilloidea. Occurrence-based diversity reconstructions were either produced in a bayesian preservation-aware framework jointly assessing the times of speciation and extinction of each species</w:t>
             </w:r>
             <w:r>
               <w:t xml:space="preserve"> </w:t>
             </w:r>
-            <w:r>
-              <w:rPr>
-                <w:b/>
-                <w:bCs/>
-              </w:rPr>
-              <w:t xml:space="preserve">(A)</w:t>
-            </w:r>
-            <w:r>
-              <w:t xml:space="preserve">, or using a simulation-based deep-learning framework incorporating a wide variety of biases to reconstruct the temporal variations of the</w:t>
-            </w:r>
+            <w:hyperlink w:anchor="fig-lifespans">
+              <w:r>
+                <w:rPr>
+                  <w:rStyle w:val="Hyperlink"/>
+                </w:rPr>
+                <w:t xml:space="preserve">Figure 2</w:t>
+              </w:r>
+            </w:hyperlink>
             <w:r>
               <w:t xml:space="preserve"> </w:t>
             </w:r>
             <w:r>
-              <w:t xml:space="preserve">“</w:t>
-            </w:r>
-            <w:r>
-              <w:t xml:space="preserve">true</w:t>
-            </w:r>
-            <w:r>
-              <w:t xml:space="preserve">”</w:t>
-            </w:r>
-            <w:r>
-              <w:t xml:space="preserve"> </w:t>
-            </w:r>
-            <w:r>
-              <w:t xml:space="preserve">(</w:t>
+              <w:t xml:space="preserve">from the temporal occurrence database (PyRate) (</w:t>
             </w:r>
             <w:r>
               <w:rPr>
@@ -9327,6 +9644,57 @@
               <w:t xml:space="preserve">e</w:t>
             </w:r>
             <w:r>
+              <w:t xml:space="preserve">., sampled diversity,</w:t>
+            </w:r>
+            <w:r>
+              <w:t xml:space="preserve"> </w:t>
+            </w:r>
+            <w:r>
+              <w:rPr>
+                <w:b/>
+                <w:bCs/>
+              </w:rPr>
+              <w:t xml:space="preserve">A</w:t>
+            </w:r>
+            <w:r>
+              <w:t xml:space="preserve">), or using a simulation-based deep-learning framework incorporating a wide variety of biases to reconstruct the temporal variations of the</w:t>
+            </w:r>
+            <w:r>
+              <w:t xml:space="preserve"> </w:t>
+            </w:r>
+            <w:r>
+              <w:t xml:space="preserve">‘</w:t>
+            </w:r>
+            <w:r>
+              <w:t xml:space="preserve">true</w:t>
+            </w:r>
+            <w:r>
+              <w:t xml:space="preserve">’</w:t>
+            </w:r>
+            <w:r>
+              <w:t xml:space="preserve"> </w:t>
+            </w:r>
+            <w:r>
+              <w:t xml:space="preserve">(</w:t>
+            </w:r>
+            <w:r>
+              <w:rPr>
+                <w:i/>
+                <w:iCs/>
+              </w:rPr>
+              <w:t xml:space="preserve">i</w:t>
+            </w:r>
+            <w:r>
+              <w:t xml:space="preserve">.</w:t>
+            </w:r>
+            <w:r>
+              <w:rPr>
+                <w:i/>
+                <w:iCs/>
+              </w:rPr>
+              <w:t xml:space="preserve">e</w:t>
+            </w:r>
+            <w:r>
               <w:t xml:space="preserve">., corrected) diversity in 1-Myr time bins (DeepDive)</w:t>
             </w:r>
             <w:r>
@@ -9350,7 +9718,7 @@
               <w:t xml:space="preserve">C</w:t>
             </w:r>
             <w:r>
-              <w:t xml:space="preserve">, log scale) were produced after binning our the body mass estimates of each species in 1-Myr time bins. The body mass of a taxon was included within a given bin if its reconstructed lifepan overlapped with it. The black dot at the right of the plot shows the median body mass of the extant chinchilloids, and the red line shows its range. In all cases, full lines represent median estimates and the lightest ribbon either shows their associated 95% HPD interval</w:t>
+              <w:t xml:space="preserve">, log scale) were produced after binning our body mass estimates of each species in 1-Myr time bins. The body mass of a taxon was included within a given bin if its reconstructed lifepan overlapped with it. The black dot at the right of the plot shows the median body mass of the extant chinchilloids, and the red line shows its range. In all cases, full lines represent median estimates and the lightest ribbon either shows their associated 95% HPD interval</w:t>
             </w:r>
             <w:r>
               <w:t xml:space="preserve"> </w:t>
@@ -9410,8 +9778,40 @@
             <w:r>
               <w:t xml:space="preserve">, the darker ribbon depicts the interval encompassing 50% of the per-bin diversity distribution across the 100 DeepDive replicates.</w:t>
             </w:r>
+            <w:r>
+              <w:t xml:space="preserve"> </w:t>
+            </w:r>
+            <w:r>
+              <w:rPr>
+                <w:i/>
+                <w:iCs/>
+              </w:rPr>
+              <w:t xml:space="preserve">Lagidium peruanum</w:t>
+            </w:r>
+            <w:r>
+              <w:t xml:space="preserve"> </w:t>
+            </w:r>
+            <w:r>
+              <w:t xml:space="preserve">and</w:t>
+            </w:r>
+            <w:r>
+              <w:t xml:space="preserve"> </w:t>
+            </w:r>
+            <w:r>
+              <w:rPr>
+                <w:i/>
+                <w:iCs/>
+              </w:rPr>
+              <w:t xml:space="preserve">Josephoartigasia monesi</w:t>
+            </w:r>
+            <w:r>
+              <w:t xml:space="preserve"> </w:t>
+            </w:r>
+            <w:r>
+              <w:t xml:space="preserve">silhouettes are from Phylopic (credits available in Tab. S2).</w:t>
+            </w:r>
           </w:p>
-          <w:bookmarkEnd w:id="279"/>
+          <w:bookmarkEnd w:id="291"/>
         </w:tc>
       </w:tr>
     </w:tbl>
@@ -9436,7 +9836,7 @@
       <w:tr>
         <w:tc>
           <w:tcPr/>
-          <w:bookmarkStart w:id="283" w:name="fig-diversification"/>
+          <w:bookmarkStart w:id="295" w:name="fig-diversification"/>
           <w:p>
             <w:pPr>
               <w:pStyle w:val="Compact"/>
@@ -9447,18 +9847,18 @@
                 <wp:inline>
                   <wp:extent cx="5399999" cy="3959999"/>
                   <wp:effectExtent b="0" l="0" r="0" t="0"/>
-                  <wp:docPr descr="" title="" id="281" name="Picture"/>
+                  <wp:docPr descr="" title="" id="293" name="Picture"/>
                   <a:graphic>
                     <a:graphicData uri="http://schemas.openxmlformats.org/drawingml/2006/picture">
                       <pic:pic>
                         <pic:nvPicPr>
-                          <pic:cNvPr descr="../Figures/Main/Diversification_rates.png" id="282" name="Picture"/>
+                          <pic:cNvPr descr="../Figures/Main/Diversification_rates.png" id="294" name="Picture"/>
                           <pic:cNvPicPr>
                             <a:picLocks noChangeArrowheads="1" noChangeAspect="1"/>
                           </pic:cNvPicPr>
                         </pic:nvPicPr>
                         <pic:blipFill>
-                          <a:blip r:embed="rId280"/>
+                          <a:blip r:embed="rId292"/>
                           <a:stretch>
                             <a:fillRect/>
                           </a:stretch>
@@ -9523,11 +9923,11 @@
               <w:t xml:space="preserve">. Stars indicate significant rate shifts.</w:t>
             </w:r>
           </w:p>
-          <w:bookmarkEnd w:id="283"/>
+          <w:bookmarkEnd w:id="295"/>
         </w:tc>
       </w:tr>
     </w:tbl>
-    <w:bookmarkEnd w:id="284"/>
+    <w:bookmarkEnd w:id="296"/>
     <w:sectPr>
       <w:type w:val="nextPage"/>
       <w:pgSz w:h="15840" w:w="12240"/>

</xml_diff>

<commit_message>
daily updates in results
</commit_message>
<xml_diff>
--- a/Manuscript/Main_text.docx
+++ b/Manuscript/Main_text.docx
@@ -4173,10 +4173,7 @@
         <w:t xml:space="preserve">ca</w:t>
       </w:r>
       <w:r>
-        <w:t xml:space="preserve">. 6.5 Ma</w:t>
-      </w:r>
-      <w:r>
-        <w:t xml:space="preserve"> </w:t>
+        <w:t xml:space="preserve">. 6.5 Ma (</w:t>
       </w:r>
       <w:hyperlink w:anchor="fig-diversityBM">
         <w:r>
@@ -4187,10 +4184,10 @@
         </w:r>
       </w:hyperlink>
       <w:r>
-        <w:t xml:space="preserve">. At their maximum, median sampled and corrected diversity exhibit a 3-fold difference between each other, respectively peaking at 22 and 62. Four additional – though more attenuated – peaks may be reported from the sampled diversity curve (PyRate) : one in the late Oligocene (Deseadan SALMA), two in the Early Miocene (Colhuehuapian and Santacrucian SALMAs) and one in the late Middle Miocene (Laventan SALMA)</w:t>
-      </w:r>
-      <w:r>
-        <w:t xml:space="preserve"> </w:t>
+        <w:t xml:space="preserve"> </w:t>
+      </w:r>
+      <w:r>
+        <w:t xml:space="preserve">A–B). At their maximum, median sampled and corrected diversity exhibit a 3-fold difference between each other, respectively peaking at 22 and 62. Four additional – though more attenuated – peaks may be reported from the sampled diversity curve (PyRate) : one in the late Oligocene (Deseadan SALMA), two in the Early Miocene (Colhuehuapian and Santacrucian SALMAs) and one in the late Middle Miocene (Laventan SALMA) (</w:t>
       </w:r>
       <w:hyperlink w:anchor="fig-diversityBM">
         <w:r>
@@ -4201,10 +4198,10 @@
         </w:r>
       </w:hyperlink>
       <w:r>
-        <w:t xml:space="preserve">. These peaks are barely recovered from the corrected diversity curve</w:t>
-      </w:r>
-      <w:r>
-        <w:t xml:space="preserve"> </w:t>
+        <w:t xml:space="preserve"> </w:t>
+      </w:r>
+      <w:r>
+        <w:t xml:space="preserve">A). These peaks are barely recovered from the corrected diversity curve (</w:t>
       </w:r>
       <w:hyperlink w:anchor="fig-diversityBM">
         <w:r>
@@ -4215,7 +4212,10 @@
         </w:r>
       </w:hyperlink>
       <w:r>
-        <w:t xml:space="preserve">.</w:t>
+        <w:t xml:space="preserve"> </w:t>
+      </w:r>
+      <w:r>
+        <w:t xml:space="preserve">B).</w:t>
       </w:r>
     </w:p>
     <w:p>
@@ -4223,10 +4223,7 @@
         <w:pStyle w:val="BodyText"/>
       </w:pPr>
       <w:r>
-        <w:t xml:space="preserve">This diversity pattern elegantly matches the temporal dynamics of body size across the history of the clade made from the body mass estimations that we obtained for nearly all species (94%) represented in our occurrence dataset</w:t>
-      </w:r>
-      <w:r>
-        <w:t xml:space="preserve"> </w:t>
+        <w:t xml:space="preserve">This diversity pattern elegantly matches the temporal dynamics of body size across the history of the clade made from the body mass estimations that we obtained for nearly all species (94%) represented in our occurrence dataset (</w:t>
       </w:r>
       <w:hyperlink w:anchor="fig-diversityBM">
         <w:r>
@@ -4237,10 +4234,10 @@
         </w:r>
       </w:hyperlink>
       <w:r>
-        <w:t xml:space="preserve">. Indeed, median chinchilloid body size was slightly above 100 g at the beginning of the evolutionary history of the clade (latest Eocene–earliest Oligocene), peaked around 35 [1.90, 233] kg in the late Miocene and further declined until the present (1.9 [0.45, 12.6] kg). Overlaying body mass estimates with species-specific origination and extinction times reconstructed with PyRate clearly highlights a coordinated temporal trend towards body size increase among several chinchilloid lineages</w:t>
-      </w:r>
-      <w:r>
-        <w:t xml:space="preserve"> </w:t>
+        <w:t xml:space="preserve"> </w:t>
+      </w:r>
+      <w:r>
+        <w:t xml:space="preserve">C). Indeed, median chinchilloid body size was slightly above 100 g at the beginning of the evolutionary history of the clade (latest Eocene–earliest Oligocene), peaked around 35 [1.90, 233] kg in the late Miocene and further declined until the present (1.9 [0.45, 12.6] kg). Overlaying body mass estimates with species-specific origination and extinction times reconstructed with PyRate clearly highlights a coordinated temporal trend towards body size increase among several chinchilloid lineages (</w:t>
       </w:r>
       <w:hyperlink w:anchor="fig-lifespans">
         <w:r>
@@ -4251,7 +4248,7 @@
         </w:r>
       </w:hyperlink>
       <w:r>
-        <w:t xml:space="preserve">. Small sizes (&lt; 1kg) are mostly found among basal forms restricted to the Palaeogene–Early Miocene, with the notable exception of the extant</w:t>
+        <w:t xml:space="preserve">). Small sizes (&lt; 1kg) are mostly found among basal forms restricted to the Palaeogene–Early Miocene, with the notable exception of the extant</w:t>
       </w:r>
       <w:r>
         <w:t xml:space="preserve"> </w:t>
@@ -4267,469 +4264,7 @@
         <w:t xml:space="preserve"> </w:t>
       </w:r>
       <w:r>
-        <w:t xml:space="preserve">species.</w:t>
-      </w:r>
-    </w:p>
-    <w:p>
-      <w:pPr>
-        <w:pStyle w:val="BodyText"/>
-      </w:pPr>
-      <w:r>
-        <w:t xml:space="preserve">Positive net diversification rate until</w:t>
-      </w:r>
-      <w:r>
-        <w:t xml:space="preserve"> </w:t>
-      </w:r>
-      <w:r>
-        <w:rPr>
-          <w:i/>
-          <w:iCs/>
-        </w:rPr>
-        <w:t xml:space="preserve">ca</w:t>
-      </w:r>
-      <w:r>
-        <w:t xml:space="preserve">. 6 Ma, decline and increase in extinction rate (cite figures accordingly).</w:t>
-      </w:r>
-    </w:p>
-    <w:p>
-      <w:pPr>
-        <w:pStyle w:val="BodyText"/>
-      </w:pPr>
-      <w:r>
-        <w:t xml:space="preserve">All DD architectures performed similarly, as long as they comprised at least one dense layer connecting the output of the LSTM layers to the output layer (</w:t>
-      </w:r>
-      <w:r>
-        <w:rPr>
-          <w:b/>
-          <w:bCs/>
-        </w:rPr>
-        <w:t xml:space="preserve">Supp. Tab. 8</w:t>
-      </w:r>
-      <w:r>
-        <w:t xml:space="preserve">).</w:t>
-      </w:r>
-    </w:p>
-    <w:p>
-      <w:pPr>
-        <w:pStyle w:val="BodyText"/>
-      </w:pPr>
-      <w:r>
-        <w:t xml:space="preserve">The coefficients of rate variations obtained for BDNN (resp. XX and XX) exceeded the thresholds inferred from analyses of 100 simulated datasets generated under a constant-rate birth-death model, matching our empirical data in terms of trait number, age of the clade and (approximately) number of species (resp. XX and XX). This therefore provides evidence for significant rate variations throughout the evolutionary history of Chinchilloidea.</w:t>
-      </w:r>
-    </w:p>
-    <w:bookmarkEnd w:id="35"/>
-    <w:bookmarkStart w:id="36" w:name="Xeff14126d71e9a6fc25ff8995a8259fc4cdba78"/>
-    <w:p>
-      <w:pPr>
-        <w:pStyle w:val="Heading2"/>
-      </w:pPr>
-      <w:r>
-        <w:t xml:space="preserve">A body-mass selective XXX XXX evolutionary decline</w:t>
-      </w:r>
-    </w:p>
-    <w:p>
-      <w:pPr>
-        <w:pStyle w:val="FirstParagraph"/>
-      </w:pPr>
-      <w:r>
-        <w:t xml:space="preserve">Speciation rate significantly differs across body size classes, with larger taxa achieving higher values (Fig. X and S5). According to the BDNN model, body size stands out as the first predictor explaining variations in speciation rate within Chinchilloidea, with a</w:t>
-      </w:r>
-      <w:r>
-        <w:t xml:space="preserve"> </w:t>
-      </w:r>
-      <w:r>
-        <w:rPr>
-          <w:i/>
-          <w:iCs/>
-        </w:rPr>
-        <w:t xml:space="preserve">ca</w:t>
-      </w:r>
-      <w:r>
-        <w:t xml:space="preserve">. 2.5-fold change obtained between our two extrema (</w:t>
-      </w:r>
-      <w:r>
-        <w:rPr>
-          <w:i/>
-          <w:iCs/>
-        </w:rPr>
-        <w:t xml:space="preserve">i</w:t>
-      </w:r>
-      <w:r>
-        <w:t xml:space="preserve">.</w:t>
-      </w:r>
-      <w:r>
-        <w:rPr>
-          <w:i/>
-          <w:iCs/>
-        </w:rPr>
-        <w:t xml:space="preserve">e</w:t>
-      </w:r>
-      <w:r>
-        <w:t xml:space="preserve">., XS and XXL =&gt;</w:t>
-      </w:r>
-      <w:r>
-        <w:t xml:space="preserve"> </w:t>
-      </w:r>
-      <w:r>
-        <w:rPr>
-          <w:b/>
-          <w:bCs/>
-        </w:rPr>
-        <w:t xml:space="preserve">indicate on the violin plot</w:t>
-      </w:r>
-      <w:r>
-        <w:t xml:space="preserve">).</w:t>
-      </w:r>
-    </w:p>
-    <w:p>
-      <w:pPr>
-        <w:pStyle w:val="BodyText"/>
-      </w:pPr>
-      <w:r>
-        <w:t xml:space="preserve">In our BDNN analyses, time is always ranked as the least important predictor, suggesting our environmental and trait variable effectively capture signals of rate variation.</w:t>
-      </w:r>
-    </w:p>
-    <w:bookmarkEnd w:id="36"/>
-    <w:bookmarkStart w:id="37" w:name="side-notes"/>
-    <w:p>
-      <w:pPr>
-        <w:pStyle w:val="Heading2"/>
-      </w:pPr>
-      <w:r>
-        <w:t xml:space="preserve">Side notes</w:t>
-      </w:r>
-    </w:p>
-    <w:p>
-      <w:pPr>
-        <w:pStyle w:val="FirstParagraph"/>
-      </w:pPr>
-      <w:r>
-        <w:t xml:space="preserve">Our deep learning-based analysis of diversification provided evidence for significant origination and extinction rates variation as compared to a constant-rate birth-death model with the same amount of lineages and root ages as our empirical data (coefficients of rate variation table).</w:t>
-      </w:r>
-    </w:p>
-    <w:p>
-      <w:pPr>
-        <w:pStyle w:val="BodyText"/>
-      </w:pPr>
-      <w:r>
-        <w:t xml:space="preserve">Heterogeneity in lineage-specific diversification rates (example of lineages/groups of taxa).</w:t>
-      </w:r>
-    </w:p>
-    <w:p>
-      <w:pPr>
-        <w:pStyle w:val="BodyText"/>
-      </w:pPr>
-      <w:r>
-        <w:t xml:space="preserve">Also, tropical lineages appear to have overall lower origination and extinction rates, suggesting enhanced biotic turnover outside the tropics.</w:t>
-      </w:r>
-    </w:p>
-    <w:p>
-      <w:pPr>
-        <w:pStyle w:val="BodyText"/>
-      </w:pPr>
-      <w:r>
-        <w:t xml:space="preserve">Diversity-dependent effects were found to be the most important factor influencing origination rate variations, with decreasing rate values with increasing diversity. Andean uplift and palaeotemperature were respectively ranked at the second and third positions on the predictor importance scale.</w:t>
-      </w:r>
-    </w:p>
-    <w:p>
-      <w:pPr>
-        <w:pStyle w:val="BodyText"/>
-      </w:pPr>
-      <w:r>
-        <w:t xml:space="preserve">Palaeotemperature was retrieved as most significantly influencing extinction rate variations, via a negative relationship – extinction rate decreases when palaeotemperature increases. Sea level and Andean uplift respectively arrived second and third. At a given palaeotemperature, extinction rate was higher when sea level was higher.</w:t>
-      </w:r>
-    </w:p>
-    <w:p>
-      <w:pPr>
-        <w:pStyle w:val="BodyText"/>
-      </w:pPr>
-      <w:r>
-        <w:t xml:space="preserve">Results robust to different network architectures.</w:t>
-      </w:r>
-    </w:p>
-    <w:bookmarkEnd w:id="37"/>
-    <w:bookmarkEnd w:id="38"/>
-    <w:bookmarkStart w:id="47" w:name="discussion"/>
-    <w:p>
-      <w:pPr>
-        <w:pStyle w:val="Heading1"/>
-      </w:pPr>
-      <w:r>
-        <w:t xml:space="preserve">Discussion</w:t>
-      </w:r>
-    </w:p>
-    <w:p>
-      <w:pPr>
-        <w:pStyle w:val="FirstParagraph"/>
-      </w:pPr>
-      <w:r>
-        <w:t xml:space="preserve">ucetich2015 proposed gigantism among caviomorphs to have been promoted by the late Neogene climate cooling and aridification</w:t>
-      </w:r>
-      <w:r>
-        <w:t xml:space="preserve"> </w:t>
-      </w:r>
-      <w:r>
-        <w:t xml:space="preserve">(Westerhold et al. 2020)</w:t>
-      </w:r>
-      <w:r>
-        <w:t xml:space="preserve">, thought to have expanded open habitats in continental South America</w:t>
-      </w:r>
-      <w:r>
-        <w:t xml:space="preserve"> </w:t>
-      </w:r>
-      <w:r>
-        <w:t xml:space="preserve">(Palazzesi and Barreda 2012)</w:t>
-      </w:r>
-      <w:r>
-        <w:t xml:space="preserve">. Such climate-induced landscape opening has also traditionally been invoked to explain caviomorphs’ – together with native ungulates’ – increase in hypsodonty</w:t>
-      </w:r>
-      <w:r>
-        <w:t xml:space="preserve"> </w:t>
-      </w:r>
-      <w:r>
-        <w:t xml:space="preserve">(MacFadden 2000)</w:t>
-      </w:r>
-      <w:r>
-        <w:t xml:space="preserve">. Nevertheless, it should be mentioned that several evidence challenged the relationship between grass consumption and hypsodonty</w:t>
-      </w:r>
-      <w:r>
-        <w:t xml:space="preserve"> </w:t>
-      </w:r>
-      <w:r>
-        <w:t xml:space="preserve">(</w:t>
-      </w:r>
-      <w:r>
-        <w:rPr>
-          <w:i/>
-          <w:iCs/>
-        </w:rPr>
-        <w:t xml:space="preserve">e</w:t>
-      </w:r>
-      <w:r>
-        <w:t xml:space="preserve">.</w:t>
-      </w:r>
-      <w:r>
-        <w:rPr>
-          <w:i/>
-          <w:iCs/>
-        </w:rPr>
-        <w:t xml:space="preserve">g</w:t>
-      </w:r>
-      <w:r>
-        <w:t xml:space="preserve">., Billet et al. 2009; Damuth and Janis 2011; Strömberg et al. 2013; Armella and Croft 2026)</w:t>
-      </w:r>
-      <w:r>
-        <w:t xml:space="preserve">. Other authors proposed that the river network remodelling that followed the demise of the north Argentinian Miocene marine transgression</w:t>
-      </w:r>
-      <w:r>
-        <w:t xml:space="preserve"> </w:t>
-      </w:r>
-      <w:r>
-        <w:t xml:space="preserve">(</w:t>
-      </w:r>
-      <w:r>
-        <w:t xml:space="preserve">‘</w:t>
-      </w:r>
-      <w:r>
-        <w:t xml:space="preserve">Paranense Sea,</w:t>
-      </w:r>
-      <w:r>
-        <w:t xml:space="preserve">’</w:t>
-      </w:r>
-      <w:r>
-        <w:t xml:space="preserve"> </w:t>
-      </w:r>
-      <w:r>
-        <w:rPr>
-          <w:i/>
-          <w:iCs/>
-        </w:rPr>
-        <w:t xml:space="preserve">see</w:t>
-      </w:r>
-      <w:r>
-        <w:t xml:space="preserve"> </w:t>
-      </w:r>
-      <w:r>
-        <w:t xml:space="preserve">Pascual et al. 1996)</w:t>
-      </w:r>
-      <w:r>
-        <w:t xml:space="preserve">, locally generating environmental heterogeneity, favoured the ecological diversification of dinomyid rodents</w:t>
-      </w:r>
-      <w:r>
-        <w:t xml:space="preserve"> </w:t>
-      </w:r>
-      <w:r>
-        <w:t xml:space="preserve">(Nasif et al. 2013; Candela et al. 2013)</w:t>
-      </w:r>
-      <w:r>
-        <w:t xml:space="preserve">. In the same time frame, a marine incursion analogous to the</w:t>
-      </w:r>
-      <w:r>
-        <w:t xml:space="preserve"> </w:t>
-      </w:r>
-      <w:r>
-        <w:t xml:space="preserve">‘</w:t>
-      </w:r>
-      <w:r>
-        <w:t xml:space="preserve">Paranense Sea</w:t>
-      </w:r>
-      <w:r>
-        <w:t xml:space="preserve">’</w:t>
-      </w:r>
-      <w:r>
-        <w:t xml:space="preserve">, the</w:t>
-      </w:r>
-      <w:r>
-        <w:t xml:space="preserve"> </w:t>
-      </w:r>
-      <w:r>
-        <w:t xml:space="preserve">‘</w:t>
-      </w:r>
-      <w:r>
-        <w:t xml:space="preserve">Pebas megawetland system</w:t>
-      </w:r>
-      <w:r>
-        <w:t xml:space="preserve">’</w:t>
-      </w:r>
-      <w:r>
-        <w:t xml:space="preserve"> </w:t>
-      </w:r>
-      <w:r>
-        <w:t xml:space="preserve">(PMWS), covered Western Amazonia. Its Late Miocene vanishing triggered massive hydrographic changes, among which the establishment of the Amazon drainage system, in turn massively impacting low-latitude ecosystems in South America</w:t>
-      </w:r>
-      <w:r>
-        <w:t xml:space="preserve"> </w:t>
-      </w:r>
-      <w:r>
-        <w:t xml:space="preserve">(</w:t>
-      </w:r>
-      <w:r>
-        <w:rPr>
-          <w:i/>
-          <w:iCs/>
-        </w:rPr>
-        <w:t xml:space="preserve">e</w:t>
-      </w:r>
-      <w:r>
-        <w:t xml:space="preserve">.</w:t>
-      </w:r>
-      <w:r>
-        <w:rPr>
-          <w:i/>
-          <w:iCs/>
-        </w:rPr>
-        <w:t xml:space="preserve">g</w:t>
-      </w:r>
-      <w:r>
-        <w:t xml:space="preserve">., Jaramillo et al. 2017; Hoorn et al. 2022)</w:t>
-      </w:r>
-      <w:r>
-        <w:t xml:space="preserve">. Thus, one can expect the legacy of the PMWS to have also impacted the radiation of Chinchilloidea, the latter peaking as these hydrographic changes occurred. These two marine transgressions were shown to be tectonically- and eustatically-controlled</w:t>
-      </w:r>
-      <w:r>
-        <w:t xml:space="preserve"> </w:t>
-      </w:r>
-      <w:r>
-        <w:t xml:space="preserve">(Hernández et al. 2005)</w:t>
-      </w:r>
-      <w:r>
-        <w:t xml:space="preserve">. Thus, one can also expect to retrieve a signal of the Andean uplift, as well as from sea-level changes, in the dynamics of chinchilloid diversification. In addition, on the basis of results established on modern species showing similar phenotypic pathways, patterns of size increase among caviomorphs were also proposed to be related to biotic factors, such as intra- or interspecific competition, predator avoidance or physiological constraints (</w:t>
-      </w:r>
-      <w:r>
-        <w:rPr>
-          <w:i/>
-          <w:iCs/>
-        </w:rPr>
-        <w:t xml:space="preserve">e</w:t>
-      </w:r>
-      <w:r>
-        <w:t xml:space="preserve">.</w:t>
-      </w:r>
-      <w:r>
-        <w:rPr>
-          <w:i/>
-          <w:iCs/>
-        </w:rPr>
-        <w:t xml:space="preserve">g</w:t>
-      </w:r>
-      <w:r>
-        <w:t xml:space="preserve">., metabolic rate)</w:t>
-      </w:r>
-      <w:r>
-        <w:t xml:space="preserve"> </w:t>
-      </w:r>
-      <w:r>
-        <w:t xml:space="preserve">(Vucetich et al. 2015)</w:t>
-      </w:r>
-      <w:r>
-        <w:t xml:space="preserve">.</w:t>
-      </w:r>
-      <w:r>
-        <w:t xml:space="preserve"> </w:t>
-      </w:r>
-      <w:r>
-        <w:t xml:space="preserve">Álvarez et al. (2017)</w:t>
-      </w:r>
-      <w:r>
-        <w:t xml:space="preserve"> </w:t>
-      </w:r>
-      <w:r>
-        <w:t xml:space="preserve">added that the environmentally-driven emergence of new niches and their further colonisation by caviomorphs must have promoted size increase in this rodent clade. Regarding the West Indian</w:t>
-      </w:r>
-      <w:r>
-        <w:t xml:space="preserve"> </w:t>
-      </w:r>
-      <w:r>
-        <w:t xml:space="preserve">‘</w:t>
-      </w:r>
-      <w:r>
-        <w:t xml:space="preserve">giant hutias</w:t>
-      </w:r>
-      <w:r>
-        <w:t xml:space="preserve">’</w:t>
-      </w:r>
-      <w:r>
-        <w:t xml:space="preserve">, instead of environmental drivers, the</w:t>
-      </w:r>
-      <w:r>
-        <w:t xml:space="preserve"> </w:t>
-      </w:r>
-      <w:r>
-        <w:t xml:space="preserve">‘</w:t>
-      </w:r>
-      <w:r>
-        <w:t xml:space="preserve">island rule</w:t>
-      </w:r>
-      <w:r>
-        <w:t xml:space="preserve">’</w:t>
-      </w:r>
-      <w:r>
-        <w:t xml:space="preserve"> </w:t>
-      </w:r>
-      <w:r>
-        <w:t xml:space="preserve">(Van Valen 1973b; Damuth 1993; Lomolino 2005; Faurby and Svenning 2016;</w:t>
-      </w:r>
-      <w:r>
-        <w:t xml:space="preserve"> </w:t>
-      </w:r>
-      <w:r>
-        <w:rPr>
-          <w:i/>
-          <w:iCs/>
-        </w:rPr>
-        <w:t xml:space="preserve">but see</w:t>
-      </w:r>
-      <w:r>
-        <w:t xml:space="preserve"> </w:t>
-      </w:r>
-      <w:r>
-        <w:t xml:space="preserve">Meiri et al. 2007)</w:t>
-      </w:r>
-      <w:r>
-        <w:t xml:space="preserve"> </w:t>
-      </w:r>
-      <w:r>
-        <w:t xml:space="preserve">has been proposed to explain their spectacular increase in size – particularly in the case of</w:t>
+        <w:t xml:space="preserve">species. Then, from the early Middle to the latest Miocene, a gradual increase in body size is to be reported, mostly within the two families</w:t>
       </w:r>
       <w:r>
         <w:t xml:space="preserve"> </w:t>
@@ -4743,86 +4278,20 @@
         </m:r>
       </m:oMath>
       <w:r>
-        <w:rPr>
-          <w:i/>
-          <w:iCs/>
-        </w:rPr>
-        <w:t xml:space="preserve">Amblyrhiza</w:t>
-      </w:r>
-      <w:r>
-        <w:t xml:space="preserve"> </w:t>
-      </w:r>
-      <w:r>
-        <w:t xml:space="preserve">(</w:t>
-      </w:r>
-      <w:r>
-        <w:rPr>
-          <w:i/>
-          <w:iCs/>
-        </w:rPr>
-        <w:t xml:space="preserve">e</w:t>
-      </w:r>
-      <w:r>
-        <w:t xml:space="preserve">.</w:t>
-      </w:r>
-      <w:r>
-        <w:rPr>
-          <w:i/>
-          <w:iCs/>
-        </w:rPr>
-        <w:t xml:space="preserve">g</w:t>
-      </w:r>
-      <w:r>
-        <w:t xml:space="preserve">., Biknevicius et al. 1993; McFarlane et al. 1998)</w:t>
-      </w:r>
-      <w:r>
-        <w:t xml:space="preserve">.</w:t>
-      </w:r>
-    </w:p>
-    <w:p>
-      <w:pPr>
-        <w:pStyle w:val="BodyText"/>
-      </w:pPr>
-      <w:r>
-        <w:t xml:space="preserve">Besides, questions are also raised by chinchilloid taxonomic and morphological diversity decline. Indeed, the group was diverse in the Late Miocene (Chasicoan–Huayquerian South American Land Mammal Ages [SALMAs]), with at least 20 co-occurring species on the continent</w:t>
-      </w:r>
-      <w:r>
-        <w:t xml:space="preserve"> </w:t>
-      </w:r>
-      <w:r>
-        <w:t xml:space="preserve">(Candela 2005)</w:t>
-      </w:r>
-      <w:r>
-        <w:t xml:space="preserve">, including most of its largest representatives</w:t>
-      </w:r>
-      <w:r>
-        <w:t xml:space="preserve"> </w:t>
-      </w:r>
-      <w:r>
-        <w:t xml:space="preserve">(</w:t>
-      </w:r>
-      <w:r>
-        <w:rPr>
-          <w:i/>
-          <w:iCs/>
-        </w:rPr>
-        <w:t xml:space="preserve">e</w:t>
-      </w:r>
-      <w:r>
-        <w:t xml:space="preserve">.</w:t>
-      </w:r>
-      <w:r>
-        <w:rPr>
-          <w:i/>
-          <w:iCs/>
-        </w:rPr>
-        <w:t xml:space="preserve">g</w:t>
-      </w:r>
-      <w:r>
-        <w:t xml:space="preserve">., Carrillo and Sánchez-Villagra 2015; Rasia and Candela 2018; Rasia et al. 2024)</w:t>
-      </w:r>
-      <w:r>
-        <w:t xml:space="preserve">. Then, the group experienced a massive decline, wiping out the entire</w:t>
+        <w:t xml:space="preserve">Neoepiblemidae and Dinomyidae. Then, in continental South America, most of the giant taxa that were flourishing in the Miocene disappeared at</w:t>
+      </w:r>
+      <w:r>
+        <w:t xml:space="preserve"> </w:t>
+      </w:r>
+      <w:r>
+        <w:rPr>
+          <w:i/>
+          <w:iCs/>
+        </w:rPr>
+        <w:t xml:space="preserve">ca</w:t>
+      </w:r>
+      <w:r>
+        <w:t xml:space="preserve">. 6.5 Ma, and only persisted the lineages that gave birth to the extant moderate-sized representatives of the group. In the West Indies, Quaternary deposits yielded remains of large-sized taxa (grouped into the likely paraphyletic family</w:t>
       </w:r>
       <w:r>
         <w:t xml:space="preserve"> </w:t>
@@ -4836,6 +4305,679 @@
         </m:r>
       </m:oMath>
       <w:r>
+        <w:rPr>
+          <w:i/>
+          <w:iCs/>
+        </w:rPr>
+        <w:t xml:space="preserve">?Heptaxodontidae</w:t>
+      </w:r>
+      <w:r>
+        <w:t xml:space="preserve">), that went extinct very recently, thus well after the decline starting</w:t>
+      </w:r>
+      <w:r>
+        <w:t xml:space="preserve"> </w:t>
+      </w:r>
+      <w:r>
+        <w:rPr>
+          <w:i/>
+          <w:iCs/>
+        </w:rPr>
+        <w:t xml:space="preserve">ca</w:t>
+      </w:r>
+      <w:r>
+        <w:t xml:space="preserve">. 6.5 Ma.</w:t>
+      </w:r>
+    </w:p>
+    <w:p>
+      <w:pPr>
+        <w:pStyle w:val="BodyText"/>
+      </w:pPr>
+      <w:r>
+        <w:t xml:space="preserve">Thus, we highlight the synchronous character of body size evolution and diversity dynamics throughout the evolutionary history of Chinchilloidea.</w:t>
+      </w:r>
+    </w:p>
+    <w:bookmarkEnd w:id="35"/>
+    <w:bookmarkStart w:id="36" w:name="Xec638aa7a0e33144ab295a8898aab3f898bef7d"/>
+    <w:p>
+      <w:pPr>
+        <w:pStyle w:val="Heading2"/>
+      </w:pPr>
+      <w:r>
+        <w:t xml:space="preserve">Heterogeneous extinction selectivity across body size classes and between tropical and non-tropical taxa, likely enhanced by the Andean uplift, shaped the decline of Chinchilloidea</w:t>
+      </w:r>
+    </w:p>
+    <w:p>
+      <w:pPr>
+        <w:pStyle w:val="FirstParagraph"/>
+      </w:pPr>
+      <w:r>
+        <w:t xml:space="preserve">Our findings revealed that the aforementioned changes in diversity were due to changes in extinction, not speciation rate during the history of the clade. Indeed, the joint estimation of the diversification process (together with species origination and extinction times, altogether forming the sampled diversity) made with PyRate using the rjMCMC algorithm did not evidence any significant speciation rate shift during the evolutionary history of the clade (</w:t>
+      </w:r>
+      <w:hyperlink w:anchor="fig-diversification">
+        <w:r>
+          <w:rPr>
+            <w:rStyle w:val="Hyperlink"/>
+          </w:rPr>
+          <w:t xml:space="preserve">Figure 4</w:t>
+        </w:r>
+      </w:hyperlink>
+      <w:r>
+        <w:t xml:space="preserve"> </w:t>
+      </w:r>
+      <w:r>
+        <w:t xml:space="preserve">A, Figure S6 A). Rather, according to this model, speciation rate remained constant, nearing 0.6 events/lineage/Myr over the entire study period (</w:t>
+      </w:r>
+      <w:hyperlink w:anchor="fig-diversification">
+        <w:r>
+          <w:rPr>
+            <w:rStyle w:val="Hyperlink"/>
+          </w:rPr>
+          <w:t xml:space="preserve">Figure 4</w:t>
+        </w:r>
+      </w:hyperlink>
+      <w:r>
+        <w:t xml:space="preserve"> </w:t>
+      </w:r>
+      <w:r>
+        <w:t xml:space="preserve">A). This result aligns with the output of the MBD model, where speciation rate estimated with exponential correlations with environmental variables also remained equal to 0.6 across the evolutionary history of the group (</w:t>
+      </w:r>
+      <w:hyperlink w:anchor="fig-diversification">
+        <w:r>
+          <w:rPr>
+            <w:rStyle w:val="Hyperlink"/>
+          </w:rPr>
+          <w:t xml:space="preserve">Figure 4</w:t>
+        </w:r>
+      </w:hyperlink>
+      <w:r>
+        <w:t xml:space="preserve"> </w:t>
+      </w:r>
+      <w:r>
+        <w:t xml:space="preserve">E), and was not found significantly associated with any of the variables (</w:t>
+      </w:r>
+      <w:r>
+        <w:rPr>
+          <w:b/>
+          <w:bCs/>
+        </w:rPr>
+        <w:t xml:space="preserve">Figure Drivers</w:t>
+      </w:r>
+      <w:r>
+        <w:t xml:space="preserve">). Conversely, the analyses conducted with the BDNN yielded a slightly different conclusion, as it provided evidence for significant speciation rate variation across lineages (Table S4).</w:t>
+      </w:r>
+    </w:p>
+    <w:p>
+      <w:pPr>
+        <w:pStyle w:val="BodyText"/>
+      </w:pPr>
+      <w:r>
+        <w:t xml:space="preserve">Positive net diversification rate until</w:t>
+      </w:r>
+      <w:r>
+        <w:t xml:space="preserve"> </w:t>
+      </w:r>
+      <w:r>
+        <w:rPr>
+          <w:i/>
+          <w:iCs/>
+        </w:rPr>
+        <w:t xml:space="preserve">ca</w:t>
+      </w:r>
+      <w:r>
+        <w:t xml:space="preserve">. 6 Ma, decline and increase in extinction rate (cite figures accordingly).</w:t>
+      </w:r>
+    </w:p>
+    <w:p>
+      <w:pPr>
+        <w:pStyle w:val="BodyText"/>
+      </w:pPr>
+      <w:r>
+        <w:t xml:space="preserve">All DD architectures performed similarly, as long as they comprised at least one dense layer connecting the output of the LSTM layers to the output layer (</w:t>
+      </w:r>
+      <w:r>
+        <w:rPr>
+          <w:b/>
+          <w:bCs/>
+        </w:rPr>
+        <w:t xml:space="preserve">Supp. Tab. 8</w:t>
+      </w:r>
+      <w:r>
+        <w:t xml:space="preserve">).</w:t>
+      </w:r>
+    </w:p>
+    <w:p>
+      <w:pPr>
+        <w:pStyle w:val="BodyText"/>
+      </w:pPr>
+      <w:r>
+        <w:t xml:space="preserve">The coefficients of rate variations obtained for BDNN (resp. XX and XX) exceeded the thresholds inferred from analyses of 100 simulated datasets generated under a constant-rate birth-death model, matching our empirical data in terms of trait number, age of the clade and (approximately) number of species (resp. XX and XX). This therefore provides evidence for significant rate variations throughout the evolutionary history of Chinchilloidea.</w:t>
+      </w:r>
+    </w:p>
+    <w:p>
+      <w:pPr>
+        <w:pStyle w:val="BodyText"/>
+      </w:pPr>
+      <w:r>
+        <w:t xml:space="preserve">Speciation rate significantly differs across body size classes, with larger taxa achieving higher values (Fig. X and S5). According to the BDNN model, body size stands out as the first predictor explaining variations in speciation rate within Chinchilloidea, with a</w:t>
+      </w:r>
+      <w:r>
+        <w:t xml:space="preserve"> </w:t>
+      </w:r>
+      <w:r>
+        <w:rPr>
+          <w:i/>
+          <w:iCs/>
+        </w:rPr>
+        <w:t xml:space="preserve">ca</w:t>
+      </w:r>
+      <w:r>
+        <w:t xml:space="preserve">. 2.5-fold change obtained between our two extrema (</w:t>
+      </w:r>
+      <w:r>
+        <w:rPr>
+          <w:i/>
+          <w:iCs/>
+        </w:rPr>
+        <w:t xml:space="preserve">i</w:t>
+      </w:r>
+      <w:r>
+        <w:t xml:space="preserve">.</w:t>
+      </w:r>
+      <w:r>
+        <w:rPr>
+          <w:i/>
+          <w:iCs/>
+        </w:rPr>
+        <w:t xml:space="preserve">e</w:t>
+      </w:r>
+      <w:r>
+        <w:t xml:space="preserve">., XS and XXL =&gt;</w:t>
+      </w:r>
+      <w:r>
+        <w:t xml:space="preserve"> </w:t>
+      </w:r>
+      <w:r>
+        <w:rPr>
+          <w:b/>
+          <w:bCs/>
+        </w:rPr>
+        <w:t xml:space="preserve">indicate on the violin plot</w:t>
+      </w:r>
+      <w:r>
+        <w:t xml:space="preserve">).</w:t>
+      </w:r>
+    </w:p>
+    <w:p>
+      <w:pPr>
+        <w:pStyle w:val="BodyText"/>
+      </w:pPr>
+      <w:r>
+        <w:t xml:space="preserve">In our BDNN analyses, time is always ranked as the least important predictor, suggesting our environmental and trait variable effectively capture signals of rate variation.</w:t>
+      </w:r>
+    </w:p>
+    <w:p>
+      <w:pPr>
+        <w:pStyle w:val="BodyText"/>
+      </w:pPr>
+      <w:r>
+        <w:t xml:space="preserve">Higher extinction rates outside the tropics</w:t>
+      </w:r>
+    </w:p>
+    <w:p>
+      <w:pPr>
+        <w:pStyle w:val="BodyText"/>
+      </w:pPr>
+      <w:r>
+        <w:t xml:space="preserve">ADE</w:t>
+      </w:r>
+    </w:p>
+    <w:bookmarkEnd w:id="36"/>
+    <w:bookmarkStart w:id="37" w:name="side-notes"/>
+    <w:p>
+      <w:pPr>
+        <w:pStyle w:val="Heading2"/>
+      </w:pPr>
+      <w:r>
+        <w:t xml:space="preserve">Side notes</w:t>
+      </w:r>
+    </w:p>
+    <w:p>
+      <w:pPr>
+        <w:pStyle w:val="FirstParagraph"/>
+      </w:pPr>
+      <w:r>
+        <w:t xml:space="preserve">Our deep learning-based analysis of diversification provided evidence for significant origination and extinction rates variation as compared to a constant-rate birth-death model with the same amount of lineages and root ages as our empirical data (coefficients of rate variation table).</w:t>
+      </w:r>
+    </w:p>
+    <w:p>
+      <w:pPr>
+        <w:pStyle w:val="BodyText"/>
+      </w:pPr>
+      <w:r>
+        <w:t xml:space="preserve">Heterogeneity in lineage-specific diversification rates (example of lineages/groups of taxa).</w:t>
+      </w:r>
+    </w:p>
+    <w:p>
+      <w:pPr>
+        <w:pStyle w:val="BodyText"/>
+      </w:pPr>
+      <w:r>
+        <w:t xml:space="preserve">Also, tropical lineages appear to have overall lower origination and extinction rates, suggesting enhanced biotic turnover outside the tropics.</w:t>
+      </w:r>
+    </w:p>
+    <w:p>
+      <w:pPr>
+        <w:pStyle w:val="BodyText"/>
+      </w:pPr>
+      <w:r>
+        <w:t xml:space="preserve">Diversity-dependent effects were found to be the most important factor influencing origination rate variations, with decreasing rate values with increasing diversity. Andean uplift and palaeotemperature were respectively ranked at the second and third positions on the predictor importance scale.</w:t>
+      </w:r>
+    </w:p>
+    <w:p>
+      <w:pPr>
+        <w:pStyle w:val="BodyText"/>
+      </w:pPr>
+      <w:r>
+        <w:t xml:space="preserve">Palaeotemperature was retrieved as most significantly influencing extinction rate variations, via a negative relationship – extinction rate decreases when palaeotemperature increases. Sea level and Andean uplift respectively arrived second and third. At a given palaeotemperature, extinction rate was higher when sea level was higher.</w:t>
+      </w:r>
+    </w:p>
+    <w:p>
+      <w:pPr>
+        <w:pStyle w:val="BodyText"/>
+      </w:pPr>
+      <w:r>
+        <w:t xml:space="preserve">Results robust to different network architectures.</w:t>
+      </w:r>
+    </w:p>
+    <w:bookmarkEnd w:id="37"/>
+    <w:bookmarkEnd w:id="38"/>
+    <w:bookmarkStart w:id="47" w:name="discussion"/>
+    <w:p>
+      <w:pPr>
+        <w:pStyle w:val="Heading1"/>
+      </w:pPr>
+      <w:r>
+        <w:t xml:space="preserve">Discussion</w:t>
+      </w:r>
+    </w:p>
+    <w:p>
+      <w:pPr>
+        <w:pStyle w:val="FirstParagraph"/>
+      </w:pPr>
+      <w:r>
+        <w:t xml:space="preserve">ucetich2015 proposed gigantism among caviomorphs to have been promoted by the late Neogene climate cooling and aridification</w:t>
+      </w:r>
+      <w:r>
+        <w:t xml:space="preserve"> </w:t>
+      </w:r>
+      <w:r>
+        <w:t xml:space="preserve">(Westerhold et al. 2020)</w:t>
+      </w:r>
+      <w:r>
+        <w:t xml:space="preserve">, thought to have expanded open habitats in continental South America</w:t>
+      </w:r>
+      <w:r>
+        <w:t xml:space="preserve"> </w:t>
+      </w:r>
+      <w:r>
+        <w:t xml:space="preserve">(Palazzesi and Barreda 2012)</w:t>
+      </w:r>
+      <w:r>
+        <w:t xml:space="preserve">. Such climate-induced landscape opening has also traditionally been invoked to explain caviomorphs’ – together with native ungulates’ – increase in hypsodonty</w:t>
+      </w:r>
+      <w:r>
+        <w:t xml:space="preserve"> </w:t>
+      </w:r>
+      <w:r>
+        <w:t xml:space="preserve">(MacFadden 2000)</w:t>
+      </w:r>
+      <w:r>
+        <w:t xml:space="preserve">. Nevertheless, it should be mentioned that several evidence challenged the relationship between grass consumption and hypsodonty</w:t>
+      </w:r>
+      <w:r>
+        <w:t xml:space="preserve"> </w:t>
+      </w:r>
+      <w:r>
+        <w:t xml:space="preserve">(</w:t>
+      </w:r>
+      <w:r>
+        <w:rPr>
+          <w:i/>
+          <w:iCs/>
+        </w:rPr>
+        <w:t xml:space="preserve">e</w:t>
+      </w:r>
+      <w:r>
+        <w:t xml:space="preserve">.</w:t>
+      </w:r>
+      <w:r>
+        <w:rPr>
+          <w:i/>
+          <w:iCs/>
+        </w:rPr>
+        <w:t xml:space="preserve">g</w:t>
+      </w:r>
+      <w:r>
+        <w:t xml:space="preserve">., Billet et al. 2009; Damuth and Janis 2011; Strömberg et al. 2013; Armella and Croft 2026)</w:t>
+      </w:r>
+      <w:r>
+        <w:t xml:space="preserve">. Other authors proposed that the river network remodelling that followed the demise of the north Argentinian Miocene marine transgression</w:t>
+      </w:r>
+      <w:r>
+        <w:t xml:space="preserve"> </w:t>
+      </w:r>
+      <w:r>
+        <w:t xml:space="preserve">(</w:t>
+      </w:r>
+      <w:r>
+        <w:t xml:space="preserve">‘</w:t>
+      </w:r>
+      <w:r>
+        <w:t xml:space="preserve">Paranense Sea,</w:t>
+      </w:r>
+      <w:r>
+        <w:t xml:space="preserve">’</w:t>
+      </w:r>
+      <w:r>
+        <w:t xml:space="preserve"> </w:t>
+      </w:r>
+      <w:r>
+        <w:rPr>
+          <w:i/>
+          <w:iCs/>
+        </w:rPr>
+        <w:t xml:space="preserve">see</w:t>
+      </w:r>
+      <w:r>
+        <w:t xml:space="preserve"> </w:t>
+      </w:r>
+      <w:r>
+        <w:t xml:space="preserve">Pascual et al. 1996)</w:t>
+      </w:r>
+      <w:r>
+        <w:t xml:space="preserve">, locally generating environmental heterogeneity, favoured the ecological diversification of dinomyid rodents</w:t>
+      </w:r>
+      <w:r>
+        <w:t xml:space="preserve"> </w:t>
+      </w:r>
+      <w:r>
+        <w:t xml:space="preserve">(Nasif et al. 2013; Candela et al. 2013)</w:t>
+      </w:r>
+      <w:r>
+        <w:t xml:space="preserve">. In the same time frame, a marine incursion analogous to the</w:t>
+      </w:r>
+      <w:r>
+        <w:t xml:space="preserve"> </w:t>
+      </w:r>
+      <w:r>
+        <w:t xml:space="preserve">‘</w:t>
+      </w:r>
+      <w:r>
+        <w:t xml:space="preserve">Paranense Sea</w:t>
+      </w:r>
+      <w:r>
+        <w:t xml:space="preserve">’</w:t>
+      </w:r>
+      <w:r>
+        <w:t xml:space="preserve">, the</w:t>
+      </w:r>
+      <w:r>
+        <w:t xml:space="preserve"> </w:t>
+      </w:r>
+      <w:r>
+        <w:t xml:space="preserve">‘</w:t>
+      </w:r>
+      <w:r>
+        <w:t xml:space="preserve">Pebas megawetland system</w:t>
+      </w:r>
+      <w:r>
+        <w:t xml:space="preserve">’</w:t>
+      </w:r>
+      <w:r>
+        <w:t xml:space="preserve"> </w:t>
+      </w:r>
+      <w:r>
+        <w:t xml:space="preserve">(PMWS), covered Western Amazonia. Its Late Miocene vanishing triggered massive hydrographic changes, among which the establishment of the Amazon drainage system, in turn massively impacting low-latitude ecosystems in South America</w:t>
+      </w:r>
+      <w:r>
+        <w:t xml:space="preserve"> </w:t>
+      </w:r>
+      <w:r>
+        <w:t xml:space="preserve">(</w:t>
+      </w:r>
+      <w:r>
+        <w:rPr>
+          <w:i/>
+          <w:iCs/>
+        </w:rPr>
+        <w:t xml:space="preserve">e</w:t>
+      </w:r>
+      <w:r>
+        <w:t xml:space="preserve">.</w:t>
+      </w:r>
+      <w:r>
+        <w:rPr>
+          <w:i/>
+          <w:iCs/>
+        </w:rPr>
+        <w:t xml:space="preserve">g</w:t>
+      </w:r>
+      <w:r>
+        <w:t xml:space="preserve">., Jaramillo et al. 2017; Hoorn et al. 2022)</w:t>
+      </w:r>
+      <w:r>
+        <w:t xml:space="preserve">. Thus, one can expect the legacy of the PMWS to have also impacted the radiation of Chinchilloidea, the latter peaking as these hydrographic changes occurred. These two marine transgressions were shown to be tectonically- and eustatically-controlled</w:t>
+      </w:r>
+      <w:r>
+        <w:t xml:space="preserve"> </w:t>
+      </w:r>
+      <w:r>
+        <w:t xml:space="preserve">(Hernández et al. 2005)</w:t>
+      </w:r>
+      <w:r>
+        <w:t xml:space="preserve">. Thus, one can also expect to retrieve a signal of the Andean uplift, as well as from sea-level changes, in the dynamics of chinchilloid diversification. In addition, on the basis of results established on modern species showing similar phenotypic pathways, patterns of size increase among caviomorphs were also proposed to be related to biotic factors, such as intra- or interspecific competition, predator avoidance or physiological constraints (</w:t>
+      </w:r>
+      <w:r>
+        <w:rPr>
+          <w:i/>
+          <w:iCs/>
+        </w:rPr>
+        <w:t xml:space="preserve">e</w:t>
+      </w:r>
+      <w:r>
+        <w:t xml:space="preserve">.</w:t>
+      </w:r>
+      <w:r>
+        <w:rPr>
+          <w:i/>
+          <w:iCs/>
+        </w:rPr>
+        <w:t xml:space="preserve">g</w:t>
+      </w:r>
+      <w:r>
+        <w:t xml:space="preserve">., metabolic rate)</w:t>
+      </w:r>
+      <w:r>
+        <w:t xml:space="preserve"> </w:t>
+      </w:r>
+      <w:r>
+        <w:t xml:space="preserve">(Vucetich et al. 2015)</w:t>
+      </w:r>
+      <w:r>
+        <w:t xml:space="preserve">.</w:t>
+      </w:r>
+      <w:r>
+        <w:t xml:space="preserve"> </w:t>
+      </w:r>
+      <w:r>
+        <w:t xml:space="preserve">Álvarez et al. (2017)</w:t>
+      </w:r>
+      <w:r>
+        <w:t xml:space="preserve"> </w:t>
+      </w:r>
+      <w:r>
+        <w:t xml:space="preserve">added that the environmentally-driven emergence of new niches and their further colonisation by caviomorphs must have promoted size increase in this rodent clade. Regarding the West Indian</w:t>
+      </w:r>
+      <w:r>
+        <w:t xml:space="preserve"> </w:t>
+      </w:r>
+      <w:r>
+        <w:t xml:space="preserve">‘</w:t>
+      </w:r>
+      <w:r>
+        <w:t xml:space="preserve">giant hutias</w:t>
+      </w:r>
+      <w:r>
+        <w:t xml:space="preserve">’</w:t>
+      </w:r>
+      <w:r>
+        <w:t xml:space="preserve">, instead of environmental drivers, the</w:t>
+      </w:r>
+      <w:r>
+        <w:t xml:space="preserve"> </w:t>
+      </w:r>
+      <w:r>
+        <w:t xml:space="preserve">‘</w:t>
+      </w:r>
+      <w:r>
+        <w:t xml:space="preserve">island rule</w:t>
+      </w:r>
+      <w:r>
+        <w:t xml:space="preserve">’</w:t>
+      </w:r>
+      <w:r>
+        <w:t xml:space="preserve"> </w:t>
+      </w:r>
+      <w:r>
+        <w:t xml:space="preserve">(Van Valen 1973b; Damuth 1993; Lomolino 2005; Faurby and Svenning 2016;</w:t>
+      </w:r>
+      <w:r>
+        <w:t xml:space="preserve"> </w:t>
+      </w:r>
+      <w:r>
+        <w:rPr>
+          <w:i/>
+          <w:iCs/>
+        </w:rPr>
+        <w:t xml:space="preserve">but see</w:t>
+      </w:r>
+      <w:r>
+        <w:t xml:space="preserve"> </w:t>
+      </w:r>
+      <w:r>
+        <w:t xml:space="preserve">Meiri et al. 2007)</w:t>
+      </w:r>
+      <w:r>
+        <w:t xml:space="preserve"> </w:t>
+      </w:r>
+      <w:r>
+        <w:t xml:space="preserve">has been proposed to explain their spectacular increase in size – particularly in the case of</w:t>
+      </w:r>
+      <w:r>
+        <w:t xml:space="preserve"> </w:t>
+      </w:r>
+      <m:oMath>
+        <m:r>
+          <m:rPr>
+            <m:sty m:val="p"/>
+          </m:rPr>
+          <m:t>†</m:t>
+        </m:r>
+      </m:oMath>
+      <w:r>
+        <w:rPr>
+          <w:i/>
+          <w:iCs/>
+        </w:rPr>
+        <w:t xml:space="preserve">Amblyrhiza</w:t>
+      </w:r>
+      <w:r>
+        <w:t xml:space="preserve"> </w:t>
+      </w:r>
+      <w:r>
+        <w:t xml:space="preserve">(</w:t>
+      </w:r>
+      <w:r>
+        <w:rPr>
+          <w:i/>
+          <w:iCs/>
+        </w:rPr>
+        <w:t xml:space="preserve">e</w:t>
+      </w:r>
+      <w:r>
+        <w:t xml:space="preserve">.</w:t>
+      </w:r>
+      <w:r>
+        <w:rPr>
+          <w:i/>
+          <w:iCs/>
+        </w:rPr>
+        <w:t xml:space="preserve">g</w:t>
+      </w:r>
+      <w:r>
+        <w:t xml:space="preserve">., Biknevicius et al. 1993; McFarlane et al. 1998)</w:t>
+      </w:r>
+      <w:r>
+        <w:t xml:space="preserve">.</w:t>
+      </w:r>
+    </w:p>
+    <w:p>
+      <w:pPr>
+        <w:pStyle w:val="BodyText"/>
+      </w:pPr>
+      <w:r>
+        <w:t xml:space="preserve">Besides, questions are also raised by chinchilloid taxonomic and morphological diversity decline. Indeed, the group was diverse in the Late Miocene (Chasicoan–Huayquerian South American Land Mammal Ages [SALMAs]), with at least 20 co-occurring species on the continent</w:t>
+      </w:r>
+      <w:r>
+        <w:t xml:space="preserve"> </w:t>
+      </w:r>
+      <w:r>
+        <w:t xml:space="preserve">(Candela 2005)</w:t>
+      </w:r>
+      <w:r>
+        <w:t xml:space="preserve">, including most of its largest representatives</w:t>
+      </w:r>
+      <w:r>
+        <w:t xml:space="preserve"> </w:t>
+      </w:r>
+      <w:r>
+        <w:t xml:space="preserve">(</w:t>
+      </w:r>
+      <w:r>
+        <w:rPr>
+          <w:i/>
+          <w:iCs/>
+        </w:rPr>
+        <w:t xml:space="preserve">e</w:t>
+      </w:r>
+      <w:r>
+        <w:t xml:space="preserve">.</w:t>
+      </w:r>
+      <w:r>
+        <w:rPr>
+          <w:i/>
+          <w:iCs/>
+        </w:rPr>
+        <w:t xml:space="preserve">g</w:t>
+      </w:r>
+      <w:r>
+        <w:t xml:space="preserve">., Carrillo and Sánchez-Villagra 2015; Rasia and Candela 2018; Rasia et al. 2024)</w:t>
+      </w:r>
+      <w:r>
+        <w:t xml:space="preserve">. Then, the group experienced a massive decline, wiping out the entire</w:t>
+      </w:r>
+      <w:r>
+        <w:t xml:space="preserve"> </w:t>
+      </w:r>
+      <m:oMath>
+        <m:r>
+          <m:rPr>
+            <m:sty m:val="p"/>
+          </m:rPr>
+          <m:t>†</m:t>
+        </m:r>
+      </m:oMath>
+      <w:r>
         <w:t xml:space="preserve">Neoepiblemidae and virtually all representatives of the Dinomyidae. Notably, all large-to-giant forms were concomitantly erased. Nevertheless, despite the apparent size selectivity of the aforementioned decline, the latter does not apply to other traits like hypsodonty. Pliocene cooling and desertification was proposed as a driver underlying the demise of the clade in Southern South America</w:t>
       </w:r>
       <w:r>
@@ -5212,6 +5354,20 @@
           <w:bCs/>
         </w:rPr>
         <w:t xml:space="preserve">(Foote 2007; Hohmann and Jarochowska 2019)</w:t>
+      </w:r>
+    </w:p>
+    <w:p>
+      <w:pPr>
+        <w:pStyle w:val="BodyText"/>
+      </w:pPr>
+      <w:r>
+        <w:t xml:space="preserve">Could the phylogenetic scale affect our perception of coupling/decoupling between diversity and disparity? Intra super-family: coupled. Inter-superfamilies: decoupled</w:t>
+      </w:r>
+      <w:r>
+        <w:t xml:space="preserve"> </w:t>
+      </w:r>
+      <w:r>
+        <w:t xml:space="preserve">(Carrillo et al. 2026)</w:t>
       </w:r>
     </w:p>
     <w:p>
@@ -9783,7 +9939,34 @@
               <w:pStyle w:val="ImageCaption"/>
             </w:pPr>
             <w:r>
-              <w:t xml:space="preserve">Figure 3: Bayesian reconstruction of the longevities of the 129 chinchilloid species considered in our dataset. Each segment depicts the longevity of a given species, that is, the interval between species’ speciation and extinction times averaged across PyRate runs that achieved convergence. Segments and taxonomic names were coloured according to the body mass category to which species were assigned. The histogram at the centre of the plot shows the number of species within each body mass class. The 8 extant species names are highlighted in bold with a star at the end. The first four silhouettes (from top to bottom) are from Phylopic (credits available in Table S2). The last two silhouettes (</w:t>
+              <w:t xml:space="preserve">Figure 3: Bayesian reconstruction of the longevities of the 129 chinchilloid species considered in our dataset. Each segment depicts the longevity of a given species, that is, the interval between species’ speciation and extinction times averaged across PyRate runs that achieved convergence. Segments and taxonomic names were coloured according to the body mass category to which species were assigned. The histogram at the centre of the plot shows the number of species within each body mass class. The 8 extant species names are highlighted in bold with a star at the end. Except</w:t>
+            </w:r>
+            <w:r>
+              <w:t xml:space="preserve"> </w:t>
+            </w:r>
+            <w:r>
+              <w:rPr>
+                <w:i/>
+                <w:iCs/>
+              </w:rPr>
+              <w:t xml:space="preserve">Lagostomus maximus</w:t>
+            </w:r>
+            <w:r>
+              <w:t xml:space="preserve">, these taxa had almost no fossil record. Consequently, their age of origination was estimated with the method presented in</w:t>
+            </w:r>
+            <w:r>
+              <w:t xml:space="preserve"> </w:t>
+            </w:r>
+            <w:hyperlink w:anchor="fig-ExtSampl">
+              <w:r>
+                <w:rPr>
+                  <w:rStyle w:val="Hyperlink"/>
+                </w:rPr>
+                <w:t xml:space="preserve">Figure 1</w:t>
+              </w:r>
+            </w:hyperlink>
+            <w:r>
+              <w:t xml:space="preserve">. The first four silhouettes (from top to bottom) are from Phylopic (credits available in Table S3). The last two silhouettes (</w:t>
             </w:r>
             <w:r>
               <w:rPr>
@@ -9930,7 +10113,7 @@
               <w:t xml:space="preserve">(Silvestro et al. 2019)</w:t>
             </w:r>
             <w:r>
-              <w:t xml:space="preserve">. Stars indicate significant rate shifts. The middle column</w:t>
+              <w:t xml:space="preserve">. The star indicates a significant rate shifts. The middle column</w:t>
             </w:r>
             <w:r>
               <w:t xml:space="preserve"> </w:t>
@@ -9959,27 +10142,7 @@
               <w:t xml:space="preserve">Methods</w:t>
             </w:r>
             <w:r>
-              <w:t xml:space="preserve">), the rates presented here come from an arbitrarily chosen replicate (</w:t>
-            </w:r>
-            <w:r>
-              <w:rPr>
-                <w:i/>
-                <w:iCs/>
-              </w:rPr>
-              <w:t xml:space="preserve">i</w:t>
-            </w:r>
-            <w:r>
-              <w:t xml:space="preserve">.</w:t>
-            </w:r>
-            <w:r>
-              <w:rPr>
-                <w:i/>
-                <w:iCs/>
-              </w:rPr>
-              <w:t xml:space="preserve">e</w:t>
-            </w:r>
-            <w:r>
-              <w:t xml:space="preserve">., replicate 8), but marginal rates through time did not differ across replicates (Fig. SX). The right column</w:t>
+              <w:t xml:space="preserve">), the rates presented here come from a replicate chosen arbitrarily (replicate 8), but marginal rates through time did not differ across replicates (Fig. S10-11). The right column</w:t>
             </w:r>
             <w:r>
               <w:t xml:space="preserve"> </w:t>

</xml_diff>